<commit_message>
feat: enhance document service and templates with improved property valuation details and formatting
</commit_message>
<xml_diff>
--- a/backend/templates/proposal_template.docx
+++ b/backend/templates/proposal_template.docx
@@ -3162,7 +3162,20 @@
     </w:p>
     <w:p>
       <w:pPr>
-        <w:spacing w:before="80" w:after="0"/>
+        <w:spacing w:before="80" w:after="80"/>
+      </w:pPr>
+      <w:r>
+        <w:rPr>
+          <w:b/>
+          <w:i w:val="0"/>
+          <w:sz w:val="20"/>
+        </w:rPr>
+        <w:t>Followings are the some of the merits of the location</w:t>
+      </w:r>
+    </w:p>
+    <w:p>
+      <w:pPr>
+        <w:spacing w:before="0" w:after="60"/>
       </w:pPr>
       <w:r>
         <w:rPr>
@@ -3170,20 +3183,7 @@
           <w:i w:val="0"/>
           <w:sz w:val="20"/>
         </w:rPr>
-        <w:t>Following are some of the merits of the location:</w:t>
-      </w:r>
-    </w:p>
-    <w:p>
-      <w:pPr>
-        <w:spacing w:before="0" w:after="40"/>
-      </w:pPr>
-      <w:r>
-        <w:rPr>
-          <w:b w:val="0"/>
-          <w:i w:val="0"/>
-          <w:sz w:val="20"/>
-        </w:rPr>
-        <w:t xml:space="preserve">•  </w:t>
+        <w:t xml:space="preserve">▪  </w:t>
       </w:r>
       <w:r>
         <w:rPr>
@@ -3196,7 +3196,7 @@
     </w:p>
     <w:p>
       <w:pPr>
-        <w:spacing w:before="0" w:after="40"/>
+        <w:spacing w:before="0" w:after="60"/>
       </w:pPr>
       <w:r>
         <w:rPr>
@@ -3204,7 +3204,7 @@
           <w:i w:val="0"/>
           <w:sz w:val="20"/>
         </w:rPr>
-        <w:t xml:space="preserve">•  </w:t>
+        <w:t xml:space="preserve">▪  </w:t>
       </w:r>
       <w:r>
         <w:rPr>
@@ -3217,7 +3217,7 @@
     </w:p>
     <w:p>
       <w:pPr>
-        <w:spacing w:before="0" w:after="40"/>
+        <w:spacing w:before="0" w:after="60"/>
       </w:pPr>
       <w:r>
         <w:rPr>
@@ -3225,7 +3225,7 @@
           <w:i w:val="0"/>
           <w:sz w:val="20"/>
         </w:rPr>
-        <w:t xml:space="preserve">•  </w:t>
+        <w:t xml:space="preserve">▪  </w:t>
       </w:r>
       <w:r>
         <w:rPr>
@@ -3238,7 +3238,7 @@
     </w:p>
     <w:p>
       <w:pPr>
-        <w:spacing w:before="0" w:after="40"/>
+        <w:spacing w:before="0" w:after="60"/>
       </w:pPr>
       <w:r>
         <w:rPr>
@@ -3246,7 +3246,7 @@
           <w:i w:val="0"/>
           <w:sz w:val="20"/>
         </w:rPr>
-        <w:t xml:space="preserve">•  </w:t>
+        <w:t xml:space="preserve">▪  </w:t>
       </w:r>
       <w:r>
         <w:rPr>
@@ -3259,7 +3259,7 @@
     </w:p>
     <w:p>
       <w:pPr>
-        <w:spacing w:before="0" w:after="40"/>
+        <w:spacing w:before="0" w:after="60"/>
       </w:pPr>
       <w:r>
         <w:rPr>
@@ -3267,7 +3267,7 @@
           <w:i w:val="0"/>
           <w:sz w:val="20"/>
         </w:rPr>
-        <w:t xml:space="preserve">•  </w:t>
+        <w:t xml:space="preserve">▪  </w:t>
       </w:r>
       <w:r>
         <w:rPr>
@@ -3279,13 +3279,13 @@
       </w:r>
     </w:p>
     <w:p>
-      <w:pPr>
-        <w:spacing w:before="160" w:after="0"/>
-      </w:pPr>
+      <w:r>
+        <w:br w:type="page"/>
+      </w:r>
     </w:p>
     <w:p>
       <w:pPr>
-        <w:spacing w:before="0" w:after="80"/>
+        <w:spacing w:before="0" w:after="120"/>
       </w:pPr>
       <w:r>
         <w:rPr>
@@ -3298,17 +3298,858 @@
     </w:p>
     <w:p>
       <w:pPr>
-        <w:spacing w:before="0" w:after="0"/>
+        <w:spacing w:before="0" w:after="80"/>
       </w:pPr>
       <w:r>
         <w:rPr>
-          <w:b w:val="0"/>
+          <w:b/>
           <w:i w:val="0"/>
           <w:sz w:val="20"/>
         </w:rPr>
-        <w:t>{{ property_description }}</w:t>
+        <w:t>A. LAND</w:t>
       </w:r>
     </w:p>
+    <w:tbl>
+      <w:tblPr>
+        <w:tblStyle w:val="TableGrid"/>
+        <w:tblW w:type="auto" w:w="0"/>
+        <w:tblLook w:firstColumn="1" w:firstRow="1" w:lastColumn="0" w:lastRow="0" w:noHBand="0" w:noVBand="1" w:val="04A0"/>
+      </w:tblPr>
+      <w:tblGrid>
+        <w:gridCol w:w="3024"/>
+        <w:gridCol w:w="3024"/>
+        <w:gridCol w:w="3024"/>
+      </w:tblGrid>
+      <w:tr>
+        <w:tc>
+          <w:tcPr>
+            <w:tcW w:type="dxa" w:w="504"/>
+            <w:shd w:val="clear" w:color="auto" w:fill="1F3A2E"/>
+          </w:tcPr>
+          <w:p>
+            <w:r>
+              <w:rPr>
+                <w:b/>
+                <w:color w:val="FFFFFF"/>
+                <w:sz w:val="19"/>
+              </w:rPr>
+              <w:t>S.N.</w:t>
+            </w:r>
+          </w:p>
+        </w:tc>
+        <w:tc>
+          <w:tcPr>
+            <w:tcW w:type="dxa" w:w="3888"/>
+            <w:shd w:val="clear" w:color="auto" w:fill="1F3A2E"/>
+          </w:tcPr>
+          <w:p>
+            <w:r>
+              <w:rPr>
+                <w:b/>
+                <w:color w:val="FFFFFF"/>
+                <w:sz w:val="19"/>
+              </w:rPr>
+              <w:t>Particulars</w:t>
+            </w:r>
+          </w:p>
+        </w:tc>
+        <w:tc>
+          <w:tcPr>
+            <w:tcW w:type="dxa" w:w="4536"/>
+            <w:shd w:val="clear" w:color="auto" w:fill="1F3A2E"/>
+          </w:tcPr>
+          <w:p>
+            <w:r>
+              <w:rPr>
+                <w:b/>
+                <w:color w:val="FFFFFF"/>
+                <w:sz w:val="19"/>
+              </w:rPr>
+              <w:t>Details</w:t>
+            </w:r>
+          </w:p>
+        </w:tc>
+      </w:tr>
+      <w:tr>
+        <w:tc>
+          <w:tcPr>
+            <w:tcW w:type="dxa" w:w="3024"/>
+          </w:tcPr>
+          <w:p>
+            <w:r>
+              <w:rPr>
+                <w:sz w:val="19"/>
+              </w:rPr>
+              <w:t>1</w:t>
+            </w:r>
+          </w:p>
+        </w:tc>
+        <w:tc>
+          <w:tcPr>
+            <w:tcW w:type="dxa" w:w="3024"/>
+          </w:tcPr>
+          <w:p>
+            <w:r>
+              <w:rPr>
+                <w:sz w:val="19"/>
+              </w:rPr>
+              <w:t>Type of Ownership</w:t>
+            </w:r>
+          </w:p>
+        </w:tc>
+        <w:tc>
+          <w:tcPr>
+            <w:tcW w:type="dxa" w:w="3024"/>
+          </w:tcPr>
+          <w:p>
+            <w:r>
+              <w:rPr>
+                <w:sz w:val="19"/>
+              </w:rPr>
+              <w:t>{{ ownership_type }}</w:t>
+            </w:r>
+          </w:p>
+        </w:tc>
+      </w:tr>
+      <w:tr>
+        <w:tc>
+          <w:tcPr>
+            <w:tcW w:type="dxa" w:w="3024"/>
+          </w:tcPr>
+          <w:p>
+            <w:r>
+              <w:rPr>
+                <w:sz w:val="19"/>
+              </w:rPr>
+              <w:t>2</w:t>
+            </w:r>
+          </w:p>
+        </w:tc>
+        <w:tc>
+          <w:tcPr>
+            <w:tcW w:type="dxa" w:w="3024"/>
+          </w:tcPr>
+          <w:p>
+            <w:r>
+              <w:rPr>
+                <w:sz w:val="19"/>
+              </w:rPr>
+              <w:t>Shape of the Land</w:t>
+            </w:r>
+          </w:p>
+        </w:tc>
+        <w:tc>
+          <w:tcPr>
+            <w:tcW w:type="dxa" w:w="3024"/>
+          </w:tcPr>
+          <w:p>
+            <w:r>
+              <w:rPr>
+                <w:sz w:val="19"/>
+              </w:rPr>
+              <w:t>{{ land_shape }}</w:t>
+            </w:r>
+          </w:p>
+        </w:tc>
+      </w:tr>
+      <w:tr>
+        <w:tc>
+          <w:tcPr>
+            <w:tcW w:type="dxa" w:w="3024"/>
+          </w:tcPr>
+          <w:p>
+            <w:r>
+              <w:rPr>
+                <w:sz w:val="19"/>
+              </w:rPr>
+              <w:t>3</w:t>
+            </w:r>
+          </w:p>
+        </w:tc>
+        <w:tc>
+          <w:tcPr>
+            <w:tcW w:type="dxa" w:w="3024"/>
+          </w:tcPr>
+          <w:p>
+            <w:r>
+              <w:rPr>
+                <w:sz w:val="19"/>
+              </w:rPr>
+              <w:t>Level of the Land</w:t>
+            </w:r>
+          </w:p>
+        </w:tc>
+        <w:tc>
+          <w:tcPr>
+            <w:tcW w:type="dxa" w:w="3024"/>
+          </w:tcPr>
+          <w:p>
+            <w:r>
+              <w:rPr>
+                <w:sz w:val="19"/>
+              </w:rPr>
+              <w:t>General</w:t>
+            </w:r>
+          </w:p>
+        </w:tc>
+      </w:tr>
+      <w:tr>
+        <w:tc>
+          <w:tcPr>
+            <w:tcW w:type="dxa" w:w="3024"/>
+          </w:tcPr>
+          <w:p>
+            <w:r>
+              <w:rPr>
+                <w:sz w:val="19"/>
+              </w:rPr>
+              <w:t>4</w:t>
+            </w:r>
+          </w:p>
+        </w:tc>
+        <w:tc>
+          <w:tcPr>
+            <w:tcW w:type="dxa" w:w="3024"/>
+          </w:tcPr>
+          <w:p>
+            <w:r>
+              <w:rPr>
+                <w:sz w:val="19"/>
+              </w:rPr>
+              <w:t>Topography of Land</w:t>
+            </w:r>
+          </w:p>
+        </w:tc>
+        <w:tc>
+          <w:tcPr>
+            <w:tcW w:type="dxa" w:w="3024"/>
+          </w:tcPr>
+          <w:p>
+            <w:r>
+              <w:rPr>
+                <w:sz w:val="19"/>
+              </w:rPr>
+              <w:t>{{ land_topography }}</w:t>
+            </w:r>
+          </w:p>
+        </w:tc>
+      </w:tr>
+      <w:tr>
+        <w:tc>
+          <w:tcPr>
+            <w:tcW w:type="dxa" w:w="3024"/>
+          </w:tcPr>
+          <w:p>
+            <w:r>
+              <w:rPr>
+                <w:sz w:val="19"/>
+              </w:rPr>
+              <w:t>5</w:t>
+            </w:r>
+          </w:p>
+        </w:tc>
+        <w:tc>
+          <w:tcPr>
+            <w:tcW w:type="dxa" w:w="3024"/>
+          </w:tcPr>
+          <w:p>
+            <w:r>
+              <w:rPr>
+                <w:sz w:val="19"/>
+              </w:rPr>
+              <w:t>Nature of Soil</w:t>
+            </w:r>
+          </w:p>
+        </w:tc>
+        <w:tc>
+          <w:tcPr>
+            <w:tcW w:type="dxa" w:w="3024"/>
+          </w:tcPr>
+          <w:p>
+            <w:r>
+              <w:rPr>
+                <w:sz w:val="19"/>
+              </w:rPr>
+              <w:t>N/A</w:t>
+            </w:r>
+          </w:p>
+        </w:tc>
+      </w:tr>
+      <w:tr>
+        <w:tc>
+          <w:tcPr>
+            <w:tcW w:type="dxa" w:w="3024"/>
+          </w:tcPr>
+          <w:p>
+            <w:r>
+              <w:rPr>
+                <w:sz w:val="19"/>
+              </w:rPr>
+              <w:t>6</w:t>
+            </w:r>
+          </w:p>
+        </w:tc>
+        <w:tc>
+          <w:tcPr>
+            <w:tcW w:type="dxa" w:w="3024"/>
+          </w:tcPr>
+          <w:p>
+            <w:r>
+              <w:rPr>
+                <w:sz w:val="19"/>
+              </w:rPr>
+              <w:t>Plot No.</w:t>
+            </w:r>
+          </w:p>
+        </w:tc>
+        <w:tc>
+          <w:tcPr>
+            <w:tcW w:type="dxa" w:w="3024"/>
+          </w:tcPr>
+          <w:p>
+            <w:r>
+              <w:rPr>
+                <w:sz w:val="19"/>
+              </w:rPr>
+              <w:t>{{ plot_no }}</w:t>
+            </w:r>
+          </w:p>
+        </w:tc>
+      </w:tr>
+      <w:tr>
+        <w:tc>
+          <w:tcPr>
+            <w:tcW w:type="dxa" w:w="3024"/>
+          </w:tcPr>
+          <w:p>
+            <w:r>
+              <w:rPr>
+                <w:sz w:val="19"/>
+              </w:rPr>
+              <w:t>7</w:t>
+            </w:r>
+          </w:p>
+        </w:tc>
+        <w:tc>
+          <w:tcPr>
+            <w:tcW w:type="dxa" w:w="3024"/>
+          </w:tcPr>
+          <w:p>
+            <w:r>
+              <w:rPr>
+                <w:sz w:val="19"/>
+              </w:rPr>
+              <w:t>Access of the Land as per Blue Print</w:t>
+            </w:r>
+          </w:p>
+        </w:tc>
+        <w:tc>
+          <w:tcPr>
+            <w:tcW w:type="dxa" w:w="3024"/>
+          </w:tcPr>
+          <w:p>
+            <w:r>
+              <w:rPr>
+                <w:sz w:val="19"/>
+              </w:rPr>
+              <w:t>{{ road_access_blueprint }}</w:t>
+            </w:r>
+          </w:p>
+        </w:tc>
+      </w:tr>
+      <w:tr>
+        <w:tc>
+          <w:tcPr>
+            <w:tcW w:type="dxa" w:w="3024"/>
+          </w:tcPr>
+          <w:p>
+            <w:r>
+              <w:rPr>
+                <w:sz w:val="19"/>
+              </w:rPr>
+              <w:t>8</w:t>
+            </w:r>
+          </w:p>
+        </w:tc>
+        <w:tc>
+          <w:tcPr>
+            <w:tcW w:type="dxa" w:w="3024"/>
+          </w:tcPr>
+          <w:p>
+            <w:r>
+              <w:rPr>
+                <w:sz w:val="19"/>
+              </w:rPr>
+              <w:t>Access of the Land as per Field</w:t>
+            </w:r>
+          </w:p>
+        </w:tc>
+        <w:tc>
+          <w:tcPr>
+            <w:tcW w:type="dxa" w:w="3024"/>
+          </w:tcPr>
+          <w:p>
+            <w:r>
+              <w:rPr>
+                <w:sz w:val="19"/>
+              </w:rPr>
+              <w:t>{{ road_access }}</w:t>
+            </w:r>
+          </w:p>
+        </w:tc>
+      </w:tr>
+      <w:tr>
+        <w:tc>
+          <w:tcPr>
+            <w:tcW w:type="dxa" w:w="3024"/>
+          </w:tcPr>
+          <w:p>
+            <w:r>
+              <w:rPr>
+                <w:sz w:val="19"/>
+              </w:rPr>
+              <w:t>9</w:t>
+            </w:r>
+          </w:p>
+        </w:tc>
+        <w:tc>
+          <w:tcPr>
+            <w:tcW w:type="dxa" w:w="3024"/>
+          </w:tcPr>
+          <w:p>
+            <w:r>
+              <w:rPr>
+                <w:sz w:val="19"/>
+              </w:rPr>
+              <w:t>Frontage of Land</w:t>
+            </w:r>
+          </w:p>
+        </w:tc>
+        <w:tc>
+          <w:tcPr>
+            <w:tcW w:type="dxa" w:w="3024"/>
+          </w:tcPr>
+          <w:p>
+            <w:r>
+              <w:rPr>
+                <w:sz w:val="19"/>
+              </w:rPr>
+              <w:t>{{ frontage }}</w:t>
+            </w:r>
+          </w:p>
+        </w:tc>
+      </w:tr>
+      <w:tr>
+        <w:tc>
+          <w:tcPr>
+            <w:tcW w:type="dxa" w:w="3024"/>
+          </w:tcPr>
+          <w:p>
+            <w:r>
+              <w:rPr>
+                <w:sz w:val="19"/>
+              </w:rPr>
+              <w:t>10</w:t>
+            </w:r>
+          </w:p>
+        </w:tc>
+        <w:tc>
+          <w:tcPr>
+            <w:tcW w:type="dxa" w:w="3024"/>
+          </w:tcPr>
+          <w:p>
+            <w:r>
+              <w:rPr>
+                <w:sz w:val="19"/>
+              </w:rPr>
+              <w:t>Face of Land</w:t>
+            </w:r>
+          </w:p>
+        </w:tc>
+        <w:tc>
+          <w:tcPr>
+            <w:tcW w:type="dxa" w:w="3024"/>
+          </w:tcPr>
+          <w:p>
+            <w:r>
+              <w:rPr>
+                <w:sz w:val="19"/>
+              </w:rPr>
+              <w:t>{{ facing }}</w:t>
+            </w:r>
+          </w:p>
+        </w:tc>
+      </w:tr>
+      <w:tr>
+        <w:tc>
+          <w:tcPr>
+            <w:tcW w:type="dxa" w:w="3024"/>
+          </w:tcPr>
+          <w:p>
+            <w:r>
+              <w:rPr>
+                <w:sz w:val="19"/>
+              </w:rPr>
+              <w:t>11</w:t>
+            </w:r>
+          </w:p>
+        </w:tc>
+        <w:tc>
+          <w:tcPr>
+            <w:tcW w:type="dxa" w:w="3024"/>
+          </w:tcPr>
+          <w:p>
+            <w:r>
+              <w:rPr>
+                <w:sz w:val="19"/>
+              </w:rPr>
+              <w:t>Any Construction on the Land</w:t>
+            </w:r>
+          </w:p>
+        </w:tc>
+        <w:tc>
+          <w:tcPr>
+            <w:tcW w:type="dxa" w:w="3024"/>
+          </w:tcPr>
+          <w:p>
+            <w:r>
+              <w:rPr>
+                <w:sz w:val="19"/>
+              </w:rPr>
+              <w:t>—</w:t>
+            </w:r>
+          </w:p>
+        </w:tc>
+      </w:tr>
+      <w:tr>
+        <w:tc>
+          <w:tcPr>
+            <w:tcW w:type="dxa" w:w="3024"/>
+          </w:tcPr>
+          <w:p>
+            <w:r>
+              <w:rPr>
+                <w:sz w:val="19"/>
+              </w:rPr>
+              <w:t>12</w:t>
+            </w:r>
+          </w:p>
+        </w:tc>
+        <w:tc>
+          <w:tcPr>
+            <w:tcW w:type="dxa" w:w="3024"/>
+          </w:tcPr>
+          <w:p>
+            <w:r>
+              <w:rPr>
+                <w:sz w:val="19"/>
+              </w:rPr>
+              <w:t>Sewer Facility on the Land</w:t>
+            </w:r>
+          </w:p>
+        </w:tc>
+        <w:tc>
+          <w:tcPr>
+            <w:tcW w:type="dxa" w:w="3024"/>
+          </w:tcPr>
+          <w:p>
+            <w:r>
+              <w:rPr>
+                <w:sz w:val="19"/>
+              </w:rPr>
+              <w:t>{{ sewerage }}</w:t>
+            </w:r>
+          </w:p>
+        </w:tc>
+      </w:tr>
+      <w:tr>
+        <w:tc>
+          <w:tcPr>
+            <w:tcW w:type="dxa" w:w="3024"/>
+          </w:tcPr>
+          <w:p>
+            <w:r>
+              <w:rPr>
+                <w:sz w:val="19"/>
+              </w:rPr>
+              <w:t>13</w:t>
+            </w:r>
+          </w:p>
+        </w:tc>
+        <w:tc>
+          <w:tcPr>
+            <w:tcW w:type="dxa" w:w="3024"/>
+          </w:tcPr>
+          <w:p>
+            <w:r>
+              <w:rPr>
+                <w:sz w:val="19"/>
+              </w:rPr>
+              <w:t>Water Supply Facility on that Area</w:t>
+            </w:r>
+          </w:p>
+        </w:tc>
+        <w:tc>
+          <w:tcPr>
+            <w:tcW w:type="dxa" w:w="3024"/>
+          </w:tcPr>
+          <w:p>
+            <w:r>
+              <w:rPr>
+                <w:sz w:val="19"/>
+              </w:rPr>
+              <w:t>{{ water_supply }}</w:t>
+            </w:r>
+          </w:p>
+        </w:tc>
+      </w:tr>
+      <w:tr>
+        <w:tc>
+          <w:tcPr>
+            <w:tcW w:type="dxa" w:w="3024"/>
+          </w:tcPr>
+          <w:p>
+            <w:r>
+              <w:rPr>
+                <w:sz w:val="19"/>
+              </w:rPr>
+              <w:t>14</w:t>
+            </w:r>
+          </w:p>
+        </w:tc>
+        <w:tc>
+          <w:tcPr>
+            <w:tcW w:type="dxa" w:w="3024"/>
+          </w:tcPr>
+          <w:p>
+            <w:r>
+              <w:rPr>
+                <w:sz w:val="19"/>
+              </w:rPr>
+              <w:t>Electricity Supply on that Area</w:t>
+            </w:r>
+          </w:p>
+        </w:tc>
+        <w:tc>
+          <w:tcPr>
+            <w:tcW w:type="dxa" w:w="3024"/>
+          </w:tcPr>
+          <w:p>
+            <w:r>
+              <w:rPr>
+                <w:sz w:val="19"/>
+              </w:rPr>
+              <w:t>{{ electricity_line }}</w:t>
+            </w:r>
+          </w:p>
+        </w:tc>
+      </w:tr>
+      <w:tr>
+        <w:tc>
+          <w:tcPr>
+            <w:tcW w:type="dxa" w:w="3024"/>
+          </w:tcPr>
+          <w:p>
+            <w:r>
+              <w:rPr>
+                <w:sz w:val="19"/>
+              </w:rPr>
+              <w:t>15</w:t>
+            </w:r>
+          </w:p>
+        </w:tc>
+        <w:tc>
+          <w:tcPr>
+            <w:tcW w:type="dxa" w:w="3024"/>
+          </w:tcPr>
+          <w:p>
+            <w:r>
+              <w:rPr>
+                <w:sz w:val="19"/>
+              </w:rPr>
+              <w:t>Nature of the Area</w:t>
+            </w:r>
+          </w:p>
+        </w:tc>
+        <w:tc>
+          <w:tcPr>
+            <w:tcW w:type="dxa" w:w="3024"/>
+          </w:tcPr>
+          <w:p>
+            <w:r>
+              <w:rPr>
+                <w:sz w:val="19"/>
+              </w:rPr>
+              <w:t>{{ location_type }}</w:t>
+            </w:r>
+          </w:p>
+        </w:tc>
+      </w:tr>
+      <w:tr>
+        <w:tc>
+          <w:tcPr>
+            <w:tcW w:type="dxa" w:w="3024"/>
+          </w:tcPr>
+          <w:p>
+            <w:r>
+              <w:rPr>
+                <w:sz w:val="19"/>
+              </w:rPr>
+              <w:t>16</w:t>
+            </w:r>
+          </w:p>
+        </w:tc>
+        <w:tc>
+          <w:tcPr>
+            <w:tcW w:type="dxa" w:w="3024"/>
+          </w:tcPr>
+          <w:p>
+            <w:r>
+              <w:rPr>
+                <w:sz w:val="19"/>
+              </w:rPr>
+              <w:t>Whether located below High Tension Electric Line</w:t>
+            </w:r>
+          </w:p>
+        </w:tc>
+        <w:tc>
+          <w:tcPr>
+            <w:tcW w:type="dxa" w:w="3024"/>
+          </w:tcPr>
+          <w:p>
+            <w:r>
+              <w:rPr>
+                <w:sz w:val="19"/>
+              </w:rPr>
+              <w:t>{{ near_high_tension_line_text }}</w:t>
+            </w:r>
+          </w:p>
+        </w:tc>
+      </w:tr>
+      <w:tr>
+        <w:tc>
+          <w:tcPr>
+            <w:tcW w:type="dxa" w:w="3024"/>
+          </w:tcPr>
+          <w:p>
+            <w:r>
+              <w:rPr>
+                <w:sz w:val="19"/>
+              </w:rPr>
+              <w:t>17</w:t>
+            </w:r>
+          </w:p>
+        </w:tc>
+        <w:tc>
+          <w:tcPr>
+            <w:tcW w:type="dxa" w:w="3024"/>
+          </w:tcPr>
+          <w:p>
+            <w:r>
+              <w:rPr>
+                <w:sz w:val="19"/>
+              </w:rPr>
+              <w:t>Address of the Land</w:t>
+            </w:r>
+          </w:p>
+        </w:tc>
+        <w:tc>
+          <w:tcPr>
+            <w:tcW w:type="dxa" w:w="3024"/>
+          </w:tcPr>
+          <w:p>
+            <w:r>
+              <w:rPr>
+                <w:sz w:val="19"/>
+              </w:rPr>
+              <w:t>{{ property_location_full }}</w:t>
+            </w:r>
+          </w:p>
+        </w:tc>
+      </w:tr>
+      <w:tr>
+        <w:tc>
+          <w:tcPr>
+            <w:tcW w:type="dxa" w:w="3024"/>
+          </w:tcPr>
+          <w:p>
+            <w:r>
+              <w:rPr>
+                <w:sz w:val="19"/>
+              </w:rPr>
+              <w:t>18</w:t>
+            </w:r>
+          </w:p>
+        </w:tc>
+        <w:tc>
+          <w:tcPr>
+            <w:tcW w:type="dxa" w:w="3024"/>
+          </w:tcPr>
+          <w:p>
+            <w:r>
+              <w:rPr>
+                <w:sz w:val="19"/>
+              </w:rPr>
+              <w:t>Positive Feature of Land</w:t>
+            </w:r>
+          </w:p>
+        </w:tc>
+        <w:tc>
+          <w:tcPr>
+            <w:tcW w:type="dxa" w:w="3024"/>
+          </w:tcPr>
+          <w:p>
+            <w:r>
+              <w:rPr>
+                <w:sz w:val="19"/>
+              </w:rPr>
+              <w:t>N/A</w:t>
+            </w:r>
+          </w:p>
+        </w:tc>
+      </w:tr>
+      <w:tr>
+        <w:tc>
+          <w:tcPr>
+            <w:tcW w:type="dxa" w:w="3024"/>
+          </w:tcPr>
+          <w:p>
+            <w:r>
+              <w:rPr>
+                <w:sz w:val="19"/>
+              </w:rPr>
+              <w:t>19</w:t>
+            </w:r>
+          </w:p>
+        </w:tc>
+        <w:tc>
+          <w:tcPr>
+            <w:tcW w:type="dxa" w:w="3024"/>
+          </w:tcPr>
+          <w:p>
+            <w:r>
+              <w:rPr>
+                <w:sz w:val="19"/>
+              </w:rPr>
+              <w:t>Any Negative Feature of The Area</w:t>
+            </w:r>
+          </w:p>
+        </w:tc>
+        <w:tc>
+          <w:tcPr>
+            <w:tcW w:type="dxa" w:w="3024"/>
+          </w:tcPr>
+          <w:p>
+            <w:r>
+              <w:rPr>
+                <w:sz w:val="19"/>
+              </w:rPr>
+              <w:t>N/A</w:t>
+            </w:r>
+          </w:p>
+        </w:tc>
+      </w:tr>
+    </w:tbl>
     <w:p>
       <w:r>
         <w:br w:type="page"/>
@@ -3577,7 +4418,7 @@
               <w:rPr>
                 <w:sz w:val="19"/>
               </w:rPr>
-              <w:t>a) Current Revenue has been paid</w:t>
+              <w:t>a) Whether the Current/Revenue has been paid</w:t>
             </w:r>
           </w:p>
         </w:tc>
@@ -3775,7 +4616,7 @@
               <w:rPr>
                 <w:sz w:val="19"/>
               </w:rPr>
-              <w:t>c) Whether 6 Month 35 days has elapsed</w:t>
+              <w:t>c) Whether 6 Month 35 days in case of Normal Sale &amp; 2 years 35 days for Gift has elapsed</w:t>
             </w:r>
           </w:p>
         </w:tc>
@@ -3804,6 +4645,232 @@
                 <w:sz w:val="19"/>
               </w:rPr>
               <w:t>d) Comments, if any</w:t>
+            </w:r>
+          </w:p>
+        </w:tc>
+        <w:tc>
+          <w:tcPr>
+            <w:tcW w:type="dxa" w:w="4536"/>
+          </w:tcPr>
+          <w:p>
+            <w:r>
+              <w:rPr>
+                <w:sz w:val="19"/>
+              </w:rPr>
+              <w:t>None</w:t>
+            </w:r>
+          </w:p>
+        </w:tc>
+      </w:tr>
+    </w:tbl>
+    <w:p>
+      <w:pPr>
+        <w:spacing w:before="120" w:after="60"/>
+      </w:pPr>
+      <w:r>
+        <w:rPr>
+          <w:b/>
+          <w:i w:val="0"/>
+          <w:sz w:val="20"/>
+        </w:rPr>
+        <w:t>Maps of the Plots prepared by Government Survey Department</w:t>
+      </w:r>
+    </w:p>
+    <w:tbl>
+      <w:tblPr>
+        <w:tblStyle w:val="TableGrid"/>
+        <w:tblW w:type="auto" w:w="0"/>
+        <w:tblLook w:firstColumn="1" w:firstRow="1" w:lastColumn="0" w:lastRow="0" w:noHBand="0" w:noVBand="1" w:val="04A0"/>
+      </w:tblPr>
+      <w:tblGrid>
+        <w:gridCol w:w="4536"/>
+        <w:gridCol w:w="4536"/>
+      </w:tblGrid>
+      <w:tr>
+        <w:tc>
+          <w:tcPr>
+            <w:tcW w:type="dxa" w:w="5760"/>
+            <w:shd w:val="clear" w:color="auto" w:fill="1F3A2E"/>
+          </w:tcPr>
+          <w:p>
+            <w:r>
+              <w:rPr>
+                <w:b/>
+                <w:color w:val="FFFFFF"/>
+                <w:sz w:val="19"/>
+              </w:rPr>
+              <w:t>Item</w:t>
+            </w:r>
+          </w:p>
+        </w:tc>
+        <w:tc>
+          <w:tcPr>
+            <w:tcW w:type="dxa" w:w="3168"/>
+            <w:shd w:val="clear" w:color="auto" w:fill="1F3A2E"/>
+          </w:tcPr>
+          <w:p>
+            <w:r>
+              <w:rPr>
+                <w:b/>
+                <w:color w:val="FFFFFF"/>
+                <w:sz w:val="19"/>
+              </w:rPr>
+              <w:t>Status</w:t>
+            </w:r>
+          </w:p>
+        </w:tc>
+      </w:tr>
+      <w:tr>
+        <w:tc>
+          <w:tcPr>
+            <w:tcW w:type="dxa" w:w="4536"/>
+          </w:tcPr>
+          <w:p>
+            <w:r>
+              <w:rPr>
+                <w:sz w:val="19"/>
+              </w:rPr>
+              <w:t>a) Whether the plots are indicated</w:t>
+            </w:r>
+          </w:p>
+        </w:tc>
+        <w:tc>
+          <w:tcPr>
+            <w:tcW w:type="dxa" w:w="4536"/>
+          </w:tcPr>
+          <w:p>
+            <w:r>
+              <w:rPr>
+                <w:sz w:val="19"/>
+              </w:rPr>
+              <w:t>Yes</w:t>
+            </w:r>
+          </w:p>
+        </w:tc>
+      </w:tr>
+      <w:tr>
+        <w:tc>
+          <w:tcPr>
+            <w:tcW w:type="dxa" w:w="4536"/>
+          </w:tcPr>
+          <w:p>
+            <w:r>
+              <w:rPr>
+                <w:sz w:val="19"/>
+              </w:rPr>
+              <w:t>b) Whether access is clearly marked on the map prepared by Government Survey Department</w:t>
+            </w:r>
+          </w:p>
+        </w:tc>
+        <w:tc>
+          <w:tcPr>
+            <w:tcW w:type="dxa" w:w="4536"/>
+          </w:tcPr>
+          <w:p>
+            <w:r>
+              <w:rPr>
+                <w:sz w:val="19"/>
+              </w:rPr>
+              <w:t>Yes</w:t>
+            </w:r>
+          </w:p>
+        </w:tc>
+      </w:tr>
+      <w:tr>
+        <w:tc>
+          <w:tcPr>
+            <w:tcW w:type="dxa" w:w="4536"/>
+          </w:tcPr>
+          <w:p>
+            <w:r>
+              <w:rPr>
+                <w:sz w:val="19"/>
+              </w:rPr>
+              <w:t>c) Whether the shape of the land in the field tally with the map</w:t>
+            </w:r>
+          </w:p>
+        </w:tc>
+        <w:tc>
+          <w:tcPr>
+            <w:tcW w:type="dxa" w:w="4536"/>
+          </w:tcPr>
+          <w:p>
+            <w:r>
+              <w:rPr>
+                <w:sz w:val="19"/>
+              </w:rPr>
+              <w:t>Yes</w:t>
+            </w:r>
+          </w:p>
+        </w:tc>
+      </w:tr>
+      <w:tr>
+        <w:tc>
+          <w:tcPr>
+            <w:tcW w:type="dxa" w:w="4536"/>
+          </w:tcPr>
+          <w:p>
+            <w:r>
+              <w:rPr>
+                <w:sz w:val="19"/>
+              </w:rPr>
+              <w:t>d) Comments, if any</w:t>
+            </w:r>
+          </w:p>
+        </w:tc>
+        <w:tc>
+          <w:tcPr>
+            <w:tcW w:type="dxa" w:w="4536"/>
+          </w:tcPr>
+          <w:p>
+            <w:r>
+              <w:rPr>
+                <w:sz w:val="19"/>
+              </w:rPr>
+              <w:t>None</w:t>
+            </w:r>
+          </w:p>
+        </w:tc>
+      </w:tr>
+      <w:tr>
+        <w:tc>
+          <w:tcPr>
+            <w:tcW w:type="dxa" w:w="4536"/>
+          </w:tcPr>
+          <w:p>
+            <w:r>
+              <w:rPr>
+                <w:sz w:val="19"/>
+              </w:rPr>
+              <w:t>e) Whether the area of land increased or decreased compared to the recorded in the existing land Ownership Document</w:t>
+            </w:r>
+          </w:p>
+        </w:tc>
+        <w:tc>
+          <w:tcPr>
+            <w:tcW w:type="dxa" w:w="4536"/>
+          </w:tcPr>
+          <w:p>
+            <w:r>
+              <w:rPr>
+                <w:sz w:val="19"/>
+              </w:rPr>
+              <w:t>{{ area_change }}</w:t>
+            </w:r>
+          </w:p>
+        </w:tc>
+      </w:tr>
+      <w:tr>
+        <w:tc>
+          <w:tcPr>
+            <w:tcW w:type="dxa" w:w="4536"/>
+          </w:tcPr>
+          <w:p>
+            <w:r>
+              <w:rPr>
+                <w:sz w:val="19"/>
+              </w:rPr>
+              <w:t>f) Comments, if any</w:t>
             </w:r>
           </w:p>
         </w:tc>
@@ -3889,7 +4956,7 @@
               <w:rPr>
                 <w:sz w:val="19"/>
               </w:rPr>
-              <w:t>a) Parameters of Boundary Available</w:t>
+              <w:t>a) Is the Parameters of Boundary Available</w:t>
             </w:r>
           </w:p>
         </w:tc>
@@ -4031,7 +5098,7 @@
               <w:rPr>
                 <w:sz w:val="19"/>
               </w:rPr>
-              <w:t>a) Free access to the property is Available</w:t>
+              <w:t>a) Whether free access to the property is Available</w:t>
             </w:r>
           </w:p>
         </w:tc>
@@ -4059,7 +5126,7 @@
               <w:rPr>
                 <w:sz w:val="19"/>
               </w:rPr>
-              <w:t>b) Land notified for acquisition by Government</w:t>
+              <w:t>b) Has whole or part of the land been notified for acquisition by government</w:t>
             </w:r>
           </w:p>
         </w:tc>
@@ -4087,7 +5154,7 @@
               <w:rPr>
                 <w:sz w:val="19"/>
               </w:rPr>
-              <w:t>c) Boundary clearly defined at site</w:t>
+              <w:t>c) Whether the boundary of the property is clearly defined at the site</w:t>
             </w:r>
           </w:p>
         </w:tc>
@@ -4262,7 +5329,7 @@
               <w:rPr>
                 <w:sz w:val="19"/>
               </w:rPr>
-              <w:t>Electricity Line</w:t>
+              <w:t>River/Stream near the property</w:t>
             </w:r>
           </w:p>
         </w:tc>
@@ -4275,7 +5342,7 @@
               <w:rPr>
                 <w:sz w:val="19"/>
               </w:rPr>
-              <w:t>{{ electricity_line }}</w:t>
+              <w:t>{{ near_river_stream_text }}</w:t>
             </w:r>
           </w:p>
         </w:tc>
@@ -4290,7 +5357,7 @@
               <w:rPr>
                 <w:sz w:val="19"/>
               </w:rPr>
-              <w:t>Telephone Line</w:t>
+              <w:t>Fuel storage depot near the property</w:t>
             </w:r>
           </w:p>
         </w:tc>
@@ -4303,7 +5370,7 @@
               <w:rPr>
                 <w:sz w:val="19"/>
               </w:rPr>
-              <w:t>{{ telephone }}</w:t>
+              <w:t>{{ near_fuel_depot_text }}</w:t>
             </w:r>
           </w:p>
         </w:tc>
@@ -4318,7 +5385,7 @@
               <w:rPr>
                 <w:sz w:val="19"/>
               </w:rPr>
-              <w:t>TV Cable</w:t>
+              <w:t>Electricity Line</w:t>
             </w:r>
           </w:p>
         </w:tc>
@@ -4331,7 +5398,7 @@
               <w:rPr>
                 <w:sz w:val="19"/>
               </w:rPr>
-              <w:t>{{ tv_cable }}</w:t>
+              <w:t>{{ electricity_line }}</w:t>
             </w:r>
           </w:p>
         </w:tc>
@@ -4346,7 +5413,7 @@
               <w:rPr>
                 <w:sz w:val="19"/>
               </w:rPr>
-              <w:t>Sewerage Pipe Line</w:t>
+              <w:t>Telephone Line</w:t>
             </w:r>
           </w:p>
         </w:tc>
@@ -4359,7 +5426,7 @@
               <w:rPr>
                 <w:sz w:val="19"/>
               </w:rPr>
-              <w:t>{{ sewerage }}</w:t>
+              <w:t>{{ telephone }}</w:t>
             </w:r>
           </w:p>
         </w:tc>
@@ -4374,7 +5441,7 @@
               <w:rPr>
                 <w:sz w:val="19"/>
               </w:rPr>
-              <w:t>River/Stream near the property</w:t>
+              <w:t>TV Cable</w:t>
             </w:r>
           </w:p>
         </w:tc>
@@ -4387,7 +5454,7 @@
               <w:rPr>
                 <w:sz w:val="19"/>
               </w:rPr>
-              <w:t>{{ near_river_stream_text }}</w:t>
+              <w:t>{{ tv_cable }}</w:t>
             </w:r>
           </w:p>
         </w:tc>
@@ -4402,7 +5469,7 @@
               <w:rPr>
                 <w:sz w:val="19"/>
               </w:rPr>
-              <w:t>Fuel storage depot</w:t>
+              <w:t>Temple/Shrine near the property</w:t>
             </w:r>
           </w:p>
         </w:tc>
@@ -4415,7 +5482,7 @@
               <w:rPr>
                 <w:sz w:val="19"/>
               </w:rPr>
-              <w:t>{{ near_fuel_depot_text }}</w:t>
+              <w:t>{{ near_temple_text }}</w:t>
             </w:r>
           </w:p>
         </w:tc>
@@ -4430,7 +5497,7 @@
               <w:rPr>
                 <w:sz w:val="19"/>
               </w:rPr>
-              <w:t>Temple/Shrine near property</w:t>
+              <w:t>Water Logging</w:t>
             </w:r>
           </w:p>
         </w:tc>
@@ -4443,7 +5510,7 @@
               <w:rPr>
                 <w:sz w:val="19"/>
               </w:rPr>
-              <w:t>{{ near_temple_text }}</w:t>
+              <w:t>{{ water_logging_text }}</w:t>
             </w:r>
           </w:p>
         </w:tc>
@@ -4458,7 +5525,7 @@
               <w:rPr>
                 <w:sz w:val="19"/>
               </w:rPr>
-              <w:t>Water Logging</w:t>
+              <w:t>Cremation area near the property</w:t>
             </w:r>
           </w:p>
         </w:tc>
@@ -4471,7 +5538,7 @@
               <w:rPr>
                 <w:sz w:val="19"/>
               </w:rPr>
-              <w:t>{{ water_logging_text }}</w:t>
+              <w:t>{{ near_cremation_area_text }}</w:t>
             </w:r>
           </w:p>
         </w:tc>
@@ -4486,7 +5553,7 @@
               <w:rPr>
                 <w:sz w:val="19"/>
               </w:rPr>
-              <w:t>Cremation area near property</w:t>
+              <w:t>Army barracks near the property</w:t>
             </w:r>
           </w:p>
         </w:tc>
@@ -4499,7 +5566,7 @@
               <w:rPr>
                 <w:sz w:val="19"/>
               </w:rPr>
-              <w:t>{{ near_cremation_area_text }}</w:t>
+              <w:t>{{ near_army_barracks_text }}</w:t>
             </w:r>
           </w:p>
         </w:tc>
@@ -4514,7 +5581,7 @@
               <w:rPr>
                 <w:sz w:val="19"/>
               </w:rPr>
-              <w:t>Army barracks near property</w:t>
+              <w:t>Monument near the property</w:t>
             </w:r>
           </w:p>
         </w:tc>
@@ -4527,7 +5594,7 @@
               <w:rPr>
                 <w:sz w:val="19"/>
               </w:rPr>
-              <w:t>{{ near_army_barracks_text }}</w:t>
+              <w:t>{{ near_monument_text }}</w:t>
             </w:r>
           </w:p>
         </w:tc>
@@ -4542,7 +5609,7 @@
               <w:rPr>
                 <w:sz w:val="19"/>
               </w:rPr>
-              <w:t>Monument near property</w:t>
+              <w:t>Hazardous factory</w:t>
             </w:r>
           </w:p>
         </w:tc>
@@ -4555,7 +5622,7 @@
               <w:rPr>
                 <w:sz w:val="19"/>
               </w:rPr>
-              <w:t>{{ near_monument_text }}</w:t>
+              <w:t>{{ near_hazardous_factory_text }}</w:t>
             </w:r>
           </w:p>
         </w:tc>
@@ -4570,7 +5637,7 @@
               <w:rPr>
                 <w:sz w:val="19"/>
               </w:rPr>
-              <w:t>Hazardous factory</w:t>
+              <w:t>Sewerage Pipe Line</w:t>
             </w:r>
           </w:p>
         </w:tc>
@@ -4583,7 +5650,7 @@
               <w:rPr>
                 <w:sz w:val="19"/>
               </w:rPr>
-              <w:t>{{ near_hazardous_factory_text }}</w:t>
+              <w:t>{{ sewerage }}</w:t>
             </w:r>
           </w:p>
         </w:tc>
@@ -4598,7 +5665,7 @@
               <w:rPr>
                 <w:sz w:val="19"/>
               </w:rPr>
-              <w:t>Dumping site near property</w:t>
+              <w:t>Dumping site near the property</w:t>
             </w:r>
           </w:p>
         </w:tc>
@@ -4626,7 +5693,7 @@
               <w:rPr>
                 <w:sz w:val="19"/>
               </w:rPr>
-              <w:t>High-tension line near property</w:t>
+              <w:t>High-tension line near the property</w:t>
             </w:r>
           </w:p>
         </w:tc>
@@ -4640,6 +5707,140 @@
                 <w:sz w:val="19"/>
               </w:rPr>
               <w:t>{{ near_high_tension_line_text }}</w:t>
+            </w:r>
+          </w:p>
+        </w:tc>
+      </w:tr>
+    </w:tbl>
+    <w:p>
+      <w:pPr>
+        <w:spacing w:before="120" w:after="0"/>
+      </w:pPr>
+    </w:p>
+    <w:tbl>
+      <w:tblPr>
+        <w:tblStyle w:val="TableGrid"/>
+        <w:tblW w:type="auto" w:w="0"/>
+        <w:tblLook w:firstColumn="1" w:firstRow="1" w:lastColumn="0" w:lastRow="0" w:noHBand="0" w:noVBand="1" w:val="04A0"/>
+      </w:tblPr>
+      <w:tblGrid>
+        <w:gridCol w:w="4536"/>
+        <w:gridCol w:w="4536"/>
+      </w:tblGrid>
+      <w:tr>
+        <w:tc>
+          <w:tcPr>
+            <w:tcW w:type="dxa" w:w="3600"/>
+            <w:shd w:val="clear" w:color="auto" w:fill="1F3A2E"/>
+          </w:tcPr>
+          <w:p>
+            <w:r>
+              <w:rPr>
+                <w:b/>
+                <w:color w:val="FFFFFF"/>
+                <w:sz w:val="19"/>
+              </w:rPr>
+              <w:t>Item</w:t>
+            </w:r>
+          </w:p>
+        </w:tc>
+        <w:tc>
+          <w:tcPr>
+            <w:tcW w:type="dxa" w:w="5328"/>
+            <w:shd w:val="clear" w:color="auto" w:fill="1F3A2E"/>
+          </w:tcPr>
+          <w:p>
+            <w:r>
+              <w:rPr>
+                <w:b/>
+                <w:color w:val="FFFFFF"/>
+                <w:sz w:val="19"/>
+              </w:rPr>
+              <w:t>Value</w:t>
+            </w:r>
+          </w:p>
+        </w:tc>
+      </w:tr>
+      <w:tr>
+        <w:tc>
+          <w:tcPr>
+            <w:tcW w:type="dxa" w:w="4536"/>
+          </w:tcPr>
+          <w:p>
+            <w:r>
+              <w:rPr>
+                <w:sz w:val="19"/>
+              </w:rPr>
+              <w:t>Property Type</w:t>
+            </w:r>
+          </w:p>
+        </w:tc>
+        <w:tc>
+          <w:tcPr>
+            <w:tcW w:type="dxa" w:w="4536"/>
+          </w:tcPr>
+          <w:p>
+            <w:r>
+              <w:rPr>
+                <w:sz w:val="19"/>
+              </w:rPr>
+              <w:t>{{ location_type }}</w:t>
+            </w:r>
+          </w:p>
+        </w:tc>
+      </w:tr>
+      <w:tr>
+        <w:tc>
+          <w:tcPr>
+            <w:tcW w:type="dxa" w:w="4536"/>
+          </w:tcPr>
+          <w:p>
+            <w:r>
+              <w:rPr>
+                <w:sz w:val="19"/>
+              </w:rPr>
+              <w:t>Property Ownership Type</w:t>
+            </w:r>
+          </w:p>
+        </w:tc>
+        <w:tc>
+          <w:tcPr>
+            <w:tcW w:type="dxa" w:w="4536"/>
+          </w:tcPr>
+          <w:p>
+            <w:r>
+              <w:rPr>
+                <w:sz w:val="19"/>
+              </w:rPr>
+              <w:t>{{ ownership_type }}</w:t>
+            </w:r>
+          </w:p>
+        </w:tc>
+      </w:tr>
+      <w:tr>
+        <w:tc>
+          <w:tcPr>
+            <w:tcW w:type="dxa" w:w="4536"/>
+          </w:tcPr>
+          <w:p>
+            <w:r>
+              <w:rPr>
+                <w:sz w:val="19"/>
+              </w:rPr>
+              <w:t>Hold Type</w:t>
+            </w:r>
+          </w:p>
+        </w:tc>
+        <w:tc>
+          <w:tcPr>
+            <w:tcW w:type="dxa" w:w="4536"/>
+          </w:tcPr>
+          <w:p>
+            <w:r>
+              <w:rPr>
+                <w:sz w:val="19"/>
+              </w:rPr>
+              <w:t>{{ hold_type }}</w:t>
             </w:r>
           </w:p>
         </w:tc>
@@ -5527,16 +6728,17 @@
         <w:tblLook w:firstColumn="1" w:firstRow="1" w:lastColumn="0" w:lastRow="0" w:noHBand="0" w:noVBand="1" w:val="04A0"/>
       </w:tblPr>
       <w:tblGrid>
-        <w:gridCol w:w="1814"/>
-        <w:gridCol w:w="1814"/>
-        <w:gridCol w:w="1814"/>
-        <w:gridCol w:w="1814"/>
-        <w:gridCol w:w="1814"/>
+        <w:gridCol w:w="1512"/>
+        <w:gridCol w:w="1512"/>
+        <w:gridCol w:w="1512"/>
+        <w:gridCol w:w="1512"/>
+        <w:gridCol w:w="1512"/>
+        <w:gridCol w:w="1512"/>
       </w:tblGrid>
       <w:tr>
         <w:tc>
           <w:tcPr>
-            <w:tcW w:type="dxa" w:w="1814"/>
+            <w:tcW w:type="dxa" w:w="792"/>
             <w:shd w:val="clear" w:color="auto" w:fill="1F3A2E"/>
           </w:tcPr>
           <w:p>
@@ -5552,7 +6754,7 @@
         </w:tc>
         <w:tc>
           <w:tcPr>
-            <w:tcW w:type="dxa" w:w="1814"/>
+            <w:tcW w:type="dxa" w:w="1440"/>
             <w:shd w:val="clear" w:color="auto" w:fill="1F3A2E"/>
           </w:tcPr>
           <w:p>
@@ -5568,7 +6770,7 @@
         </w:tc>
         <w:tc>
           <w:tcPr>
-            <w:tcW w:type="dxa" w:w="1814"/>
+            <w:tcW w:type="dxa" w:w="1440"/>
             <w:shd w:val="clear" w:color="auto" w:fill="1F3A2E"/>
           </w:tcPr>
           <w:p>
@@ -5584,7 +6786,7 @@
         </w:tc>
         <w:tc>
           <w:tcPr>
-            <w:tcW w:type="dxa" w:w="1814"/>
+            <w:tcW w:type="dxa" w:w="1440"/>
             <w:shd w:val="clear" w:color="auto" w:fill="1F3A2E"/>
           </w:tcPr>
           <w:p>
@@ -5600,7 +6802,7 @@
         </w:tc>
         <w:tc>
           <w:tcPr>
-            <w:tcW w:type="dxa" w:w="1814"/>
+            <w:tcW w:type="dxa" w:w="1440"/>
             <w:shd w:val="clear" w:color="auto" w:fill="1F3A2E"/>
           </w:tcPr>
           <w:p>
@@ -5614,16 +6816,32 @@
             </w:r>
           </w:p>
         </w:tc>
+        <w:tc>
+          <w:tcPr>
+            <w:tcW w:type="dxa" w:w="2376"/>
+            <w:shd w:val="clear" w:color="auto" w:fill="1F3A2E"/>
+          </w:tcPr>
+          <w:p>
+            <w:r>
+              <w:rPr>
+                <w:b/>
+                <w:color w:val="FFFFFF"/>
+                <w:sz w:val="19"/>
+              </w:rPr>
+              <w:t>Accessibility</w:t>
+            </w:r>
+          </w:p>
+        </w:tc>
       </w:tr>
       <w:tr>
         <w:tc>
           <w:tcPr>
-            <w:tcW w:type="dxa" w:w="1814"/>
-          </w:tcPr>
-          <w:p>
-            <w:r>
-              <w:rPr>
-                <w:sz w:val="19"/>
+            <w:tcW w:type="dxa" w:w="792"/>
+          </w:tcPr>
+          <w:p>
+            <w:r>
+              <w:rPr>
+                <w:sz w:val="18"/>
               </w:rPr>
               <w:t>{{ plot_no }}</w:t>
             </w:r>
@@ -5631,12 +6849,12 @@
         </w:tc>
         <w:tc>
           <w:tcPr>
-            <w:tcW w:type="dxa" w:w="1814"/>
-          </w:tcPr>
-          <w:p>
-            <w:r>
-              <w:rPr>
-                <w:sz w:val="19"/>
+            <w:tcW w:type="dxa" w:w="1440"/>
+          </w:tcPr>
+          <w:p>
+            <w:r>
+              <w:rPr>
+                <w:sz w:val="18"/>
               </w:rPr>
               <w:t>{{ east_boundary }}</w:t>
             </w:r>
@@ -5644,12 +6862,12 @@
         </w:tc>
         <w:tc>
           <w:tcPr>
-            <w:tcW w:type="dxa" w:w="1814"/>
-          </w:tcPr>
-          <w:p>
-            <w:r>
-              <w:rPr>
-                <w:sz w:val="19"/>
+            <w:tcW w:type="dxa" w:w="1440"/>
+          </w:tcPr>
+          <w:p>
+            <w:r>
+              <w:rPr>
+                <w:sz w:val="18"/>
               </w:rPr>
               <w:t>{{ west_boundary }}</w:t>
             </w:r>
@@ -5657,12 +6875,12 @@
         </w:tc>
         <w:tc>
           <w:tcPr>
-            <w:tcW w:type="dxa" w:w="1814"/>
-          </w:tcPr>
-          <w:p>
-            <w:r>
-              <w:rPr>
-                <w:sz w:val="19"/>
+            <w:tcW w:type="dxa" w:w="1440"/>
+          </w:tcPr>
+          <w:p>
+            <w:r>
+              <w:rPr>
+                <w:sz w:val="18"/>
               </w:rPr>
               <w:t>{{ north_boundary }}</w:t>
             </w:r>
@@ -5670,37 +6888,32 @@
         </w:tc>
         <w:tc>
           <w:tcPr>
-            <w:tcW w:type="dxa" w:w="1814"/>
-          </w:tcPr>
-          <w:p>
-            <w:r>
-              <w:rPr>
-                <w:sz w:val="19"/>
+            <w:tcW w:type="dxa" w:w="1440"/>
+          </w:tcPr>
+          <w:p>
+            <w:r>
+              <w:rPr>
+                <w:sz w:val="18"/>
               </w:rPr>
               <w:t>{{ south_boundary }}</w:t>
+            </w:r>
+          </w:p>
+        </w:tc>
+        <w:tc>
+          <w:tcPr>
+            <w:tcW w:type="dxa" w:w="2376"/>
+          </w:tcPr>
+          <w:p>
+            <w:r>
+              <w:rPr>
+                <w:sz w:val="18"/>
+              </w:rPr>
+              <w:t>{{ accessibility_text }}</w:t>
             </w:r>
           </w:p>
         </w:tc>
       </w:tr>
     </w:tbl>
-    <w:p>
-      <w:pPr>
-        <w:spacing w:before="120" w:after="0"/>
-      </w:pPr>
-    </w:p>
-    <w:p>
-      <w:pPr>
-        <w:spacing w:before="0" w:after="0"/>
-      </w:pPr>
-      <w:r>
-        <w:rPr>
-          <w:b w:val="0"/>
-          <w:i w:val="0"/>
-          <w:sz w:val="20"/>
-        </w:rPr>
-        <w:t>{{ summary_remarks }}</w:t>
-      </w:r>
-    </w:p>
     <w:p>
       <w:pPr>
         <w:spacing w:before="120" w:after="0"/>
@@ -5726,9 +6939,10 @@
         <w:tblLook w:firstColumn="1" w:firstRow="1" w:lastColumn="0" w:lastRow="0" w:noHBand="0" w:noVBand="1" w:val="04A0"/>
       </w:tblPr>
       <w:tblGrid>
-        <w:gridCol w:w="3024"/>
-        <w:gridCol w:w="3024"/>
-        <w:gridCol w:w="3024"/>
+        <w:gridCol w:w="2268"/>
+        <w:gridCol w:w="2268"/>
+        <w:gridCol w:w="2268"/>
+        <w:gridCol w:w="2268"/>
       </w:tblGrid>
       <w:tr>
         <w:tc>
@@ -5749,7 +6963,7 @@
         </w:tc>
         <w:tc>
           <w:tcPr>
-            <w:tcW w:type="dxa" w:w="3456"/>
+            <w:tcW w:type="dxa" w:w="2592"/>
             <w:shd w:val="clear" w:color="auto" w:fill="1F3A2E"/>
           </w:tcPr>
           <w:p>
@@ -5765,7 +6979,7 @@
         </w:tc>
         <w:tc>
           <w:tcPr>
-            <w:tcW w:type="dxa" w:w="2880"/>
+            <w:tcW w:type="dxa" w:w="2592"/>
             <w:shd w:val="clear" w:color="auto" w:fill="1F3A2E"/>
           </w:tcPr>
           <w:p>
@@ -5775,6 +6989,22 @@
                 <w:color w:val="FFFFFF"/>
                 <w:sz w:val="19"/>
               </w:rPr>
+              <w:t>Market Value (NRs.)</w:t>
+            </w:r>
+          </w:p>
+        </w:tc>
+        <w:tc>
+          <w:tcPr>
+            <w:tcW w:type="dxa" w:w="2592"/>
+            <w:shd w:val="clear" w:color="auto" w:fill="1F3A2E"/>
+          </w:tcPr>
+          <w:p>
+            <w:r>
+              <w:rPr>
+                <w:b/>
+                <w:color w:val="FFFFFF"/>
+                <w:sz w:val="19"/>
+              </w:rPr>
               <w:t>Fair Market Value (NRs.)</w:t>
             </w:r>
           </w:p>
@@ -5783,7 +7013,7 @@
       <w:tr>
         <w:tc>
           <w:tcPr>
-            <w:tcW w:type="dxa" w:w="3024"/>
+            <w:tcW w:type="dxa" w:w="2268"/>
           </w:tcPr>
           <w:p>
             <w:r>
@@ -5796,7 +7026,7 @@
         </w:tc>
         <w:tc>
           <w:tcPr>
-            <w:tcW w:type="dxa" w:w="3024"/>
+            <w:tcW w:type="dxa" w:w="2268"/>
           </w:tcPr>
           <w:p>
             <w:r>
@@ -5809,7 +7039,20 @@
         </w:tc>
         <w:tc>
           <w:tcPr>
-            <w:tcW w:type="dxa" w:w="3024"/>
+            <w:tcW w:type="dxa" w:w="2268"/>
+          </w:tcPr>
+          <w:p>
+            <w:r>
+              <w:rPr>
+                <w:sz w:val="19"/>
+              </w:rPr>
+              <w:t>{{ market_land_value }}</w:t>
+            </w:r>
+          </w:p>
+        </w:tc>
+        <w:tc>
+          <w:tcPr>
+            <w:tcW w:type="dxa" w:w="2268"/>
           </w:tcPr>
           <w:p>
             <w:r>
@@ -5824,7 +7067,7 @@
       <w:tr>
         <w:tc>
           <w:tcPr>
-            <w:tcW w:type="dxa" w:w="3024"/>
+            <w:tcW w:type="dxa" w:w="2268"/>
           </w:tcPr>
           <w:p>
             <w:r>
@@ -5837,7 +7080,7 @@
         </w:tc>
         <w:tc>
           <w:tcPr>
-            <w:tcW w:type="dxa" w:w="3024"/>
+            <w:tcW w:type="dxa" w:w="2268"/>
           </w:tcPr>
           <w:p>
             <w:r>
@@ -5850,7 +7093,20 @@
         </w:tc>
         <w:tc>
           <w:tcPr>
-            <w:tcW w:type="dxa" w:w="3024"/>
+            <w:tcW w:type="dxa" w:w="2268"/>
+          </w:tcPr>
+          <w:p>
+            <w:r>
+              <w:rPr>
+                <w:sz w:val="19"/>
+              </w:rPr>
+              <w:t>{{ fair_market_value_building }}</w:t>
+            </w:r>
+          </w:p>
+        </w:tc>
+        <w:tc>
+          <w:tcPr>
+            <w:tcW w:type="dxa" w:w="2268"/>
           </w:tcPr>
           <w:p>
             <w:r>
@@ -5865,19 +7121,19 @@
       <w:tr>
         <w:tc>
           <w:tcPr>
-            <w:tcW w:type="dxa" w:w="3024"/>
-          </w:tcPr>
-          <w:p>
-            <w:r>
-              <w:rPr>
-                <w:sz w:val="19"/>
-              </w:rPr>
-            </w:r>
-          </w:p>
-        </w:tc>
-        <w:tc>
-          <w:tcPr>
-            <w:tcW w:type="dxa" w:w="3024"/>
+            <w:tcW w:type="dxa" w:w="2268"/>
+          </w:tcPr>
+          <w:p>
+            <w:r>
+              <w:rPr>
+                <w:sz w:val="19"/>
+              </w:rPr>
+            </w:r>
+          </w:p>
+        </w:tc>
+        <w:tc>
+          <w:tcPr>
+            <w:tcW w:type="dxa" w:w="2268"/>
           </w:tcPr>
           <w:p>
             <w:r>
@@ -5890,7 +7146,20 @@
         </w:tc>
         <w:tc>
           <w:tcPr>
-            <w:tcW w:type="dxa" w:w="3024"/>
+            <w:tcW w:type="dxa" w:w="2268"/>
+          </w:tcPr>
+          <w:p>
+            <w:r>
+              <w:rPr>
+                <w:sz w:val="19"/>
+              </w:rPr>
+              <w:t>{{ market_land_value }}</w:t>
+            </w:r>
+          </w:p>
+        </w:tc>
+        <w:tc>
+          <w:tcPr>
+            <w:tcW w:type="dxa" w:w="2268"/>
           </w:tcPr>
           <w:p>
             <w:r>
@@ -5905,7 +7174,25 @@
     </w:tbl>
     <w:p>
       <w:pPr>
-        <w:spacing w:before="120" w:after="40"/>
+        <w:spacing w:before="120" w:after="0"/>
+      </w:pPr>
+    </w:p>
+    <w:p>
+      <w:pPr>
+        <w:spacing w:before="0" w:after="60"/>
+      </w:pPr>
+      <w:r>
+        <w:rPr>
+          <w:b/>
+          <w:i w:val="0"/>
+          <w:sz w:val="20"/>
+        </w:rPr>
+        <w:t>Access Road</w:t>
+      </w:r>
+    </w:p>
+    <w:p>
+      <w:pPr>
+        <w:spacing w:before="0" w:after="40"/>
       </w:pPr>
       <w:r>
         <w:rPr>
@@ -5913,7 +7200,124 @@
           <w:i w:val="0"/>
           <w:sz w:val="20"/>
         </w:rPr>
-        <w:t xml:space="preserve">On the basis of the details provided by Client and Field verification, Fair Market Value of property to be mortgaged is valued NRs. </w:t>
+        <w:t>Type: {{ road_access }}</w:t>
+      </w:r>
+    </w:p>
+    <w:p>
+      <w:pPr>
+        <w:spacing w:before="80" w:after="40"/>
+      </w:pPr>
+      <w:r>
+        <w:rPr>
+          <w:b/>
+          <w:i w:val="0"/>
+          <w:sz w:val="20"/>
+        </w:rPr>
+        <w:t xml:space="preserve">GPS Co-ordinate: </w:t>
+      </w:r>
+      <w:r>
+        <w:rPr>
+          <w:b w:val="0"/>
+          <w:i w:val="0"/>
+          <w:sz w:val="20"/>
+        </w:rPr>
+        <w:t>{{ gps_coordinates }}</w:t>
+      </w:r>
+    </w:p>
+    <w:p>
+      <w:pPr>
+        <w:spacing w:before="120" w:after="0"/>
+      </w:pPr>
+    </w:p>
+    <w:p>
+      <w:pPr>
+        <w:spacing w:before="0" w:after="60"/>
+      </w:pPr>
+      <w:r>
+        <w:rPr>
+          <w:b/>
+          <w:i w:val="0"/>
+          <w:sz w:val="20"/>
+        </w:rPr>
+        <w:t>Remarks:</w:t>
+      </w:r>
+    </w:p>
+    <w:p>
+      <w:pPr>
+        <w:spacing w:before="0" w:after="40"/>
+      </w:pPr>
+      <w:r>
+        <w:rPr>
+          <w:b w:val="0"/>
+          <w:i w:val="0"/>
+          <w:sz w:val="20"/>
+        </w:rPr>
+        <w:t>{{ merit_1 }}</w:t>
+      </w:r>
+    </w:p>
+    <w:p>
+      <w:pPr>
+        <w:spacing w:before="0" w:after="40"/>
+      </w:pPr>
+      <w:r>
+        <w:rPr>
+          <w:b w:val="0"/>
+          <w:i w:val="0"/>
+          <w:sz w:val="20"/>
+        </w:rPr>
+        <w:t>{{ merit_2 }}</w:t>
+      </w:r>
+    </w:p>
+    <w:p>
+      <w:pPr>
+        <w:spacing w:before="0" w:after="40"/>
+      </w:pPr>
+      <w:r>
+        <w:rPr>
+          <w:b w:val="0"/>
+          <w:i w:val="0"/>
+          <w:sz w:val="20"/>
+        </w:rPr>
+        <w:t>{{ merit_3 }}</w:t>
+      </w:r>
+    </w:p>
+    <w:p>
+      <w:pPr>
+        <w:spacing w:before="0" w:after="40"/>
+      </w:pPr>
+      <w:r>
+        <w:rPr>
+          <w:b w:val="0"/>
+          <w:i w:val="0"/>
+          <w:sz w:val="20"/>
+        </w:rPr>
+        <w:t>{{ merit_4 }}</w:t>
+      </w:r>
+    </w:p>
+    <w:p>
+      <w:pPr>
+        <w:spacing w:before="0" w:after="40"/>
+      </w:pPr>
+      <w:r>
+        <w:rPr>
+          <w:b w:val="0"/>
+          <w:i w:val="0"/>
+          <w:sz w:val="20"/>
+        </w:rPr>
+        <w:t>{{ merit_5 }}</w:t>
+      </w:r>
+    </w:p>
+    <w:p>
+      <w:pPr>
+        <w:spacing w:before="120" w:after="40"/>
+      </w:pPr>
+      <w:r>
+        <w:rPr>
+          <w:b/>
+          <w:i w:val="0"/>
+          <w:sz w:val="20"/>
+        </w:rPr>
+        <w:t xml:space="preserve">Fair Market Value of Property (NRs.): </w:t>
       </w:r>
       <w:r>
         <w:rPr>
@@ -5922,14 +7326,6 @@
           <w:sz w:val="20"/>
         </w:rPr>
         <w:t>{{ fair_market_value }}</w:t>
-      </w:r>
-      <w:r>
-        <w:rPr>
-          <w:b w:val="0"/>
-          <w:i w:val="0"/>
-          <w:sz w:val="20"/>
-        </w:rPr>
-        <w:t>.</w:t>
       </w:r>
     </w:p>
     <w:p>
@@ -6122,16 +7518,17 @@
         <w:tblLook w:firstColumn="1" w:firstRow="1" w:lastColumn="0" w:lastRow="0" w:noHBand="0" w:noVBand="1" w:val="04A0"/>
       </w:tblPr>
       <w:tblGrid>
-        <w:gridCol w:w="1814"/>
-        <w:gridCol w:w="1814"/>
-        <w:gridCol w:w="1814"/>
-        <w:gridCol w:w="1814"/>
-        <w:gridCol w:w="1814"/>
+        <w:gridCol w:w="1512"/>
+        <w:gridCol w:w="1512"/>
+        <w:gridCol w:w="1512"/>
+        <w:gridCol w:w="1512"/>
+        <w:gridCol w:w="1512"/>
+        <w:gridCol w:w="1512"/>
       </w:tblGrid>
       <w:tr>
         <w:tc>
           <w:tcPr>
-            <w:tcW w:type="dxa" w:w="576"/>
+            <w:tcW w:type="dxa" w:w="504"/>
             <w:shd w:val="clear" w:color="auto" w:fill="1F3A2E"/>
           </w:tcPr>
           <w:p>
@@ -6147,7 +7544,7 @@
         </w:tc>
         <w:tc>
           <w:tcPr>
-            <w:tcW w:type="dxa" w:w="2880"/>
+            <w:tcW w:type="dxa" w:w="2448"/>
             <w:shd w:val="clear" w:color="auto" w:fill="1F3A2E"/>
           </w:tcPr>
           <w:p>
@@ -6163,7 +7560,7 @@
         </w:tc>
         <w:tc>
           <w:tcPr>
-            <w:tcW w:type="dxa" w:w="1296"/>
+            <w:tcW w:type="dxa" w:w="864"/>
             <w:shd w:val="clear" w:color="auto" w:fill="1F3A2E"/>
           </w:tcPr>
           <w:p>
@@ -6173,7 +7570,39 @@
                 <w:color w:val="FFFFFF"/>
                 <w:sz w:val="19"/>
               </w:rPr>
+              <w:t>Plot No.</w:t>
+            </w:r>
+          </w:p>
+        </w:tc>
+        <w:tc>
+          <w:tcPr>
+            <w:tcW w:type="dxa" w:w="1080"/>
+            <w:shd w:val="clear" w:color="auto" w:fill="1F3A2E"/>
+          </w:tcPr>
+          <w:p>
+            <w:r>
+              <w:rPr>
+                <w:b/>
+                <w:color w:val="FFFFFF"/>
+                <w:sz w:val="19"/>
+              </w:rPr>
               <w:t>Area (Aana)</w:t>
+            </w:r>
+          </w:p>
+        </w:tc>
+        <w:tc>
+          <w:tcPr>
+            <w:tcW w:type="dxa" w:w="1872"/>
+            <w:shd w:val="clear" w:color="auto" w:fill="1F3A2E"/>
+          </w:tcPr>
+          <w:p>
+            <w:r>
+              <w:rPr>
+                <w:b/>
+                <w:color w:val="FFFFFF"/>
+                <w:sz w:val="19"/>
+              </w:rPr>
+              <w:t>Rate per Aana (NRs.)</w:t>
             </w:r>
           </w:p>
         </w:tc>
@@ -6189,22 +7618,6 @@
                 <w:color w:val="FFFFFF"/>
                 <w:sz w:val="19"/>
               </w:rPr>
-              <w:t>Rate per Aana (NRs.)</w:t>
-            </w:r>
-          </w:p>
-        </w:tc>
-        <w:tc>
-          <w:tcPr>
-            <w:tcW w:type="dxa" w:w="2160"/>
-            <w:shd w:val="clear" w:color="auto" w:fill="1F3A2E"/>
-          </w:tcPr>
-          <w:p>
-            <w:r>
-              <w:rPr>
-                <w:b/>
-                <w:color w:val="FFFFFF"/>
-                <w:sz w:val="19"/>
-              </w:rPr>
               <w:t>Amount (NRs.)</w:t>
             </w:r>
           </w:p>
@@ -6213,7 +7626,7 @@
       <w:tr>
         <w:tc>
           <w:tcPr>
-            <w:tcW w:type="dxa" w:w="1814"/>
+            <w:tcW w:type="dxa" w:w="1512"/>
           </w:tcPr>
           <w:p>
             <w:r>
@@ -6226,7 +7639,7 @@
         </w:tc>
         <w:tc>
           <w:tcPr>
-            <w:tcW w:type="dxa" w:w="1814"/>
+            <w:tcW w:type="dxa" w:w="1512"/>
           </w:tcPr>
           <w:p>
             <w:r>
@@ -6239,7 +7652,20 @@
         </w:tc>
         <w:tc>
           <w:tcPr>
-            <w:tcW w:type="dxa" w:w="1814"/>
+            <w:tcW w:type="dxa" w:w="1512"/>
+          </w:tcPr>
+          <w:p>
+            <w:r>
+              <w:rPr>
+                <w:sz w:val="19"/>
+              </w:rPr>
+              <w:t>{{ plot_no }}</w:t>
+            </w:r>
+          </w:p>
+        </w:tc>
+        <w:tc>
+          <w:tcPr>
+            <w:tcW w:type="dxa" w:w="1512"/>
           </w:tcPr>
           <w:p>
             <w:r>
@@ -6252,7 +7678,7 @@
         </w:tc>
         <w:tc>
           <w:tcPr>
-            <w:tcW w:type="dxa" w:w="1814"/>
+            <w:tcW w:type="dxa" w:w="1512"/>
           </w:tcPr>
           <w:p>
             <w:r>
@@ -6265,7 +7691,7 @@
         </w:tc>
         <w:tc>
           <w:tcPr>
-            <w:tcW w:type="dxa" w:w="1814"/>
+            <w:tcW w:type="dxa" w:w="1512"/>
           </w:tcPr>
           <w:p>
             <w:r>
@@ -6280,7 +7706,7 @@
       <w:tr>
         <w:tc>
           <w:tcPr>
-            <w:tcW w:type="dxa" w:w="1814"/>
+            <w:tcW w:type="dxa" w:w="1512"/>
           </w:tcPr>
           <w:p>
             <w:r>
@@ -6293,7 +7719,7 @@
         </w:tc>
         <w:tc>
           <w:tcPr>
-            <w:tcW w:type="dxa" w:w="1814"/>
+            <w:tcW w:type="dxa" w:w="1512"/>
           </w:tcPr>
           <w:p>
             <w:r>
@@ -6306,7 +7732,19 @@
         </w:tc>
         <w:tc>
           <w:tcPr>
-            <w:tcW w:type="dxa" w:w="1814"/>
+            <w:tcW w:type="dxa" w:w="1512"/>
+          </w:tcPr>
+          <w:p>
+            <w:r>
+              <w:rPr>
+                <w:sz w:val="19"/>
+              </w:rPr>
+            </w:r>
+          </w:p>
+        </w:tc>
+        <w:tc>
+          <w:tcPr>
+            <w:tcW w:type="dxa" w:w="1512"/>
           </w:tcPr>
           <w:p>
             <w:r>
@@ -6319,7 +7757,7 @@
         </w:tc>
         <w:tc>
           <w:tcPr>
-            <w:tcW w:type="dxa" w:w="1814"/>
+            <w:tcW w:type="dxa" w:w="1512"/>
           </w:tcPr>
           <w:p>
             <w:r>
@@ -6332,7 +7770,7 @@
         </w:tc>
         <w:tc>
           <w:tcPr>
-            <w:tcW w:type="dxa" w:w="1814"/>
+            <w:tcW w:type="dxa" w:w="1512"/>
           </w:tcPr>
           <w:p>
             <w:r>
@@ -6347,56 +7785,69 @@
       <w:tr>
         <w:tc>
           <w:tcPr>
-            <w:tcW w:type="dxa" w:w="1814"/>
-          </w:tcPr>
-          <w:p>
-            <w:r>
-              <w:rPr>
-                <w:sz w:val="19"/>
-              </w:rPr>
-            </w:r>
-          </w:p>
-        </w:tc>
-        <w:tc>
-          <w:tcPr>
-            <w:tcW w:type="dxa" w:w="1814"/>
-          </w:tcPr>
-          <w:p>
-            <w:r>
-              <w:rPr>
-                <w:sz w:val="19"/>
-              </w:rPr>
-              <w:t>Fair Market Value of Land (50% Govt + 50% Market)</w:t>
-            </w:r>
-          </w:p>
-        </w:tc>
-        <w:tc>
-          <w:tcPr>
-            <w:tcW w:type="dxa" w:w="1814"/>
-          </w:tcPr>
-          <w:p>
-            <w:r>
-              <w:rPr>
-                <w:sz w:val="19"/>
-              </w:rPr>
-            </w:r>
-          </w:p>
-        </w:tc>
-        <w:tc>
-          <w:tcPr>
-            <w:tcW w:type="dxa" w:w="1814"/>
-          </w:tcPr>
-          <w:p>
-            <w:r>
-              <w:rPr>
-                <w:sz w:val="19"/>
-              </w:rPr>
-            </w:r>
-          </w:p>
-        </w:tc>
-        <w:tc>
-          <w:tcPr>
-            <w:tcW w:type="dxa" w:w="1814"/>
+            <w:tcW w:type="dxa" w:w="1512"/>
+          </w:tcPr>
+          <w:p>
+            <w:r>
+              <w:rPr>
+                <w:sz w:val="19"/>
+              </w:rPr>
+            </w:r>
+          </w:p>
+        </w:tc>
+        <w:tc>
+          <w:tcPr>
+            <w:tcW w:type="dxa" w:w="1512"/>
+          </w:tcPr>
+          <w:p>
+            <w:r>
+              <w:rPr>
+                <w:sz w:val="19"/>
+              </w:rPr>
+              <w:t>Fair Market Value of Land</w:t>
+            </w:r>
+          </w:p>
+        </w:tc>
+        <w:tc>
+          <w:tcPr>
+            <w:tcW w:type="dxa" w:w="1512"/>
+          </w:tcPr>
+          <w:p>
+            <w:r>
+              <w:rPr>
+                <w:sz w:val="19"/>
+              </w:rPr>
+            </w:r>
+          </w:p>
+        </w:tc>
+        <w:tc>
+          <w:tcPr>
+            <w:tcW w:type="dxa" w:w="1512"/>
+          </w:tcPr>
+          <w:p>
+            <w:r>
+              <w:rPr>
+                <w:sz w:val="19"/>
+              </w:rPr>
+            </w:r>
+          </w:p>
+        </w:tc>
+        <w:tc>
+          <w:tcPr>
+            <w:tcW w:type="dxa" w:w="1512"/>
+          </w:tcPr>
+          <w:p>
+            <w:r>
+              <w:rPr>
+                <w:sz w:val="19"/>
+              </w:rPr>
+              <w:t>Sum of 50% S.N.1 &amp; 50% S.N.2</w:t>
+            </w:r>
+          </w:p>
+        </w:tc>
+        <w:tc>
+          <w:tcPr>
+            <w:tcW w:type="dxa" w:w="1512"/>
           </w:tcPr>
           <w:p>
             <w:r>
@@ -6411,44 +7862,56 @@
       <w:tr>
         <w:tc>
           <w:tcPr>
-            <w:tcW w:type="dxa" w:w="1814"/>
-          </w:tcPr>
-          <w:p>
-            <w:r>
-              <w:rPr>
-                <w:sz w:val="19"/>
-              </w:rPr>
-            </w:r>
-          </w:p>
-        </w:tc>
-        <w:tc>
-          <w:tcPr>
-            <w:tcW w:type="dxa" w:w="1814"/>
-          </w:tcPr>
-          <w:p>
-            <w:r>
-              <w:rPr>
-                <w:sz w:val="19"/>
-              </w:rPr>
-              <w:t>Average FMV Rate per Aana</w:t>
-            </w:r>
-          </w:p>
-        </w:tc>
-        <w:tc>
-          <w:tcPr>
-            <w:tcW w:type="dxa" w:w="1814"/>
-          </w:tcPr>
-          <w:p>
-            <w:r>
-              <w:rPr>
-                <w:sz w:val="19"/>
-              </w:rPr>
-            </w:r>
-          </w:p>
-        </w:tc>
-        <w:tc>
-          <w:tcPr>
-            <w:tcW w:type="dxa" w:w="1814"/>
+            <w:tcW w:type="dxa" w:w="1512"/>
+          </w:tcPr>
+          <w:p>
+            <w:r>
+              <w:rPr>
+                <w:sz w:val="19"/>
+              </w:rPr>
+            </w:r>
+          </w:p>
+        </w:tc>
+        <w:tc>
+          <w:tcPr>
+            <w:tcW w:type="dxa" w:w="1512"/>
+          </w:tcPr>
+          <w:p>
+            <w:r>
+              <w:rPr>
+                <w:sz w:val="19"/>
+              </w:rPr>
+              <w:t>Average Rate of Land per Aana (50% Govt + 50% Market)</w:t>
+            </w:r>
+          </w:p>
+        </w:tc>
+        <w:tc>
+          <w:tcPr>
+            <w:tcW w:type="dxa" w:w="1512"/>
+          </w:tcPr>
+          <w:p>
+            <w:r>
+              <w:rPr>
+                <w:sz w:val="19"/>
+              </w:rPr>
+            </w:r>
+          </w:p>
+        </w:tc>
+        <w:tc>
+          <w:tcPr>
+            <w:tcW w:type="dxa" w:w="1512"/>
+          </w:tcPr>
+          <w:p>
+            <w:r>
+              <w:rPr>
+                <w:sz w:val="19"/>
+              </w:rPr>
+            </w:r>
+          </w:p>
+        </w:tc>
+        <w:tc>
+          <w:tcPr>
+            <w:tcW w:type="dxa" w:w="1512"/>
           </w:tcPr>
           <w:p>
             <w:r>
@@ -6461,7 +7924,7 @@
         </w:tc>
         <w:tc>
           <w:tcPr>
-            <w:tcW w:type="dxa" w:w="1814"/>
+            <w:tcW w:type="dxa" w:w="1512"/>
           </w:tcPr>
           <w:p>
             <w:r>
@@ -6475,12 +7938,65 @@
     </w:tbl>
     <w:p>
       <w:pPr>
-        <w:spacing w:before="120" w:after="0"/>
+        <w:spacing w:before="80" w:after="0"/>
       </w:pPr>
     </w:p>
     <w:p>
       <w:pPr>
+        <w:spacing w:before="0" w:after="0"/>
+      </w:pPr>
+      <w:r>
+        <w:rPr>
+          <w:b w:val="0"/>
+          <w:i w:val="0"/>
+          <w:sz w:val="18"/>
+        </w:rPr>
+        <w:t>50% Of Government Value Of Land  :  {{ govt_land_value }}</w:t>
+      </w:r>
+    </w:p>
+    <w:p>
+      <w:pPr>
+        <w:spacing w:before="0" w:after="0"/>
+      </w:pPr>
+      <w:r>
+        <w:rPr>
+          <w:b w:val="0"/>
+          <w:i w:val="0"/>
+          <w:sz w:val="18"/>
+        </w:rPr>
+        <w:t>50% Of Market Value Of Land       :  {{ market_land_value }}</w:t>
+      </w:r>
+    </w:p>
+    <w:p>
+      <w:pPr>
+        <w:spacing w:before="0" w:after="40"/>
+      </w:pPr>
+      <w:r>
+        <w:rPr>
+          <w:b w:val="0"/>
+          <w:i w:val="0"/>
+          <w:sz w:val="18"/>
+        </w:rPr>
+        <w:t xml:space="preserve">Total Fair Market Value Of Land  :  </w:t>
+      </w:r>
+      <w:r>
+        <w:rPr>
+          <w:b/>
+          <w:i w:val="0"/>
+          <w:sz w:val="18"/>
+        </w:rPr>
+        <w:t>{{ fair_market_value_land }}</w:t>
+      </w:r>
+    </w:p>
+    <w:p>
+      <w:pPr>
+        <w:spacing w:before="120" w:after="0"/>
+      </w:pPr>
+    </w:p>
+    <w:p>
+      <w:pPr>
         <w:spacing w:before="0" w:after="80"/>
+        <w:jc w:val="center"/>
       </w:pPr>
       <w:r>
         <w:rPr>
@@ -6498,15 +8014,16 @@
         <w:tblLook w:firstColumn="1" w:firstRow="1" w:lastColumn="0" w:lastRow="0" w:noHBand="0" w:noVBand="1" w:val="04A0"/>
       </w:tblPr>
       <w:tblGrid>
-        <w:gridCol w:w="2268"/>
-        <w:gridCol w:w="2268"/>
-        <w:gridCol w:w="2268"/>
-        <w:gridCol w:w="2268"/>
+        <w:gridCol w:w="1814"/>
+        <w:gridCol w:w="1814"/>
+        <w:gridCol w:w="1814"/>
+        <w:gridCol w:w="1814"/>
+        <w:gridCol w:w="1814"/>
       </w:tblGrid>
       <w:tr>
         <w:tc>
           <w:tcPr>
-            <w:tcW w:type="dxa" w:w="576"/>
+            <w:tcW w:type="dxa" w:w="504"/>
             <w:shd w:val="clear" w:color="auto" w:fill="1F3A2E"/>
           </w:tcPr>
           <w:p>
@@ -6522,7 +8039,7 @@
         </w:tc>
         <w:tc>
           <w:tcPr>
-            <w:tcW w:type="dxa" w:w="2592"/>
+            <w:tcW w:type="dxa" w:w="2376"/>
             <w:shd w:val="clear" w:color="auto" w:fill="1F3A2E"/>
           </w:tcPr>
           <w:p>
@@ -6538,7 +8055,7 @@
         </w:tc>
         <w:tc>
           <w:tcPr>
-            <w:tcW w:type="dxa" w:w="2880"/>
+            <w:tcW w:type="dxa" w:w="2160"/>
             <w:shd w:val="clear" w:color="auto" w:fill="1F3A2E"/>
           </w:tcPr>
           <w:p>
@@ -6554,7 +8071,7 @@
         </w:tc>
         <w:tc>
           <w:tcPr>
-            <w:tcW w:type="dxa" w:w="2880"/>
+            <w:tcW w:type="dxa" w:w="2160"/>
             <w:shd w:val="clear" w:color="auto" w:fill="1F3A2E"/>
           </w:tcPr>
           <w:p>
@@ -6568,11 +8085,27 @@
             </w:r>
           </w:p>
         </w:tc>
+        <w:tc>
+          <w:tcPr>
+            <w:tcW w:type="dxa" w:w="1728"/>
+            <w:shd w:val="clear" w:color="auto" w:fill="1F3A2E"/>
+          </w:tcPr>
+          <w:p>
+            <w:r>
+              <w:rPr>
+                <w:b/>
+                <w:color w:val="FFFFFF"/>
+                <w:sz w:val="19"/>
+              </w:rPr>
+              <w:t>Say (FMV)</w:t>
+            </w:r>
+          </w:p>
+        </w:tc>
       </w:tr>
       <w:tr>
         <w:tc>
           <w:tcPr>
-            <w:tcW w:type="dxa" w:w="2268"/>
+            <w:tcW w:type="dxa" w:w="1814"/>
           </w:tcPr>
           <w:p>
             <w:r>
@@ -6585,7 +8118,7 @@
         </w:tc>
         <w:tc>
           <w:tcPr>
-            <w:tcW w:type="dxa" w:w="2268"/>
+            <w:tcW w:type="dxa" w:w="1814"/>
           </w:tcPr>
           <w:p>
             <w:r>
@@ -6598,7 +8131,7 @@
         </w:tc>
         <w:tc>
           <w:tcPr>
-            <w:tcW w:type="dxa" w:w="2268"/>
+            <w:tcW w:type="dxa" w:w="1814"/>
           </w:tcPr>
           <w:p>
             <w:r>
@@ -6611,7 +8144,20 @@
         </w:tc>
         <w:tc>
           <w:tcPr>
-            <w:tcW w:type="dxa" w:w="2268"/>
+            <w:tcW w:type="dxa" w:w="1814"/>
+          </w:tcPr>
+          <w:p>
+            <w:r>
+              <w:rPr>
+                <w:sz w:val="19"/>
+              </w:rPr>
+              <w:t>{{ fair_market_value_land }}</w:t>
+            </w:r>
+          </w:p>
+        </w:tc>
+        <w:tc>
+          <w:tcPr>
+            <w:tcW w:type="dxa" w:w="1814"/>
           </w:tcPr>
           <w:p>
             <w:r>
@@ -6626,7 +8172,7 @@
       <w:tr>
         <w:tc>
           <w:tcPr>
-            <w:tcW w:type="dxa" w:w="2268"/>
+            <w:tcW w:type="dxa" w:w="1814"/>
           </w:tcPr>
           <w:p>
             <w:r>
@@ -6639,7 +8185,7 @@
         </w:tc>
         <w:tc>
           <w:tcPr>
-            <w:tcW w:type="dxa" w:w="2268"/>
+            <w:tcW w:type="dxa" w:w="1814"/>
           </w:tcPr>
           <w:p>
             <w:r>
@@ -6652,7 +8198,7 @@
         </w:tc>
         <w:tc>
           <w:tcPr>
-            <w:tcW w:type="dxa" w:w="2268"/>
+            <w:tcW w:type="dxa" w:w="1814"/>
           </w:tcPr>
           <w:p>
             <w:r>
@@ -6665,7 +8211,20 @@
         </w:tc>
         <w:tc>
           <w:tcPr>
-            <w:tcW w:type="dxa" w:w="2268"/>
+            <w:tcW w:type="dxa" w:w="1814"/>
+          </w:tcPr>
+          <w:p>
+            <w:r>
+              <w:rPr>
+                <w:sz w:val="19"/>
+              </w:rPr>
+              <w:t>{{ fair_market_value_building }}</w:t>
+            </w:r>
+          </w:p>
+        </w:tc>
+        <w:tc>
+          <w:tcPr>
+            <w:tcW w:type="dxa" w:w="1814"/>
           </w:tcPr>
           <w:p>
             <w:r>
@@ -6680,19 +8239,19 @@
       <w:tr>
         <w:tc>
           <w:tcPr>
-            <w:tcW w:type="dxa" w:w="2268"/>
-          </w:tcPr>
-          <w:p>
-            <w:r>
-              <w:rPr>
-                <w:sz w:val="19"/>
-              </w:rPr>
-            </w:r>
-          </w:p>
-        </w:tc>
-        <w:tc>
-          <w:tcPr>
-            <w:tcW w:type="dxa" w:w="2268"/>
+            <w:tcW w:type="dxa" w:w="1814"/>
+          </w:tcPr>
+          <w:p>
+            <w:r>
+              <w:rPr>
+                <w:sz w:val="19"/>
+              </w:rPr>
+            </w:r>
+          </w:p>
+        </w:tc>
+        <w:tc>
+          <w:tcPr>
+            <w:tcW w:type="dxa" w:w="1814"/>
           </w:tcPr>
           <w:p>
             <w:r>
@@ -6705,7 +8264,7 @@
         </w:tc>
         <w:tc>
           <w:tcPr>
-            <w:tcW w:type="dxa" w:w="2268"/>
+            <w:tcW w:type="dxa" w:w="1814"/>
           </w:tcPr>
           <w:p>
             <w:r>
@@ -6718,7 +8277,20 @@
         </w:tc>
         <w:tc>
           <w:tcPr>
-            <w:tcW w:type="dxa" w:w="2268"/>
+            <w:tcW w:type="dxa" w:w="1814"/>
+          </w:tcPr>
+          <w:p>
+            <w:r>
+              <w:rPr>
+                <w:sz w:val="19"/>
+              </w:rPr>
+              <w:t>{{ fair_market_value }}</w:t>
+            </w:r>
+          </w:p>
+        </w:tc>
+        <w:tc>
+          <w:tcPr>
+            <w:tcW w:type="dxa" w:w="1814"/>
           </w:tcPr>
           <w:p>
             <w:r>
@@ -7239,6 +8811,1299 @@
                 <w:sz w:val="20"/>
               </w:rPr>
               <w:t>Mobile No: {{ firm_phone }}</w:t>
+            </w:r>
+          </w:p>
+        </w:tc>
+      </w:tr>
+    </w:tbl>
+    <w:p>
+      <w:r>
+        <w:br w:type="page"/>
+      </w:r>
+    </w:p>
+    <w:p>
+      <w:pPr>
+        <w:spacing w:before="0" w:after="120"/>
+      </w:pPr>
+      <w:r>
+        <w:rPr>
+          <w:b/>
+          <w:i w:val="0"/>
+          <w:sz w:val="24"/>
+        </w:rPr>
+        <w:t>13. Site Measurement of the Land (Area Calculation)</w:t>
+      </w:r>
+    </w:p>
+    <w:p>
+      <w:pPr>
+        <w:spacing w:before="0" w:after="80"/>
+      </w:pPr>
+      <w:r>
+        <w:rPr>
+          <w:b/>
+          <w:i w:val="0"/>
+          <w:sz w:val="20"/>
+        </w:rPr>
+        <w:t>A. Total Land Area as per Measurement</w:t>
+      </w:r>
+    </w:p>
+    <w:tbl>
+      <w:tblPr>
+        <w:tblStyle w:val="TableGrid"/>
+        <w:tblW w:type="auto" w:w="0"/>
+        <w:tblLook w:firstColumn="1" w:firstRow="1" w:lastColumn="0" w:lastRow="0" w:noHBand="0" w:noVBand="1" w:val="04A0"/>
+      </w:tblPr>
+      <w:tblGrid>
+        <w:gridCol w:w="1296"/>
+        <w:gridCol w:w="1296"/>
+        <w:gridCol w:w="1296"/>
+        <w:gridCol w:w="1296"/>
+        <w:gridCol w:w="1296"/>
+        <w:gridCol w:w="1296"/>
+        <w:gridCol w:w="1296"/>
+      </w:tblGrid>
+      <w:tr>
+        <w:tc>
+          <w:tcPr>
+            <w:tcW w:type="dxa" w:w="1008"/>
+            <w:shd w:val="clear" w:color="auto" w:fill="1F3A2E"/>
+          </w:tcPr>
+          <w:p>
+            <w:r>
+              <w:rPr>
+                <w:b/>
+                <w:color w:val="FFFFFF"/>
+                <w:sz w:val="19"/>
+              </w:rPr>
+              <w:t>Triangle</w:t>
+            </w:r>
+          </w:p>
+        </w:tc>
+        <w:tc>
+          <w:tcPr>
+            <w:tcW w:type="dxa" w:w="1224"/>
+            <w:shd w:val="clear" w:color="auto" w:fill="1F3A2E"/>
+          </w:tcPr>
+          <w:p>
+            <w:r>
+              <w:rPr>
+                <w:b/>
+                <w:color w:val="FFFFFF"/>
+                <w:sz w:val="19"/>
+              </w:rPr>
+              <w:t>Side a (ft)</w:t>
+            </w:r>
+          </w:p>
+        </w:tc>
+        <w:tc>
+          <w:tcPr>
+            <w:tcW w:type="dxa" w:w="1224"/>
+            <w:shd w:val="clear" w:color="auto" w:fill="1F3A2E"/>
+          </w:tcPr>
+          <w:p>
+            <w:r>
+              <w:rPr>
+                <w:b/>
+                <w:color w:val="FFFFFF"/>
+                <w:sz w:val="19"/>
+              </w:rPr>
+              <w:t>Side b (ft)</w:t>
+            </w:r>
+          </w:p>
+        </w:tc>
+        <w:tc>
+          <w:tcPr>
+            <w:tcW w:type="dxa" w:w="1224"/>
+            <w:shd w:val="clear" w:color="auto" w:fill="1F3A2E"/>
+          </w:tcPr>
+          <w:p>
+            <w:r>
+              <w:rPr>
+                <w:b/>
+                <w:color w:val="FFFFFF"/>
+                <w:sz w:val="19"/>
+              </w:rPr>
+              <w:t>Side c (ft)</w:t>
+            </w:r>
+          </w:p>
+        </w:tc>
+        <w:tc>
+          <w:tcPr>
+            <w:tcW w:type="dxa" w:w="1224"/>
+            <w:shd w:val="clear" w:color="auto" w:fill="1F3A2E"/>
+          </w:tcPr>
+          <w:p>
+            <w:r>
+              <w:rPr>
+                <w:b/>
+                <w:color w:val="FFFFFF"/>
+                <w:sz w:val="19"/>
+              </w:rPr>
+              <w:t>S=(a+b+c)/2</w:t>
+            </w:r>
+          </w:p>
+        </w:tc>
+        <w:tc>
+          <w:tcPr>
+            <w:tcW w:type="dxa" w:w="1296"/>
+            <w:shd w:val="clear" w:color="auto" w:fill="1F3A2E"/>
+          </w:tcPr>
+          <w:p>
+            <w:r>
+              <w:rPr>
+                <w:b/>
+                <w:color w:val="FFFFFF"/>
+                <w:sz w:val="19"/>
+              </w:rPr>
+              <w:t>Total (Sqft)</w:t>
+            </w:r>
+          </w:p>
+        </w:tc>
+        <w:tc>
+          <w:tcPr>
+            <w:tcW w:type="dxa" w:w="1152"/>
+            <w:shd w:val="clear" w:color="auto" w:fill="1F3A2E"/>
+          </w:tcPr>
+          <w:p>
+            <w:r>
+              <w:rPr>
+                <w:b/>
+                <w:color w:val="FFFFFF"/>
+                <w:sz w:val="19"/>
+              </w:rPr>
+              <w:t>Land (Aana)</w:t>
+            </w:r>
+          </w:p>
+        </w:tc>
+      </w:tr>
+      <w:tr>
+        <w:tc>
+          <w:tcPr>
+            <w:tcW w:type="dxa" w:w="1296"/>
+          </w:tcPr>
+          <w:p>
+            <w:r>
+              <w:rPr>
+                <w:sz w:val="19"/>
+              </w:rPr>
+              <w:t>A</w:t>
+            </w:r>
+          </w:p>
+        </w:tc>
+        <w:tc>
+          <w:tcPr>
+            <w:tcW w:type="dxa" w:w="1296"/>
+          </w:tcPr>
+          <w:p>
+            <w:r>
+              <w:rPr>
+                <w:sz w:val="19"/>
+              </w:rPr>
+              <w:t>—</w:t>
+            </w:r>
+          </w:p>
+        </w:tc>
+        <w:tc>
+          <w:tcPr>
+            <w:tcW w:type="dxa" w:w="1296"/>
+          </w:tcPr>
+          <w:p>
+            <w:r>
+              <w:rPr>
+                <w:sz w:val="19"/>
+              </w:rPr>
+              <w:t>—</w:t>
+            </w:r>
+          </w:p>
+        </w:tc>
+        <w:tc>
+          <w:tcPr>
+            <w:tcW w:type="dxa" w:w="1296"/>
+          </w:tcPr>
+          <w:p>
+            <w:r>
+              <w:rPr>
+                <w:sz w:val="19"/>
+              </w:rPr>
+              <w:t>—</w:t>
+            </w:r>
+          </w:p>
+        </w:tc>
+        <w:tc>
+          <w:tcPr>
+            <w:tcW w:type="dxa" w:w="1296"/>
+          </w:tcPr>
+          <w:p>
+            <w:r>
+              <w:rPr>
+                <w:sz w:val="19"/>
+              </w:rPr>
+              <w:t>—</w:t>
+            </w:r>
+          </w:p>
+        </w:tc>
+        <w:tc>
+          <w:tcPr>
+            <w:tcW w:type="dxa" w:w="1296"/>
+          </w:tcPr>
+          <w:p>
+            <w:r>
+              <w:rPr>
+                <w:sz w:val="19"/>
+              </w:rPr>
+              <w:t>—</w:t>
+            </w:r>
+          </w:p>
+        </w:tc>
+        <w:tc>
+          <w:tcPr>
+            <w:tcW w:type="dxa" w:w="1296"/>
+          </w:tcPr>
+          <w:p>
+            <w:r>
+              <w:rPr>
+                <w:sz w:val="19"/>
+              </w:rPr>
+              <w:t>—</w:t>
+            </w:r>
+          </w:p>
+        </w:tc>
+      </w:tr>
+      <w:tr>
+        <w:tc>
+          <w:tcPr>
+            <w:tcW w:type="dxa" w:w="1296"/>
+          </w:tcPr>
+          <w:p>
+            <w:r>
+              <w:rPr>
+                <w:sz w:val="19"/>
+              </w:rPr>
+              <w:t>B</w:t>
+            </w:r>
+          </w:p>
+        </w:tc>
+        <w:tc>
+          <w:tcPr>
+            <w:tcW w:type="dxa" w:w="1296"/>
+          </w:tcPr>
+          <w:p>
+            <w:r>
+              <w:rPr>
+                <w:sz w:val="19"/>
+              </w:rPr>
+              <w:t>—</w:t>
+            </w:r>
+          </w:p>
+        </w:tc>
+        <w:tc>
+          <w:tcPr>
+            <w:tcW w:type="dxa" w:w="1296"/>
+          </w:tcPr>
+          <w:p>
+            <w:r>
+              <w:rPr>
+                <w:sz w:val="19"/>
+              </w:rPr>
+              <w:t>—</w:t>
+            </w:r>
+          </w:p>
+        </w:tc>
+        <w:tc>
+          <w:tcPr>
+            <w:tcW w:type="dxa" w:w="1296"/>
+          </w:tcPr>
+          <w:p>
+            <w:r>
+              <w:rPr>
+                <w:sz w:val="19"/>
+              </w:rPr>
+              <w:t>—</w:t>
+            </w:r>
+          </w:p>
+        </w:tc>
+        <w:tc>
+          <w:tcPr>
+            <w:tcW w:type="dxa" w:w="1296"/>
+          </w:tcPr>
+          <w:p>
+            <w:r>
+              <w:rPr>
+                <w:sz w:val="19"/>
+              </w:rPr>
+              <w:t>—</w:t>
+            </w:r>
+          </w:p>
+        </w:tc>
+        <w:tc>
+          <w:tcPr>
+            <w:tcW w:type="dxa" w:w="1296"/>
+          </w:tcPr>
+          <w:p>
+            <w:r>
+              <w:rPr>
+                <w:sz w:val="19"/>
+              </w:rPr>
+              <w:t>—</w:t>
+            </w:r>
+          </w:p>
+        </w:tc>
+        <w:tc>
+          <w:tcPr>
+            <w:tcW w:type="dxa" w:w="1296"/>
+          </w:tcPr>
+          <w:p>
+            <w:r>
+              <w:rPr>
+                <w:sz w:val="19"/>
+              </w:rPr>
+              <w:t>—</w:t>
+            </w:r>
+          </w:p>
+        </w:tc>
+      </w:tr>
+      <w:tr>
+        <w:tc>
+          <w:tcPr>
+            <w:tcW w:type="dxa" w:w="1296"/>
+          </w:tcPr>
+          <w:p>
+            <w:r>
+              <w:rPr>
+                <w:b/>
+                <w:sz w:val="19"/>
+              </w:rPr>
+              <w:t>Total</w:t>
+            </w:r>
+          </w:p>
+        </w:tc>
+        <w:tc>
+          <w:tcPr>
+            <w:tcW w:type="dxa" w:w="1296"/>
+          </w:tcPr>
+          <w:p/>
+        </w:tc>
+        <w:tc>
+          <w:tcPr>
+            <w:tcW w:type="dxa" w:w="1296"/>
+          </w:tcPr>
+          <w:p/>
+        </w:tc>
+        <w:tc>
+          <w:tcPr>
+            <w:tcW w:type="dxa" w:w="1296"/>
+          </w:tcPr>
+          <w:p/>
+        </w:tc>
+        <w:tc>
+          <w:tcPr>
+            <w:tcW w:type="dxa" w:w="1296"/>
+          </w:tcPr>
+          <w:p/>
+        </w:tc>
+        <w:tc>
+          <w:tcPr>
+            <w:tcW w:type="dxa" w:w="1296"/>
+          </w:tcPr>
+          <w:p>
+            <w:r>
+              <w:rPr>
+                <w:b/>
+                <w:sz w:val="19"/>
+              </w:rPr>
+              <w:t>{{ land_area_meas_sqft }}</w:t>
+            </w:r>
+          </w:p>
+        </w:tc>
+        <w:tc>
+          <w:tcPr>
+            <w:tcW w:type="dxa" w:w="1296"/>
+          </w:tcPr>
+          <w:p>
+            <w:r>
+              <w:rPr>
+                <w:b/>
+                <w:sz w:val="19"/>
+              </w:rPr>
+              <w:t>{{ land_area_measured }}</w:t>
+            </w:r>
+          </w:p>
+        </w:tc>
+      </w:tr>
+    </w:tbl>
+    <w:p>
+      <w:pPr>
+        <w:spacing w:before="160" w:after="0"/>
+      </w:pPr>
+    </w:p>
+    <w:p>
+      <w:pPr>
+        <w:spacing w:before="0" w:after="80"/>
+      </w:pPr>
+      <w:r>
+        <w:rPr>
+          <w:b/>
+          <w:i w:val="0"/>
+          <w:sz w:val="20"/>
+        </w:rPr>
+        <w:t>B. Total Land Area as per Measurement after Deduction</w:t>
+      </w:r>
+    </w:p>
+    <w:tbl>
+      <w:tblPr>
+        <w:tblStyle w:val="TableGrid"/>
+        <w:tblW w:type="auto" w:w="0"/>
+        <w:tblLook w:firstColumn="1" w:firstRow="1" w:lastColumn="0" w:lastRow="0" w:noHBand="0" w:noVBand="1" w:val="04A0"/>
+      </w:tblPr>
+      <w:tblGrid>
+        <w:gridCol w:w="1296"/>
+        <w:gridCol w:w="1296"/>
+        <w:gridCol w:w="1296"/>
+        <w:gridCol w:w="1296"/>
+        <w:gridCol w:w="1296"/>
+        <w:gridCol w:w="1296"/>
+        <w:gridCol w:w="1296"/>
+      </w:tblGrid>
+      <w:tr>
+        <w:tc>
+          <w:tcPr>
+            <w:tcW w:type="dxa" w:w="1008"/>
+            <w:shd w:val="clear" w:color="auto" w:fill="1F3A2E"/>
+          </w:tcPr>
+          <w:p>
+            <w:r>
+              <w:rPr>
+                <w:b/>
+                <w:color w:val="FFFFFF"/>
+                <w:sz w:val="19"/>
+              </w:rPr>
+              <w:t>Triangle</w:t>
+            </w:r>
+          </w:p>
+        </w:tc>
+        <w:tc>
+          <w:tcPr>
+            <w:tcW w:type="dxa" w:w="1224"/>
+            <w:shd w:val="clear" w:color="auto" w:fill="1F3A2E"/>
+          </w:tcPr>
+          <w:p>
+            <w:r>
+              <w:rPr>
+                <w:b/>
+                <w:color w:val="FFFFFF"/>
+                <w:sz w:val="19"/>
+              </w:rPr>
+              <w:t>Side a (ft)</w:t>
+            </w:r>
+          </w:p>
+        </w:tc>
+        <w:tc>
+          <w:tcPr>
+            <w:tcW w:type="dxa" w:w="1224"/>
+            <w:shd w:val="clear" w:color="auto" w:fill="1F3A2E"/>
+          </w:tcPr>
+          <w:p>
+            <w:r>
+              <w:rPr>
+                <w:b/>
+                <w:color w:val="FFFFFF"/>
+                <w:sz w:val="19"/>
+              </w:rPr>
+              <w:t>Side b (ft)</w:t>
+            </w:r>
+          </w:p>
+        </w:tc>
+        <w:tc>
+          <w:tcPr>
+            <w:tcW w:type="dxa" w:w="1224"/>
+            <w:shd w:val="clear" w:color="auto" w:fill="1F3A2E"/>
+          </w:tcPr>
+          <w:p>
+            <w:r>
+              <w:rPr>
+                <w:b/>
+                <w:color w:val="FFFFFF"/>
+                <w:sz w:val="19"/>
+              </w:rPr>
+              <w:t>Side c (ft)</w:t>
+            </w:r>
+          </w:p>
+        </w:tc>
+        <w:tc>
+          <w:tcPr>
+            <w:tcW w:type="dxa" w:w="1224"/>
+            <w:shd w:val="clear" w:color="auto" w:fill="1F3A2E"/>
+          </w:tcPr>
+          <w:p>
+            <w:r>
+              <w:rPr>
+                <w:b/>
+                <w:color w:val="FFFFFF"/>
+                <w:sz w:val="19"/>
+              </w:rPr>
+              <w:t>S=(a+b+c)/2</w:t>
+            </w:r>
+          </w:p>
+        </w:tc>
+        <w:tc>
+          <w:tcPr>
+            <w:tcW w:type="dxa" w:w="1296"/>
+            <w:shd w:val="clear" w:color="auto" w:fill="1F3A2E"/>
+          </w:tcPr>
+          <w:p>
+            <w:r>
+              <w:rPr>
+                <w:b/>
+                <w:color w:val="FFFFFF"/>
+                <w:sz w:val="19"/>
+              </w:rPr>
+              <w:t>Total (Sqft)</w:t>
+            </w:r>
+          </w:p>
+        </w:tc>
+        <w:tc>
+          <w:tcPr>
+            <w:tcW w:type="dxa" w:w="1152"/>
+            <w:shd w:val="clear" w:color="auto" w:fill="1F3A2E"/>
+          </w:tcPr>
+          <w:p>
+            <w:r>
+              <w:rPr>
+                <w:b/>
+                <w:color w:val="FFFFFF"/>
+                <w:sz w:val="19"/>
+              </w:rPr>
+              <w:t>Land (Aana)</w:t>
+            </w:r>
+          </w:p>
+        </w:tc>
+      </w:tr>
+      <w:tr>
+        <w:tc>
+          <w:tcPr>
+            <w:tcW w:type="dxa" w:w="1296"/>
+          </w:tcPr>
+          <w:p>
+            <w:r>
+              <w:rPr>
+                <w:sz w:val="19"/>
+              </w:rPr>
+              <w:t>A</w:t>
+            </w:r>
+          </w:p>
+        </w:tc>
+        <w:tc>
+          <w:tcPr>
+            <w:tcW w:type="dxa" w:w="1296"/>
+          </w:tcPr>
+          <w:p>
+            <w:r>
+              <w:rPr>
+                <w:sz w:val="19"/>
+              </w:rPr>
+              <w:t>—</w:t>
+            </w:r>
+          </w:p>
+        </w:tc>
+        <w:tc>
+          <w:tcPr>
+            <w:tcW w:type="dxa" w:w="1296"/>
+          </w:tcPr>
+          <w:p>
+            <w:r>
+              <w:rPr>
+                <w:sz w:val="19"/>
+              </w:rPr>
+              <w:t>—</w:t>
+            </w:r>
+          </w:p>
+        </w:tc>
+        <w:tc>
+          <w:tcPr>
+            <w:tcW w:type="dxa" w:w="1296"/>
+          </w:tcPr>
+          <w:p>
+            <w:r>
+              <w:rPr>
+                <w:sz w:val="19"/>
+              </w:rPr>
+              <w:t>—</w:t>
+            </w:r>
+          </w:p>
+        </w:tc>
+        <w:tc>
+          <w:tcPr>
+            <w:tcW w:type="dxa" w:w="1296"/>
+          </w:tcPr>
+          <w:p>
+            <w:r>
+              <w:rPr>
+                <w:sz w:val="19"/>
+              </w:rPr>
+              <w:t>—</w:t>
+            </w:r>
+          </w:p>
+        </w:tc>
+        <w:tc>
+          <w:tcPr>
+            <w:tcW w:type="dxa" w:w="1296"/>
+          </w:tcPr>
+          <w:p>
+            <w:r>
+              <w:rPr>
+                <w:sz w:val="19"/>
+              </w:rPr>
+              <w:t>—</w:t>
+            </w:r>
+          </w:p>
+        </w:tc>
+        <w:tc>
+          <w:tcPr>
+            <w:tcW w:type="dxa" w:w="1296"/>
+          </w:tcPr>
+          <w:p>
+            <w:r>
+              <w:rPr>
+                <w:sz w:val="19"/>
+              </w:rPr>
+              <w:t>—</w:t>
+            </w:r>
+          </w:p>
+        </w:tc>
+      </w:tr>
+      <w:tr>
+        <w:tc>
+          <w:tcPr>
+            <w:tcW w:type="dxa" w:w="1296"/>
+          </w:tcPr>
+          <w:p>
+            <w:r>
+              <w:rPr>
+                <w:sz w:val="19"/>
+              </w:rPr>
+              <w:t>B</w:t>
+            </w:r>
+          </w:p>
+        </w:tc>
+        <w:tc>
+          <w:tcPr>
+            <w:tcW w:type="dxa" w:w="1296"/>
+          </w:tcPr>
+          <w:p>
+            <w:r>
+              <w:rPr>
+                <w:sz w:val="19"/>
+              </w:rPr>
+              <w:t>—</w:t>
+            </w:r>
+          </w:p>
+        </w:tc>
+        <w:tc>
+          <w:tcPr>
+            <w:tcW w:type="dxa" w:w="1296"/>
+          </w:tcPr>
+          <w:p>
+            <w:r>
+              <w:rPr>
+                <w:sz w:val="19"/>
+              </w:rPr>
+              <w:t>—</w:t>
+            </w:r>
+          </w:p>
+        </w:tc>
+        <w:tc>
+          <w:tcPr>
+            <w:tcW w:type="dxa" w:w="1296"/>
+          </w:tcPr>
+          <w:p>
+            <w:r>
+              <w:rPr>
+                <w:sz w:val="19"/>
+              </w:rPr>
+              <w:t>—</w:t>
+            </w:r>
+          </w:p>
+        </w:tc>
+        <w:tc>
+          <w:tcPr>
+            <w:tcW w:type="dxa" w:w="1296"/>
+          </w:tcPr>
+          <w:p>
+            <w:r>
+              <w:rPr>
+                <w:sz w:val="19"/>
+              </w:rPr>
+              <w:t>—</w:t>
+            </w:r>
+          </w:p>
+        </w:tc>
+        <w:tc>
+          <w:tcPr>
+            <w:tcW w:type="dxa" w:w="1296"/>
+          </w:tcPr>
+          <w:p>
+            <w:r>
+              <w:rPr>
+                <w:sz w:val="19"/>
+              </w:rPr>
+              <w:t>—</w:t>
+            </w:r>
+          </w:p>
+        </w:tc>
+        <w:tc>
+          <w:tcPr>
+            <w:tcW w:type="dxa" w:w="1296"/>
+          </w:tcPr>
+          <w:p>
+            <w:r>
+              <w:rPr>
+                <w:sz w:val="19"/>
+              </w:rPr>
+              <w:t>—</w:t>
+            </w:r>
+          </w:p>
+        </w:tc>
+      </w:tr>
+      <w:tr>
+        <w:tc>
+          <w:tcPr>
+            <w:tcW w:type="dxa" w:w="1296"/>
+          </w:tcPr>
+          <w:p>
+            <w:r>
+              <w:rPr>
+                <w:b/>
+                <w:sz w:val="19"/>
+              </w:rPr>
+              <w:t>Total</w:t>
+            </w:r>
+          </w:p>
+        </w:tc>
+        <w:tc>
+          <w:tcPr>
+            <w:tcW w:type="dxa" w:w="1296"/>
+          </w:tcPr>
+          <w:p/>
+        </w:tc>
+        <w:tc>
+          <w:tcPr>
+            <w:tcW w:type="dxa" w:w="1296"/>
+          </w:tcPr>
+          <w:p/>
+        </w:tc>
+        <w:tc>
+          <w:tcPr>
+            <w:tcW w:type="dxa" w:w="1296"/>
+          </w:tcPr>
+          <w:p/>
+        </w:tc>
+        <w:tc>
+          <w:tcPr>
+            <w:tcW w:type="dxa" w:w="1296"/>
+          </w:tcPr>
+          <w:p/>
+        </w:tc>
+        <w:tc>
+          <w:tcPr>
+            <w:tcW w:type="dxa" w:w="1296"/>
+          </w:tcPr>
+          <w:p>
+            <w:r>
+              <w:rPr>
+                <w:b/>
+                <w:sz w:val="19"/>
+              </w:rPr>
+              <w:t>{{ land_area_deducted }}</w:t>
+            </w:r>
+          </w:p>
+        </w:tc>
+        <w:tc>
+          <w:tcPr>
+            <w:tcW w:type="dxa" w:w="1296"/>
+          </w:tcPr>
+          <w:p>
+            <w:r>
+              <w:rPr>
+                <w:b/>
+                <w:sz w:val="19"/>
+              </w:rPr>
+              <w:t>{{ deduct_a }}</w:t>
+            </w:r>
+          </w:p>
+        </w:tc>
+      </w:tr>
+    </w:tbl>
+    <w:p>
+      <w:pPr>
+        <w:spacing w:before="160" w:after="0"/>
+      </w:pPr>
+    </w:p>
+    <w:p>
+      <w:pPr>
+        <w:spacing w:before="0" w:after="80"/>
+      </w:pPr>
+      <w:r>
+        <w:rPr>
+          <w:b/>
+          <w:i w:val="0"/>
+          <w:sz w:val="20"/>
+        </w:rPr>
+        <w:t>C. Total Land Area as per Lalpurja</w:t>
+      </w:r>
+    </w:p>
+    <w:tbl>
+      <w:tblPr>
+        <w:tblStyle w:val="TableGrid"/>
+        <w:tblW w:type="auto" w:w="0"/>
+        <w:tblLook w:firstColumn="1" w:firstRow="1" w:lastColumn="0" w:lastRow="0" w:noHBand="0" w:noVBand="1" w:val="04A0"/>
+      </w:tblPr>
+      <w:tblGrid>
+        <w:gridCol w:w="1296"/>
+        <w:gridCol w:w="1296"/>
+        <w:gridCol w:w="1296"/>
+        <w:gridCol w:w="1296"/>
+        <w:gridCol w:w="1296"/>
+        <w:gridCol w:w="1296"/>
+        <w:gridCol w:w="1296"/>
+      </w:tblGrid>
+      <w:tr>
+        <w:tc>
+          <w:tcPr>
+            <w:tcW w:type="dxa" w:w="2880"/>
+            <w:shd w:val="clear" w:color="auto" w:fill="1F3A2E"/>
+          </w:tcPr>
+          <w:p>
+            <w:r>
+              <w:rPr>
+                <w:b/>
+                <w:color w:val="FFFFFF"/>
+                <w:sz w:val="19"/>
+              </w:rPr>
+              <w:t>Location</w:t>
+            </w:r>
+          </w:p>
+        </w:tc>
+        <w:tc>
+          <w:tcPr>
+            <w:tcW w:type="dxa" w:w="1008"/>
+            <w:shd w:val="clear" w:color="auto" w:fill="1F3A2E"/>
+          </w:tcPr>
+          <w:p>
+            <w:r>
+              <w:rPr>
+                <w:b/>
+                <w:color w:val="FFFFFF"/>
+                <w:sz w:val="19"/>
+              </w:rPr>
+              <w:t>Plot No.</w:t>
+            </w:r>
+          </w:p>
+        </w:tc>
+        <w:tc>
+          <w:tcPr>
+            <w:tcW w:type="dxa" w:w="720"/>
+            <w:shd w:val="clear" w:color="auto" w:fill="1F3A2E"/>
+          </w:tcPr>
+          <w:p>
+            <w:r>
+              <w:rPr>
+                <w:b/>
+                <w:color w:val="FFFFFF"/>
+                <w:sz w:val="19"/>
+              </w:rPr>
+              <w:t>R</w:t>
+            </w:r>
+          </w:p>
+        </w:tc>
+        <w:tc>
+          <w:tcPr>
+            <w:tcW w:type="dxa" w:w="720"/>
+            <w:shd w:val="clear" w:color="auto" w:fill="1F3A2E"/>
+          </w:tcPr>
+          <w:p>
+            <w:r>
+              <w:rPr>
+                <w:b/>
+                <w:color w:val="FFFFFF"/>
+                <w:sz w:val="19"/>
+              </w:rPr>
+              <w:t>A</w:t>
+            </w:r>
+          </w:p>
+        </w:tc>
+        <w:tc>
+          <w:tcPr>
+            <w:tcW w:type="dxa" w:w="720"/>
+            <w:shd w:val="clear" w:color="auto" w:fill="1F3A2E"/>
+          </w:tcPr>
+          <w:p>
+            <w:r>
+              <w:rPr>
+                <w:b/>
+                <w:color w:val="FFFFFF"/>
+                <w:sz w:val="19"/>
+              </w:rPr>
+              <w:t>P</w:t>
+            </w:r>
+          </w:p>
+        </w:tc>
+        <w:tc>
+          <w:tcPr>
+            <w:tcW w:type="dxa" w:w="720"/>
+            <w:shd w:val="clear" w:color="auto" w:fill="1F3A2E"/>
+          </w:tcPr>
+          <w:p>
+            <w:r>
+              <w:rPr>
+                <w:b/>
+                <w:color w:val="FFFFFF"/>
+                <w:sz w:val="19"/>
+              </w:rPr>
+              <w:t>D</w:t>
+            </w:r>
+          </w:p>
+        </w:tc>
+        <w:tc>
+          <w:tcPr>
+            <w:tcW w:type="dxa" w:w="1152"/>
+            <w:shd w:val="clear" w:color="auto" w:fill="1F3A2E"/>
+          </w:tcPr>
+          <w:p>
+            <w:r>
+              <w:rPr>
+                <w:b/>
+                <w:color w:val="FFFFFF"/>
+                <w:sz w:val="19"/>
+              </w:rPr>
+              <w:t>Sqft</w:t>
+            </w:r>
+          </w:p>
+        </w:tc>
+      </w:tr>
+      <w:tr>
+        <w:tc>
+          <w:tcPr>
+            <w:tcW w:type="dxa" w:w="1296"/>
+          </w:tcPr>
+          <w:p>
+            <w:r>
+              <w:rPr>
+                <w:sz w:val="19"/>
+              </w:rPr>
+              <w:t>{{ property_location_full }}</w:t>
+            </w:r>
+          </w:p>
+        </w:tc>
+        <w:tc>
+          <w:tcPr>
+            <w:tcW w:type="dxa" w:w="1296"/>
+          </w:tcPr>
+          <w:p>
+            <w:r>
+              <w:rPr>
+                <w:sz w:val="19"/>
+              </w:rPr>
+              <w:t>{{ plot_no }}</w:t>
+            </w:r>
+          </w:p>
+        </w:tc>
+        <w:tc>
+          <w:tcPr>
+            <w:tcW w:type="dxa" w:w="1296"/>
+          </w:tcPr>
+          <w:p>
+            <w:r>
+              <w:rPr>
+                <w:sz w:val="19"/>
+              </w:rPr>
+              <w:t>{{ lorc_r }}</w:t>
+            </w:r>
+          </w:p>
+        </w:tc>
+        <w:tc>
+          <w:tcPr>
+            <w:tcW w:type="dxa" w:w="1296"/>
+          </w:tcPr>
+          <w:p>
+            <w:r>
+              <w:rPr>
+                <w:sz w:val="19"/>
+              </w:rPr>
+              <w:t>{{ lorc_a }}</w:t>
+            </w:r>
+          </w:p>
+        </w:tc>
+        <w:tc>
+          <w:tcPr>
+            <w:tcW w:type="dxa" w:w="1296"/>
+          </w:tcPr>
+          <w:p>
+            <w:r>
+              <w:rPr>
+                <w:sz w:val="19"/>
+              </w:rPr>
+              <w:t>{{ lorc_p }}</w:t>
+            </w:r>
+          </w:p>
+        </w:tc>
+        <w:tc>
+          <w:tcPr>
+            <w:tcW w:type="dxa" w:w="1296"/>
+          </w:tcPr>
+          <w:p>
+            <w:r>
+              <w:rPr>
+                <w:sz w:val="19"/>
+              </w:rPr>
+              <w:t>{{ lorc_d }}</w:t>
+            </w:r>
+          </w:p>
+        </w:tc>
+        <w:tc>
+          <w:tcPr>
+            <w:tcW w:type="dxa" w:w="1296"/>
+          </w:tcPr>
+          <w:p>
+            <w:r>
+              <w:rPr>
+                <w:sz w:val="19"/>
+              </w:rPr>
+              <w:t>{{ land_area_lorc_sqft }}</w:t>
+            </w:r>
+          </w:p>
+        </w:tc>
+      </w:tr>
+      <w:tr>
+        <w:tc>
+          <w:tcPr>
+            <w:tcW w:type="dxa" w:w="1296"/>
+          </w:tcPr>
+          <w:p>
+            <w:r>
+              <w:rPr>
+                <w:b/>
+                <w:sz w:val="19"/>
+              </w:rPr>
+              <w:t>Total</w:t>
+            </w:r>
+          </w:p>
+        </w:tc>
+        <w:tc>
+          <w:tcPr>
+            <w:tcW w:type="dxa" w:w="1296"/>
+          </w:tcPr>
+          <w:p/>
+        </w:tc>
+        <w:tc>
+          <w:tcPr>
+            <w:tcW w:type="dxa" w:w="1296"/>
+          </w:tcPr>
+          <w:p/>
+        </w:tc>
+        <w:tc>
+          <w:tcPr>
+            <w:tcW w:type="dxa" w:w="1296"/>
+          </w:tcPr>
+          <w:p/>
+        </w:tc>
+        <w:tc>
+          <w:tcPr>
+            <w:tcW w:type="dxa" w:w="1296"/>
+          </w:tcPr>
+          <w:p/>
+        </w:tc>
+        <w:tc>
+          <w:tcPr>
+            <w:tcW w:type="dxa" w:w="1296"/>
+          </w:tcPr>
+          <w:p/>
+        </w:tc>
+        <w:tc>
+          <w:tcPr>
+            <w:tcW w:type="dxa" w:w="1296"/>
+          </w:tcPr>
+          <w:p>
+            <w:r>
+              <w:rPr>
+                <w:b/>
+                <w:sz w:val="19"/>
+              </w:rPr>
+              <w:t>{{ land_area_lorc_sqft }}</w:t>
+            </w:r>
+          </w:p>
+        </w:tc>
+      </w:tr>
+    </w:tbl>
+    <w:p>
+      <w:pPr>
+        <w:spacing w:before="160" w:after="0"/>
+      </w:pPr>
+    </w:p>
+    <w:p>
+      <w:pPr>
+        <w:spacing w:before="0" w:after="80"/>
+      </w:pPr>
+      <w:r>
+        <w:rPr>
+          <w:b/>
+          <w:i w:val="0"/>
+          <w:sz w:val="20"/>
+        </w:rPr>
+        <w:t>Summary</w:t>
+      </w:r>
+    </w:p>
+    <w:tbl>
+      <w:tblPr>
+        <w:tblStyle w:val="TableGrid"/>
+        <w:tblW w:type="auto" w:w="0"/>
+        <w:tblLook w:firstColumn="1" w:firstRow="1" w:lastColumn="0" w:lastRow="0" w:noHBand="0" w:noVBand="1" w:val="04A0"/>
+      </w:tblPr>
+      <w:tblGrid>
+        <w:gridCol w:w="4536"/>
+        <w:gridCol w:w="4536"/>
+      </w:tblGrid>
+      <w:tr>
+        <w:tc>
+          <w:tcPr>
+            <w:tcW w:type="dxa" w:w="5040"/>
+            <w:shd w:val="clear" w:color="auto" w:fill="1F3A2E"/>
+          </w:tcPr>
+          <w:p>
+            <w:r>
+              <w:rPr>
+                <w:b/>
+                <w:color w:val="FFFFFF"/>
+                <w:sz w:val="19"/>
+              </w:rPr>
+              <w:t>Particulars</w:t>
+            </w:r>
+          </w:p>
+        </w:tc>
+        <w:tc>
+          <w:tcPr>
+            <w:tcW w:type="dxa" w:w="3888"/>
+            <w:shd w:val="clear" w:color="auto" w:fill="1F3A2E"/>
+          </w:tcPr>
+          <w:p>
+            <w:r>
+              <w:rPr>
+                <w:b/>
+                <w:color w:val="FFFFFF"/>
+                <w:sz w:val="19"/>
+              </w:rPr>
+              <w:t>Area (Sqft)</w:t>
+            </w:r>
+          </w:p>
+        </w:tc>
+      </w:tr>
+      <w:tr>
+        <w:tc>
+          <w:tcPr>
+            <w:tcW w:type="dxa" w:w="4536"/>
+          </w:tcPr>
+          <w:p>
+            <w:r>
+              <w:rPr>
+                <w:sz w:val="19"/>
+              </w:rPr>
+              <w:t>Area as per Lalpurja</w:t>
+            </w:r>
+          </w:p>
+        </w:tc>
+        <w:tc>
+          <w:tcPr>
+            <w:tcW w:type="dxa" w:w="4536"/>
+          </w:tcPr>
+          <w:p>
+            <w:r>
+              <w:rPr>
+                <w:sz w:val="19"/>
+              </w:rPr>
+              <w:t>{{ land_area_lorc_sqft }}</w:t>
+            </w:r>
+          </w:p>
+        </w:tc>
+      </w:tr>
+      <w:tr>
+        <w:tc>
+          <w:tcPr>
+            <w:tcW w:type="dxa" w:w="4536"/>
+          </w:tcPr>
+          <w:p>
+            <w:r>
+              <w:rPr>
+                <w:sz w:val="19"/>
+              </w:rPr>
+              <w:t>Area as per Measurement</w:t>
+            </w:r>
+          </w:p>
+        </w:tc>
+        <w:tc>
+          <w:tcPr>
+            <w:tcW w:type="dxa" w:w="4536"/>
+          </w:tcPr>
+          <w:p>
+            <w:r>
+              <w:rPr>
+                <w:sz w:val="19"/>
+              </w:rPr>
+              <w:t>{{ land_area_meas_sqft }}</w:t>
+            </w:r>
+          </w:p>
+        </w:tc>
+      </w:tr>
+      <w:tr>
+        <w:tc>
+          <w:tcPr>
+            <w:tcW w:type="dxa" w:w="4536"/>
+          </w:tcPr>
+          <w:p>
+            <w:r>
+              <w:rPr>
+                <w:sz w:val="19"/>
+              </w:rPr>
+              <w:t>Area after Deduction</w:t>
+            </w:r>
+          </w:p>
+        </w:tc>
+        <w:tc>
+          <w:tcPr>
+            <w:tcW w:type="dxa" w:w="4536"/>
+          </w:tcPr>
+          <w:p>
+            <w:r>
+              <w:rPr>
+                <w:sz w:val="19"/>
+              </w:rPr>
+              <w:t>{{ land_area_deducted }}</w:t>
+            </w:r>
+          </w:p>
+        </w:tc>
+      </w:tr>
+      <w:tr>
+        <w:tc>
+          <w:tcPr>
+            <w:tcW w:type="dxa" w:w="4536"/>
+          </w:tcPr>
+          <w:p>
+            <w:r>
+              <w:rPr>
+                <w:sz w:val="19"/>
+              </w:rPr>
+              <w:t>Area Considered for Valuation</w:t>
+            </w:r>
+          </w:p>
+        </w:tc>
+        <w:tc>
+          <w:tcPr>
+            <w:tcW w:type="dxa" w:w="4536"/>
+          </w:tcPr>
+          <w:p>
+            <w:r>
+              <w:rPr>
+                <w:sz w:val="19"/>
+              </w:rPr>
+              <w:t>{{ land_area_considered }}</w:t>
             </w:r>
           </w:p>
         </w:tc>

</xml_diff>

<commit_message>
feat: Add Nepali translations and styles to GenerateDocModal component
- Updated labels and hints in GenerateDocModal.js to include Nepali translations for better localization.
- Introduced new CSS classes in GenerateDocModal.css and AccountDetail.css for styling Nepali text, ensuring proper display and alignment.
</commit_message>
<xml_diff>
--- a/backend/templates/proposal_template.docx
+++ b/backend/templates/proposal_template.docx
@@ -190,18 +190,6 @@
     </w:p>
     <w:p>
       <w:pPr>
-        <w:spacing w:after="0" w:before="160" w:lineRule="auto"/>
-        <w:jc w:val="center"/>
-        <w:rPr/>
-      </w:pPr>
-      <w:r>
-        <w:rPr>
-          <w:rtl w:val="0"/>
-        </w:rPr>
-      </w:r>
-    </w:p>
-    <w:p>
-      <w:pPr>
         <w:spacing w:after="0" w:before="0" w:lineRule="auto"/>
         <w:jc w:val="center"/>
         <w:rPr>
@@ -336,18 +324,6 @@
     </w:p>
     <w:p>
       <w:pPr>
-        <w:spacing w:after="0" w:before="160" w:lineRule="auto"/>
-        <w:jc w:val="center"/>
-        <w:rPr/>
-      </w:pPr>
-      <w:r>
-        <w:rPr>
-          <w:rtl w:val="0"/>
-        </w:rPr>
-      </w:r>
-    </w:p>
-    <w:p>
-      <w:pPr>
         <w:spacing w:after="0" w:before="0" w:lineRule="auto"/>
         <w:jc w:val="center"/>
         <w:rPr/>
@@ -364,18 +340,6 @@
         </w:rPr>
         <w:t xml:space="preserve">{{ owners_block }}</w:t>
       </w:r>
-      <w:r>
-        <w:rPr>
-          <w:rtl w:val="0"/>
-        </w:rPr>
-      </w:r>
-    </w:p>
-    <w:p>
-      <w:pPr>
-        <w:spacing w:after="0" w:before="200" w:lineRule="auto"/>
-        <w:jc w:val="center"/>
-        <w:rPr/>
-      </w:pPr>
       <w:r>
         <w:rPr>
           <w:rtl w:val="0"/>
@@ -519,18 +483,6 @@
     </w:p>
     <w:p>
       <w:pPr>
-        <w:spacing w:after="80" w:before="160" w:lineRule="auto"/>
-        <w:jc w:val="center"/>
-        <w:rPr/>
-      </w:pPr>
-      <w:r>
-        <w:rPr>
-          <w:rtl w:val="0"/>
-        </w:rPr>
-      </w:r>
-    </w:p>
-    <w:p>
-      <w:pPr>
         <w:spacing w:after="0" w:before="160" w:lineRule="auto"/>
         <w:jc w:val="center"/>
         <w:rPr>
@@ -571,7 +523,7 @@
         </w:rPr>
         <w:drawing>
           <wp:inline distB="114300" distT="114300" distL="114300" distR="114300">
-            <wp:extent cx="1476375" cy="1198348"/>
+            <wp:extent cx="937260" cy="763079"/>
             <wp:effectExtent b="0" l="0" r="0" t="0"/>
             <wp:docPr id="1" name="image1.png"/>
             <a:graphic>
@@ -591,7 +543,7 @@
                   <pic:spPr>
                     <a:xfrm>
                       <a:off x="0" y="0"/>
-                      <a:ext cx="1476375" cy="1198348"/>
+                      <a:ext cx="937260" cy="763079"/>
                     </a:xfrm>
                     <a:prstGeom prst="rect"/>
                     <a:ln/>
@@ -3488,20 +3440,6 @@
     </w:p>
     <w:p>
       <w:pPr>
-        <w:jc w:val="left"/>
-        <w:rPr/>
-      </w:pPr>
-      <w:r>
-        <w:br w:type="page"/>
-      </w:r>
-      <w:r>
-        <w:rPr>
-          <w:rtl w:val="0"/>
-        </w:rPr>
-      </w:r>
-    </w:p>
-    <w:p>
-      <w:pPr>
         <w:spacing w:after="120" w:before="0" w:lineRule="auto"/>
         <w:jc w:val="left"/>
         <w:rPr/>
@@ -4456,7 +4394,7 @@
     <w:tbl>
       <w:tblPr>
         <w:tblStyle w:val="Table2"/>
-        <w:tblW w:w="9072.0" w:type="dxa"/>
+        <w:tblW w:w="9060.0" w:type="dxa"/>
         <w:jc w:val="left"/>
         <w:tblInd w:w="-108.0" w:type="dxa"/>
         <w:tblBorders>
@@ -4471,12 +4409,12 @@
         <w:tblLook w:val="0400"/>
       </w:tblPr>
       <w:tblGrid>
-        <w:gridCol w:w="4536"/>
-        <w:gridCol w:w="4536"/>
+        <w:gridCol w:w="3780"/>
+        <w:gridCol w:w="5280"/>
         <w:tblGridChange w:id="0">
           <w:tblGrid>
-            <w:gridCol w:w="4536"/>
-            <w:gridCol w:w="4536"/>
+            <w:gridCol w:w="3780"/>
+            <w:gridCol w:w="5280"/>
           </w:tblGrid>
         </w:tblGridChange>
       </w:tblGrid>
@@ -4549,7 +4487,6 @@
           <w:tcPr/>
           <w:p>
             <w:pPr>
-              <w:jc w:val="center"/>
               <w:rPr/>
             </w:pPr>
             <w:r>
@@ -4599,7 +4536,6 @@
           <w:tcPr/>
           <w:p>
             <w:pPr>
-              <w:jc w:val="center"/>
               <w:rPr/>
             </w:pPr>
             <w:r>
@@ -4649,7 +4585,6 @@
           <w:tcPr/>
           <w:p>
             <w:pPr>
-              <w:jc w:val="center"/>
               <w:rPr/>
             </w:pPr>
             <w:r>
@@ -4699,7 +4634,6 @@
           <w:tcPr/>
           <w:p>
             <w:pPr>
-              <w:jc w:val="center"/>
               <w:rPr/>
             </w:pPr>
             <w:r>
@@ -4749,7 +4683,6 @@
           <w:tcPr/>
           <w:p>
             <w:pPr>
-              <w:jc w:val="center"/>
               <w:rPr/>
             </w:pPr>
             <w:r>
@@ -4799,7 +4732,6 @@
           <w:tcPr/>
           <w:p>
             <w:pPr>
-              <w:jc w:val="center"/>
               <w:rPr/>
             </w:pPr>
             <w:r>
@@ -4849,7 +4781,6 @@
           <w:tcPr/>
           <w:p>
             <w:pPr>
-              <w:jc w:val="center"/>
               <w:rPr/>
             </w:pPr>
             <w:r>
@@ -4899,7 +4830,6 @@
           <w:tcPr/>
           <w:p>
             <w:pPr>
-              <w:jc w:val="center"/>
               <w:rPr/>
             </w:pPr>
             <w:r>
@@ -4949,7 +4879,6 @@
           <w:tcPr/>
           <w:p>
             <w:pPr>
-              <w:jc w:val="center"/>
               <w:rPr/>
             </w:pPr>
             <w:r>
@@ -4999,7 +4928,6 @@
           <w:tcPr/>
           <w:p>
             <w:pPr>
-              <w:jc w:val="center"/>
               <w:rPr/>
             </w:pPr>
             <w:r>
@@ -5339,8 +5267,8 @@
               <w:rPr>
                 <w:b w:val="1"/>
                 <w:bCs w:val="1"/>
-                <w:sz w:val="19"/>
-                <w:szCs w:val="19"/>
+                <w:sz w:val="23"/>
+                <w:szCs w:val="23"/>
                 <w:u w:val="single"/>
               </w:rPr>
             </w:pPr>
@@ -5348,8 +5276,8 @@
               <w:rPr>
                 <w:b w:val="1"/>
                 <w:bCs w:val="1"/>
-                <w:sz w:val="19"/>
-                <w:szCs w:val="19"/>
+                <w:sz w:val="23"/>
+                <w:szCs w:val="23"/>
                 <w:u w:val="single"/>
                 <w:rtl w:val="0"/>
               </w:rPr>
@@ -5367,7 +5295,6 @@
           <w:tcPr/>
           <w:p>
             <w:pPr>
-              <w:jc w:val="center"/>
               <w:rPr/>
             </w:pPr>
             <w:r>
@@ -5417,7 +5344,6 @@
           <w:tcPr/>
           <w:p>
             <w:pPr>
-              <w:jc w:val="center"/>
               <w:rPr/>
             </w:pPr>
             <w:r>
@@ -5467,7 +5393,6 @@
           <w:tcPr/>
           <w:p>
             <w:pPr>
-              <w:jc w:val="center"/>
               <w:rPr/>
             </w:pPr>
             <w:r>
@@ -5517,7 +5442,6 @@
           <w:tcPr/>
           <w:p>
             <w:pPr>
-              <w:jc w:val="center"/>
               <w:rPr/>
             </w:pPr>
             <w:r>
@@ -5567,7 +5491,6 @@
           <w:tcPr/>
           <w:p>
             <w:pPr>
-              <w:jc w:val="center"/>
               <w:rPr/>
             </w:pPr>
             <w:r>
@@ -5617,7 +5540,6 @@
           <w:tcPr/>
           <w:p>
             <w:pPr>
-              <w:jc w:val="center"/>
               <w:rPr/>
             </w:pPr>
             <w:r>
@@ -5667,7 +5589,6 @@
           <w:tcPr/>
           <w:p>
             <w:pPr>
-              <w:jc w:val="center"/>
               <w:rPr/>
             </w:pPr>
             <w:r>
@@ -5717,7 +5638,6 @@
           <w:tcPr/>
           <w:p>
             <w:pPr>
-              <w:jc w:val="center"/>
               <w:rPr/>
             </w:pPr>
             <w:r>
@@ -5767,7 +5687,6 @@
           <w:tcPr/>
           <w:p>
             <w:pPr>
-              <w:jc w:val="center"/>
               <w:rPr/>
             </w:pPr>
             <w:r>
@@ -5817,7 +5736,6 @@
           <w:tcPr/>
           <w:p>
             <w:pPr>
-              <w:jc w:val="center"/>
               <w:rPr/>
             </w:pPr>
             <w:r>
@@ -6096,7 +6014,6 @@
           <w:tcPr/>
           <w:p>
             <w:pPr>
-              <w:jc w:val="center"/>
               <w:rPr/>
             </w:pPr>
             <w:r>
@@ -6236,7 +6153,6 @@
           <w:tcPr/>
           <w:p>
             <w:pPr>
-              <w:jc w:val="center"/>
               <w:rPr/>
             </w:pPr>
             <w:r>
@@ -6376,7 +6292,6 @@
           <w:tcPr/>
           <w:p>
             <w:pPr>
-              <w:jc w:val="center"/>
               <w:rPr/>
             </w:pPr>
             <w:r>
@@ -6516,7 +6431,6 @@
           <w:tcPr/>
           <w:p>
             <w:pPr>
-              <w:jc w:val="center"/>
               <w:rPr/>
             </w:pPr>
             <w:r>
@@ -7285,14 +7199,14 @@
         <w:tblLook w:val="0400"/>
       </w:tblPr>
       <w:tblGrid>
-        <w:gridCol w:w="1410"/>
-        <w:gridCol w:w="4650"/>
-        <w:gridCol w:w="3030"/>
+        <w:gridCol w:w="720"/>
+        <w:gridCol w:w="4590"/>
+        <w:gridCol w:w="3780"/>
         <w:tblGridChange w:id="0">
           <w:tblGrid>
-            <w:gridCol w:w="1410"/>
-            <w:gridCol w:w="4650"/>
-            <w:gridCol w:w="3030"/>
+            <w:gridCol w:w="720"/>
+            <w:gridCol w:w="4590"/>
+            <w:gridCol w:w="3780"/>
           </w:tblGrid>
         </w:tblGridChange>
       </w:tblGrid>
@@ -7392,7 +7306,6 @@
           <w:tcPr/>
           <w:p>
             <w:pPr>
-              <w:jc w:val="center"/>
               <w:rPr/>
             </w:pPr>
             <w:r>
@@ -7464,7 +7377,6 @@
           <w:tcPr/>
           <w:p>
             <w:pPr>
-              <w:jc w:val="center"/>
               <w:rPr/>
             </w:pPr>
             <w:r>
@@ -7536,7 +7448,6 @@
           <w:tcPr/>
           <w:p>
             <w:pPr>
-              <w:jc w:val="center"/>
               <w:rPr/>
             </w:pPr>
             <w:r>
@@ -7608,7 +7519,6 @@
           <w:tcPr/>
           <w:p>
             <w:pPr>
-              <w:jc w:val="center"/>
               <w:rPr/>
             </w:pPr>
             <w:r>
@@ -7680,7 +7590,6 @@
           <w:tcPr/>
           <w:p>
             <w:pPr>
-              <w:jc w:val="center"/>
               <w:rPr/>
             </w:pPr>
             <w:r>
@@ -7752,7 +7661,6 @@
           <w:tcPr/>
           <w:p>
             <w:pPr>
-              <w:jc w:val="center"/>
               <w:rPr/>
             </w:pPr>
             <w:r>
@@ -7824,7 +7732,6 @@
           <w:tcPr/>
           <w:p>
             <w:pPr>
-              <w:jc w:val="center"/>
               <w:rPr/>
             </w:pPr>
             <w:r>
@@ -7896,7 +7803,6 @@
           <w:tcPr/>
           <w:p>
             <w:pPr>
-              <w:jc w:val="center"/>
               <w:rPr/>
             </w:pPr>
             <w:r>
@@ -7968,7 +7874,6 @@
           <w:tcPr/>
           <w:p>
             <w:pPr>
-              <w:jc w:val="center"/>
               <w:rPr/>
             </w:pPr>
             <w:r>
@@ -8040,7 +7945,6 @@
           <w:tcPr/>
           <w:p>
             <w:pPr>
-              <w:jc w:val="center"/>
               <w:rPr/>
             </w:pPr>
             <w:r>
@@ -8112,7 +8016,6 @@
           <w:tcPr/>
           <w:p>
             <w:pPr>
-              <w:jc w:val="center"/>
               <w:rPr/>
             </w:pPr>
             <w:r>
@@ -8184,7 +8087,6 @@
           <w:tcPr/>
           <w:p>
             <w:pPr>
-              <w:jc w:val="center"/>
               <w:rPr/>
             </w:pPr>
             <w:r>
@@ -8256,7 +8158,6 @@
           <w:tcPr/>
           <w:p>
             <w:pPr>
-              <w:jc w:val="center"/>
               <w:rPr/>
             </w:pPr>
             <w:r>
@@ -8328,7 +8229,6 @@
           <w:tcPr/>
           <w:p>
             <w:pPr>
-              <w:jc w:val="center"/>
               <w:rPr/>
             </w:pPr>
             <w:r>
@@ -8400,7 +8300,6 @@
           <w:tcPr/>
           <w:p>
             <w:pPr>
-              <w:jc w:val="center"/>
               <w:rPr/>
             </w:pPr>
             <w:r>
@@ -8472,7 +8371,6 @@
           <w:tcPr/>
           <w:p>
             <w:pPr>
-              <w:jc w:val="center"/>
               <w:rPr/>
             </w:pPr>
             <w:r>
@@ -8544,7 +8442,6 @@
           <w:tcPr/>
           <w:p>
             <w:pPr>
-              <w:jc w:val="center"/>
               <w:rPr/>
             </w:pPr>
             <w:r>
@@ -8616,7 +8513,6 @@
           <w:tcPr/>
           <w:p>
             <w:pPr>
-              <w:jc w:val="center"/>
               <w:rPr/>
             </w:pPr>
             <w:r>
@@ -8688,7 +8584,6 @@
           <w:tcPr/>
           <w:p>
             <w:pPr>
-              <w:jc w:val="center"/>
               <w:rPr/>
             </w:pPr>
             <w:r>
@@ -8856,14 +8751,14 @@
         <w:tblLook w:val="0400"/>
       </w:tblPr>
       <w:tblGrid>
-        <w:gridCol w:w="1140"/>
-        <w:gridCol w:w="3225"/>
-        <w:gridCol w:w="4815"/>
+        <w:gridCol w:w="615"/>
+        <w:gridCol w:w="3495"/>
+        <w:gridCol w:w="5070"/>
         <w:tblGridChange w:id="0">
           <w:tblGrid>
-            <w:gridCol w:w="1140"/>
-            <w:gridCol w:w="3225"/>
-            <w:gridCol w:w="4815"/>
+            <w:gridCol w:w="615"/>
+            <w:gridCol w:w="3495"/>
+            <w:gridCol w:w="5070"/>
           </w:tblGrid>
         </w:tblGridChange>
       </w:tblGrid>
@@ -8958,7 +8853,6 @@
           <w:tcPr/>
           <w:p>
             <w:pPr>
-              <w:jc w:val="center"/>
               <w:rPr>
                 <w:sz w:val="19"/>
                 <w:szCs w:val="19"/>
@@ -9027,7 +8921,6 @@
           <w:tcPr/>
           <w:p>
             <w:pPr>
-              <w:jc w:val="center"/>
               <w:rPr>
                 <w:sz w:val="19"/>
                 <w:szCs w:val="19"/>
@@ -9096,7 +8989,6 @@
           <w:tcPr/>
           <w:p>
             <w:pPr>
-              <w:jc w:val="center"/>
               <w:rPr>
                 <w:sz w:val="19"/>
                 <w:szCs w:val="19"/>
@@ -9165,7 +9057,6 @@
           <w:tcPr/>
           <w:p>
             <w:pPr>
-              <w:jc w:val="center"/>
               <w:rPr>
                 <w:sz w:val="19"/>
                 <w:szCs w:val="19"/>
@@ -9268,14 +9159,14 @@
         <w:tblLook w:val="0400"/>
       </w:tblPr>
       <w:tblGrid>
-        <w:gridCol w:w="1140"/>
-        <w:gridCol w:w="4980"/>
-        <w:gridCol w:w="3060"/>
+        <w:gridCol w:w="600"/>
+        <w:gridCol w:w="4095"/>
+        <w:gridCol w:w="4485"/>
         <w:tblGridChange w:id="0">
           <w:tblGrid>
-            <w:gridCol w:w="1140"/>
-            <w:gridCol w:w="4980"/>
-            <w:gridCol w:w="3060"/>
+            <w:gridCol w:w="600"/>
+            <w:gridCol w:w="4095"/>
+            <w:gridCol w:w="4485"/>
           </w:tblGrid>
         </w:tblGridChange>
       </w:tblGrid>
@@ -9370,7 +9261,6 @@
           <w:tcPr/>
           <w:p>
             <w:pPr>
-              <w:jc w:val="center"/>
               <w:rPr>
                 <w:sz w:val="19"/>
                 <w:szCs w:val="19"/>
@@ -9439,7 +9329,6 @@
           <w:tcPr/>
           <w:p>
             <w:pPr>
-              <w:jc w:val="center"/>
               <w:rPr>
                 <w:sz w:val="19"/>
                 <w:szCs w:val="19"/>
@@ -9508,7 +9397,6 @@
           <w:tcPr/>
           <w:p>
             <w:pPr>
-              <w:jc w:val="center"/>
               <w:rPr>
                 <w:sz w:val="19"/>
                 <w:szCs w:val="19"/>
@@ -9611,13 +9499,13 @@
         <w:tblLook w:val="0400"/>
       </w:tblPr>
       <w:tblGrid>
-        <w:gridCol w:w="1155"/>
-        <w:gridCol w:w="4305"/>
+        <w:gridCol w:w="570"/>
+        <w:gridCol w:w="4890"/>
         <w:gridCol w:w="3720"/>
         <w:tblGridChange w:id="0">
           <w:tblGrid>
-            <w:gridCol w:w="1155"/>
-            <w:gridCol w:w="4305"/>
+            <w:gridCol w:w="570"/>
+            <w:gridCol w:w="4890"/>
             <w:gridCol w:w="3720"/>
           </w:tblGrid>
         </w:tblGridChange>
@@ -9713,7 +9601,6 @@
           <w:tcPr/>
           <w:p>
             <w:pPr>
-              <w:jc w:val="center"/>
               <w:rPr>
                 <w:sz w:val="19"/>
                 <w:szCs w:val="19"/>
@@ -9782,7 +9669,6 @@
           <w:tcPr/>
           <w:p>
             <w:pPr>
-              <w:jc w:val="center"/>
               <w:rPr>
                 <w:sz w:val="19"/>
                 <w:szCs w:val="19"/>
@@ -9851,7 +9737,6 @@
           <w:tcPr/>
           <w:p>
             <w:pPr>
-              <w:jc w:val="center"/>
               <w:rPr>
                 <w:sz w:val="19"/>
                 <w:szCs w:val="19"/>
@@ -9920,7 +9805,6 @@
           <w:tcPr/>
           <w:p>
             <w:pPr>
-              <w:jc w:val="center"/>
               <w:rPr>
                 <w:sz w:val="19"/>
                 <w:szCs w:val="19"/>
@@ -10023,13 +9907,13 @@
         <w:tblLook w:val="0400"/>
       </w:tblPr>
       <w:tblGrid>
-        <w:gridCol w:w="1170"/>
-        <w:gridCol w:w="5265"/>
+        <w:gridCol w:w="600"/>
+        <w:gridCol w:w="5835"/>
         <w:gridCol w:w="2745"/>
         <w:tblGridChange w:id="0">
           <w:tblGrid>
-            <w:gridCol w:w="1170"/>
-            <w:gridCol w:w="5265"/>
+            <w:gridCol w:w="600"/>
+            <w:gridCol w:w="5835"/>
             <w:gridCol w:w="2745"/>
           </w:tblGrid>
         </w:tblGridChange>
@@ -10125,7 +10009,6 @@
           <w:tcPr/>
           <w:p>
             <w:pPr>
-              <w:jc w:val="center"/>
               <w:rPr>
                 <w:sz w:val="19"/>
                 <w:szCs w:val="19"/>
@@ -10194,7 +10077,6 @@
           <w:tcPr/>
           <w:p>
             <w:pPr>
-              <w:jc w:val="center"/>
               <w:rPr>
                 <w:sz w:val="19"/>
                 <w:szCs w:val="19"/>
@@ -10263,7 +10145,6 @@
           <w:tcPr/>
           <w:p>
             <w:pPr>
-              <w:jc w:val="center"/>
               <w:rPr>
                 <w:sz w:val="19"/>
                 <w:szCs w:val="19"/>
@@ -10332,7 +10213,6 @@
           <w:tcPr/>
           <w:p>
             <w:pPr>
-              <w:jc w:val="center"/>
               <w:rPr>
                 <w:sz w:val="19"/>
                 <w:szCs w:val="19"/>
@@ -10401,7 +10281,6 @@
           <w:tcPr/>
           <w:p>
             <w:pPr>
-              <w:jc w:val="center"/>
               <w:rPr>
                 <w:sz w:val="19"/>
                 <w:szCs w:val="19"/>
@@ -10470,7 +10349,6 @@
           <w:tcPr/>
           <w:p>
             <w:pPr>
-              <w:jc w:val="center"/>
               <w:rPr>
                 <w:sz w:val="19"/>
                 <w:szCs w:val="19"/>
@@ -10573,13 +10451,13 @@
         <w:tblLook w:val="0400"/>
       </w:tblPr>
       <w:tblGrid>
-        <w:gridCol w:w="1170"/>
-        <w:gridCol w:w="3750"/>
+        <w:gridCol w:w="645"/>
+        <w:gridCol w:w="4275"/>
         <w:gridCol w:w="4260"/>
         <w:tblGridChange w:id="0">
           <w:tblGrid>
-            <w:gridCol w:w="1170"/>
-            <w:gridCol w:w="3750"/>
+            <w:gridCol w:w="645"/>
+            <w:gridCol w:w="4275"/>
             <w:gridCol w:w="4260"/>
           </w:tblGrid>
         </w:tblGridChange>
@@ -10675,7 +10553,6 @@
           <w:tcPr/>
           <w:p>
             <w:pPr>
-              <w:jc w:val="center"/>
               <w:rPr>
                 <w:sz w:val="19"/>
                 <w:szCs w:val="19"/>
@@ -10744,7 +10621,6 @@
           <w:tcPr/>
           <w:p>
             <w:pPr>
-              <w:jc w:val="center"/>
               <w:rPr>
                 <w:sz w:val="19"/>
                 <w:szCs w:val="19"/>
@@ -10813,7 +10689,6 @@
           <w:tcPr/>
           <w:p>
             <w:pPr>
-              <w:jc w:val="center"/>
               <w:rPr>
                 <w:sz w:val="19"/>
                 <w:szCs w:val="19"/>
@@ -10916,13 +10791,13 @@
         <w:tblLook w:val="0400"/>
       </w:tblPr>
       <w:tblGrid>
-        <w:gridCol w:w="1170"/>
-        <w:gridCol w:w="4515"/>
+        <w:gridCol w:w="615"/>
+        <w:gridCol w:w="5070"/>
         <w:gridCol w:w="3495"/>
         <w:tblGridChange w:id="0">
           <w:tblGrid>
-            <w:gridCol w:w="1170"/>
-            <w:gridCol w:w="4515"/>
+            <w:gridCol w:w="615"/>
+            <w:gridCol w:w="5070"/>
             <w:gridCol w:w="3495"/>
           </w:tblGrid>
         </w:tblGridChange>
@@ -11018,7 +10893,6 @@
           <w:tcPr/>
           <w:p>
             <w:pPr>
-              <w:jc w:val="center"/>
               <w:rPr>
                 <w:sz w:val="19"/>
                 <w:szCs w:val="19"/>
@@ -11088,7 +10962,6 @@
           <w:tcPr/>
           <w:p>
             <w:pPr>
-              <w:jc w:val="center"/>
               <w:rPr>
                 <w:sz w:val="19"/>
                 <w:szCs w:val="19"/>
@@ -11157,7 +11030,6 @@
           <w:tcPr/>
           <w:p>
             <w:pPr>
-              <w:jc w:val="center"/>
               <w:rPr>
                 <w:sz w:val="19"/>
                 <w:szCs w:val="19"/>
@@ -11226,7 +11098,6 @@
           <w:tcPr/>
           <w:p>
             <w:pPr>
-              <w:jc w:val="center"/>
               <w:rPr>
                 <w:sz w:val="19"/>
                 <w:szCs w:val="19"/>
@@ -11328,7 +11199,7 @@
     <w:tbl>
       <w:tblPr>
         <w:tblStyle w:val="Table13"/>
-        <w:tblW w:w="9072.0" w:type="dxa"/>
+        <w:tblW w:w="9060.0" w:type="dxa"/>
         <w:jc w:val="left"/>
         <w:tblInd w:w="-108.0" w:type="dxa"/>
         <w:tblBorders>
@@ -11343,12 +11214,12 @@
         <w:tblLook w:val="0400"/>
       </w:tblPr>
       <w:tblGrid>
-        <w:gridCol w:w="4536"/>
-        <w:gridCol w:w="4536"/>
+        <w:gridCol w:w="3795"/>
+        <w:gridCol w:w="5265"/>
         <w:tblGridChange w:id="0">
           <w:tblGrid>
-            <w:gridCol w:w="4536"/>
-            <w:gridCol w:w="4536"/>
+            <w:gridCol w:w="3795"/>
+            <w:gridCol w:w="5265"/>
           </w:tblGrid>
         </w:tblGridChange>
       </w:tblGrid>
@@ -12212,7 +12083,7 @@
     <w:tbl>
       <w:tblPr>
         <w:tblStyle w:val="Table14"/>
-        <w:tblW w:w="9072.0" w:type="dxa"/>
+        <w:tblW w:w="9060.0" w:type="dxa"/>
         <w:jc w:val="left"/>
         <w:tblInd w:w="-108.0" w:type="dxa"/>
         <w:tblBorders>
@@ -12227,12 +12098,12 @@
         <w:tblLook w:val="0400"/>
       </w:tblPr>
       <w:tblGrid>
-        <w:gridCol w:w="4536"/>
-        <w:gridCol w:w="4536"/>
+        <w:gridCol w:w="3840"/>
+        <w:gridCol w:w="5220"/>
         <w:tblGridChange w:id="0">
           <w:tblGrid>
-            <w:gridCol w:w="4536"/>
-            <w:gridCol w:w="4536"/>
+            <w:gridCol w:w="3840"/>
+            <w:gridCol w:w="5220"/>
           </w:tblGrid>
         </w:tblGridChange>
       </w:tblGrid>
@@ -12483,7 +12354,7 @@
     <w:tbl>
       <w:tblPr>
         <w:tblStyle w:val="Table15"/>
-        <w:tblW w:w="9072.0" w:type="dxa"/>
+        <w:tblW w:w="9060.0" w:type="dxa"/>
         <w:jc w:val="left"/>
         <w:tblInd w:w="-108.0" w:type="dxa"/>
         <w:tblBorders>
@@ -12498,12 +12369,12 @@
         <w:tblLook w:val="0400"/>
       </w:tblPr>
       <w:tblGrid>
-        <w:gridCol w:w="4536"/>
-        <w:gridCol w:w="4536"/>
+        <w:gridCol w:w="3930"/>
+        <w:gridCol w:w="5130"/>
         <w:tblGridChange w:id="0">
           <w:tblGrid>
-            <w:gridCol w:w="4536"/>
-            <w:gridCol w:w="4536"/>
+            <w:gridCol w:w="3930"/>
+            <w:gridCol w:w="5130"/>
           </w:tblGrid>
         </w:tblGridChange>
       </w:tblGrid>
@@ -13406,7 +13277,6 @@
           <w:tcPr/>
           <w:p>
             <w:pPr>
-              <w:jc w:val="center"/>
               <w:rPr/>
             </w:pPr>
             <w:r>
@@ -13546,7 +13416,6 @@
           <w:tcPr/>
           <w:p>
             <w:pPr>
-              <w:jc w:val="center"/>
               <w:rPr/>
             </w:pPr>
             <w:r>
@@ -13686,7 +13555,6 @@
           <w:tcPr/>
           <w:p>
             <w:pPr>
-              <w:jc w:val="center"/>
               <w:rPr/>
             </w:pPr>
             <w:r>
@@ -13826,7 +13694,6 @@
           <w:tcPr/>
           <w:p>
             <w:pPr>
-              <w:jc w:val="center"/>
               <w:rPr/>
             </w:pPr>
             <w:r>
@@ -14731,10 +14598,15 @@
           <w:p>
             <w:pPr>
               <w:jc w:val="center"/>
-              <w:rPr/>
-            </w:pPr>
-            <w:r>
-              <w:rPr>
+              <w:rPr>
+                <w:b w:val="1"/>
+                <w:bCs w:val="1"/>
+              </w:rPr>
+            </w:pPr>
+            <w:r>
+              <w:rPr>
+                <w:b w:val="1"/>
+                <w:bCs w:val="1"/>
                 <w:sz w:val="19"/>
                 <w:szCs w:val="19"/>
                 <w:rtl w:val="0"/>
@@ -18026,14 +17898,13 @@
           <w:szCs w:val="20"/>
           <w:rtl w:val="0"/>
         </w:rPr>
-        <w:t xml:space="preserve">—-----------------------------------</w:t>
+        <w:t xml:space="preserve">—---------------------------------------</w:t>
         <w:tab/>
         <w:tab/>
         <w:tab/>
         <w:tab/>
         <w:tab/>
-        <w:tab/>
-        <w:t xml:space="preserve">—-------------------------------</w:t>
+        <w:t xml:space="preserve">         —---------------------------------------</w:t>
       </w:r>
       <w:r>
         <w:rPr>
@@ -18277,14 +18148,23 @@
           <w:tcPr/>
           <w:p>
             <w:pPr>
-              <w:jc w:val="center"/>
-              <w:rPr/>
-            </w:pPr>
-            <w:r>
-              <w:rPr>
-                <w:rtl w:val="0"/>
-              </w:rPr>
-              <w:t xml:space="preserve">—-------------------------------</w:t>
+              <w:spacing w:before="200" w:line="276" w:lineRule="auto"/>
+              <w:jc w:val="left"/>
+              <w:rPr/>
+            </w:pPr>
+            <w:r>
+              <w:rPr>
+                <w:sz w:val="20"/>
+                <w:szCs w:val="20"/>
+                <w:rtl w:val="0"/>
+              </w:rPr>
+              <w:t xml:space="preserve">    —---------------------------------------</w:t>
+              <w:tab/>
+            </w:r>
+            <w:r>
+              <w:rPr>
+                <w:rtl w:val="0"/>
+              </w:rPr>
             </w:r>
           </w:p>
         </w:tc>
@@ -18548,10 +18428,35 @@
         <w:rPr>
           <w:rtl w:val="0"/>
         </w:rPr>
+      </w:r>
+    </w:p>
+    <w:p>
+      <w:pPr>
+        <w:spacing w:after="0" w:before="240" w:lineRule="auto"/>
+        <w:jc w:val="left"/>
+        <w:rPr/>
+      </w:pPr>
+      <w:r>
+        <w:rPr>
+          <w:rtl w:val="0"/>
+        </w:rPr>
         <w:tab/>
-        <w:t xml:space="preserve">—------------------------------------</w:t>
+        <w:t xml:space="preserve">   </w:t>
+      </w:r>
+      <w:r>
+        <w:rPr>
+          <w:sz w:val="20"/>
+          <w:szCs w:val="20"/>
+          <w:rtl w:val="0"/>
+        </w:rPr>
+        <w:t xml:space="preserve">—---------------------------------------</w:t>
+      </w:r>
+      <w:r>
+        <w:rPr>
+          <w:rtl w:val="0"/>
+        </w:rPr>
         <w:tab/>
-        <w:tab/>
+        <w:t xml:space="preserve">  </w:t>
         <w:tab/>
         <w:t xml:space="preserve">      —-----------------------------------</w:t>
       </w:r>

</xml_diff>

<commit_message>
feat: Enhance property model and document generation with road deduction calculations and dynamic table structures
</commit_message>
<xml_diff>
--- a/backend/templates/proposal_template.docx
+++ b/backend/templates/proposal_template.docx
@@ -19187,139 +19187,133 @@
                 <w:szCs w:val="19"/>
                 <w:rtl w:val="0"/>
               </w:rPr>
-              <w:t xml:space="preserve">A</w:t>
-            </w:r>
-            <w:r>
-              <w:rPr>
-                <w:rtl w:val="0"/>
-              </w:rPr>
-            </w:r>
-          </w:p>
-        </w:tc>
-        <w:tc>
-          <w:tcPr/>
-          <w:p>
-            <w:pPr>
-              <w:jc w:val="center"/>
-              <w:rPr/>
-            </w:pPr>
-            <w:r>
-              <w:rPr>
-                <w:sz w:val="19"/>
-                <w:szCs w:val="19"/>
-                <w:rtl w:val="0"/>
-              </w:rPr>
-              <w:t xml:space="preserve">{{ lm_tri_a_a }}</w:t>
-            </w:r>
-            <w:r>
-              <w:rPr>
-                <w:rtl w:val="0"/>
-              </w:rPr>
-            </w:r>
-          </w:p>
-        </w:tc>
-        <w:tc>
-          <w:tcPr/>
-          <w:p>
-            <w:pPr>
-              <w:jc w:val="center"/>
-              <w:rPr/>
-            </w:pPr>
-            <w:r>
-              <w:rPr>
-                <w:sz w:val="19"/>
-                <w:szCs w:val="19"/>
-                <w:rtl w:val="0"/>
-              </w:rPr>
-              <w:t xml:space="preserve">{{ lm_tri_a_b }}</w:t>
-            </w:r>
-            <w:r>
-              <w:rPr>
-                <w:rtl w:val="0"/>
-              </w:rPr>
-            </w:r>
-          </w:p>
-        </w:tc>
-        <w:tc>
-          <w:tcPr/>
-          <w:p>
-            <w:pPr>
-              <w:jc w:val="center"/>
-              <w:rPr/>
-            </w:pPr>
-            <w:r>
-              <w:rPr>
-                <w:sz w:val="19"/>
-                <w:szCs w:val="19"/>
-                <w:rtl w:val="0"/>
-              </w:rPr>
-              <w:t xml:space="preserve">{{ lm_tri_a_c }}</w:t>
-            </w:r>
-            <w:r>
-              <w:rPr>
-                <w:rtl w:val="0"/>
-              </w:rPr>
-            </w:r>
-          </w:p>
-        </w:tc>
-        <w:tc>
-          <w:tcPr/>
-          <w:p>
-            <w:pPr>
-              <w:jc w:val="center"/>
-              <w:rPr/>
-            </w:pPr>
-            <w:r>
-              <w:rPr>
-                <w:sz w:val="19"/>
-                <w:szCs w:val="19"/>
-                <w:rtl w:val="0"/>
-              </w:rPr>
-              <w:t xml:space="preserve">{{ lm_tri_a_s }}</w:t>
-            </w:r>
-            <w:r>
-              <w:rPr>
-                <w:rtl w:val="0"/>
-              </w:rPr>
-            </w:r>
-          </w:p>
-        </w:tc>
-        <w:tc>
-          <w:tcPr/>
-          <w:p>
-            <w:pPr>
-              <w:jc w:val="center"/>
-              <w:rPr/>
-            </w:pPr>
-            <w:r>
-              <w:rPr>
-                <w:sz w:val="19"/>
-                <w:szCs w:val="19"/>
-                <w:rtl w:val="0"/>
-              </w:rPr>
-              <w:t xml:space="preserve">{{ lm_tri_a_sqft }}</w:t>
-            </w:r>
-            <w:r>
-              <w:rPr>
-                <w:rtl w:val="0"/>
-              </w:rPr>
-            </w:r>
-          </w:p>
-        </w:tc>
-        <w:tc>
-          <w:tcPr/>
-          <w:p>
-            <w:pPr>
-              <w:jc w:val="center"/>
-              <w:rPr/>
-            </w:pPr>
-            <w:r>
-              <w:rPr>
-                <w:sz w:val="19"/>
-                <w:szCs w:val="19"/>
-                <w:rtl w:val="0"/>
-              </w:rPr>
-              <w:t xml:space="preserve">{{ lm_tri_a_aana }}</w:t>
+              <w:t>{%tr for t in lm_triangles %}</w:t>
+            </w:r>
+            <w:r>
+              <w:rPr>
+                <w:rtl w:val="0"/>
+              </w:rPr>
+            </w:r>
+          </w:p>
+        </w:tc>
+        <w:tc>
+          <w:tcPr/>
+          <w:p>
+            <w:pPr>
+              <w:jc w:val="center"/>
+              <w:rPr/>
+            </w:pPr>
+            <w:r>
+              <w:rPr>
+                <w:sz w:val="19"/>
+                <w:szCs w:val="19"/>
+                <w:rtl w:val="0"/>
+              </w:rPr>
+            </w:r>
+            <w:r>
+              <w:rPr>
+                <w:rtl w:val="0"/>
+              </w:rPr>
+            </w:r>
+          </w:p>
+        </w:tc>
+        <w:tc>
+          <w:tcPr/>
+          <w:p>
+            <w:pPr>
+              <w:jc w:val="center"/>
+              <w:rPr/>
+            </w:pPr>
+            <w:r>
+              <w:rPr>
+                <w:sz w:val="19"/>
+                <w:szCs w:val="19"/>
+                <w:rtl w:val="0"/>
+              </w:rPr>
+            </w:r>
+            <w:r>
+              <w:rPr>
+                <w:rtl w:val="0"/>
+              </w:rPr>
+            </w:r>
+          </w:p>
+        </w:tc>
+        <w:tc>
+          <w:tcPr/>
+          <w:p>
+            <w:pPr>
+              <w:jc w:val="center"/>
+              <w:rPr/>
+            </w:pPr>
+            <w:r>
+              <w:rPr>
+                <w:sz w:val="19"/>
+                <w:szCs w:val="19"/>
+                <w:rtl w:val="0"/>
+              </w:rPr>
+            </w:r>
+            <w:r>
+              <w:rPr>
+                <w:rtl w:val="0"/>
+              </w:rPr>
+            </w:r>
+          </w:p>
+        </w:tc>
+        <w:tc>
+          <w:tcPr/>
+          <w:p>
+            <w:pPr>
+              <w:jc w:val="center"/>
+              <w:rPr/>
+            </w:pPr>
+            <w:r>
+              <w:rPr>
+                <w:sz w:val="19"/>
+                <w:szCs w:val="19"/>
+                <w:rtl w:val="0"/>
+              </w:rPr>
+            </w:r>
+            <w:r>
+              <w:rPr>
+                <w:rtl w:val="0"/>
+              </w:rPr>
+            </w:r>
+          </w:p>
+        </w:tc>
+        <w:tc>
+          <w:tcPr/>
+          <w:p>
+            <w:pPr>
+              <w:jc w:val="center"/>
+              <w:rPr/>
+            </w:pPr>
+            <w:r>
+              <w:rPr>
+                <w:sz w:val="19"/>
+                <w:szCs w:val="19"/>
+                <w:rtl w:val="0"/>
+              </w:rPr>
+            </w:r>
+            <w:r>
+              <w:rPr>
+                <w:rtl w:val="0"/>
+              </w:rPr>
+            </w:r>
+          </w:p>
+        </w:tc>
+        <w:tc>
+          <w:tcPr/>
+          <w:p>
+            <w:pPr>
+              <w:jc w:val="center"/>
+              <w:rPr/>
+            </w:pPr>
+            <w:r>
+              <w:rPr>
+                <w:sz w:val="19"/>
+                <w:szCs w:val="19"/>
+                <w:rtl w:val="0"/>
+              </w:rPr>
             </w:r>
             <w:r>
               <w:rPr>
@@ -19347,139 +19341,293 @@
                 <w:szCs w:val="19"/>
                 <w:rtl w:val="0"/>
               </w:rPr>
-              <w:t xml:space="preserve">B</w:t>
-            </w:r>
-            <w:r>
-              <w:rPr>
-                <w:rtl w:val="0"/>
-              </w:rPr>
-            </w:r>
-          </w:p>
-        </w:tc>
-        <w:tc>
-          <w:tcPr/>
-          <w:p>
-            <w:pPr>
-              <w:jc w:val="center"/>
-              <w:rPr/>
-            </w:pPr>
-            <w:r>
-              <w:rPr>
-                <w:sz w:val="19"/>
-                <w:szCs w:val="19"/>
-                <w:rtl w:val="0"/>
-              </w:rPr>
-              <w:t xml:space="preserve">{{ lm_tri_b_a }}</w:t>
-            </w:r>
-            <w:r>
-              <w:rPr>
-                <w:rtl w:val="0"/>
-              </w:rPr>
-            </w:r>
-          </w:p>
-        </w:tc>
-        <w:tc>
-          <w:tcPr/>
-          <w:p>
-            <w:pPr>
-              <w:jc w:val="center"/>
-              <w:rPr/>
-            </w:pPr>
-            <w:r>
-              <w:rPr>
-                <w:sz w:val="19"/>
-                <w:szCs w:val="19"/>
-                <w:rtl w:val="0"/>
-              </w:rPr>
-              <w:t xml:space="preserve">{{ lm_tri_b_b }}</w:t>
-            </w:r>
-            <w:r>
-              <w:rPr>
-                <w:rtl w:val="0"/>
-              </w:rPr>
-            </w:r>
-          </w:p>
-        </w:tc>
-        <w:tc>
-          <w:tcPr/>
-          <w:p>
-            <w:pPr>
-              <w:jc w:val="center"/>
-              <w:rPr/>
-            </w:pPr>
-            <w:r>
-              <w:rPr>
-                <w:sz w:val="19"/>
-                <w:szCs w:val="19"/>
-                <w:rtl w:val="0"/>
-              </w:rPr>
-              <w:t xml:space="preserve">{{ lm_tri_b_c }}</w:t>
-            </w:r>
-            <w:r>
-              <w:rPr>
-                <w:rtl w:val="0"/>
-              </w:rPr>
-            </w:r>
-          </w:p>
-        </w:tc>
-        <w:tc>
-          <w:tcPr/>
-          <w:p>
-            <w:pPr>
-              <w:jc w:val="center"/>
-              <w:rPr/>
-            </w:pPr>
-            <w:r>
-              <w:rPr>
-                <w:sz w:val="19"/>
-                <w:szCs w:val="19"/>
-                <w:rtl w:val="0"/>
-              </w:rPr>
-              <w:t xml:space="preserve">{{ lm_tri_b_s }}</w:t>
-            </w:r>
-            <w:r>
-              <w:rPr>
-                <w:rtl w:val="0"/>
-              </w:rPr>
-            </w:r>
-          </w:p>
-        </w:tc>
-        <w:tc>
-          <w:tcPr/>
-          <w:p>
-            <w:pPr>
-              <w:jc w:val="center"/>
-              <w:rPr/>
-            </w:pPr>
-            <w:r>
-              <w:rPr>
-                <w:sz w:val="19"/>
-                <w:szCs w:val="19"/>
-                <w:rtl w:val="0"/>
-              </w:rPr>
-              <w:t xml:space="preserve">{{ lm_tri_b_sqft }}</w:t>
-            </w:r>
-            <w:r>
-              <w:rPr>
-                <w:rtl w:val="0"/>
-              </w:rPr>
-            </w:r>
-          </w:p>
-        </w:tc>
-        <w:tc>
-          <w:tcPr/>
-          <w:p>
-            <w:pPr>
-              <w:jc w:val="center"/>
-              <w:rPr/>
-            </w:pPr>
-            <w:r>
-              <w:rPr>
-                <w:sz w:val="19"/>
-                <w:szCs w:val="19"/>
-                <w:rtl w:val="0"/>
-              </w:rPr>
-              <w:t xml:space="preserve">{{ lm_tri_b_aana }}</w:t>
+              <w:t>{{ t.label }}</w:t>
+            </w:r>
+            <w:r>
+              <w:rPr>
+                <w:rtl w:val="0"/>
+              </w:rPr>
+            </w:r>
+          </w:p>
+        </w:tc>
+        <w:tc>
+          <w:tcPr/>
+          <w:p>
+            <w:pPr>
+              <w:jc w:val="center"/>
+              <w:rPr/>
+            </w:pPr>
+            <w:r>
+              <w:rPr>
+                <w:sz w:val="19"/>
+                <w:szCs w:val="19"/>
+                <w:rtl w:val="0"/>
+              </w:rPr>
+              <w:t>{{ t.side_a }}</w:t>
+            </w:r>
+            <w:r>
+              <w:rPr>
+                <w:rtl w:val="0"/>
+              </w:rPr>
+            </w:r>
+          </w:p>
+        </w:tc>
+        <w:tc>
+          <w:tcPr/>
+          <w:p>
+            <w:pPr>
+              <w:jc w:val="center"/>
+              <w:rPr/>
+            </w:pPr>
+            <w:r>
+              <w:rPr>
+                <w:sz w:val="19"/>
+                <w:szCs w:val="19"/>
+                <w:rtl w:val="0"/>
+              </w:rPr>
+              <w:t>{{ t.side_b }}</w:t>
+            </w:r>
+            <w:r>
+              <w:rPr>
+                <w:rtl w:val="0"/>
+              </w:rPr>
+            </w:r>
+          </w:p>
+        </w:tc>
+        <w:tc>
+          <w:tcPr/>
+          <w:p>
+            <w:pPr>
+              <w:jc w:val="center"/>
+              <w:rPr/>
+            </w:pPr>
+            <w:r>
+              <w:rPr>
+                <w:sz w:val="19"/>
+                <w:szCs w:val="19"/>
+                <w:rtl w:val="0"/>
+              </w:rPr>
+              <w:t>{{ t.side_c }}</w:t>
+            </w:r>
+            <w:r>
+              <w:rPr>
+                <w:rtl w:val="0"/>
+              </w:rPr>
+            </w:r>
+          </w:p>
+        </w:tc>
+        <w:tc>
+          <w:tcPr/>
+          <w:p>
+            <w:pPr>
+              <w:jc w:val="center"/>
+              <w:rPr/>
+            </w:pPr>
+            <w:r>
+              <w:rPr>
+                <w:sz w:val="19"/>
+                <w:szCs w:val="19"/>
+                <w:rtl w:val="0"/>
+              </w:rPr>
+              <w:t>{{ t.semi_perimeter }}</w:t>
+            </w:r>
+            <w:r>
+              <w:rPr>
+                <w:rtl w:val="0"/>
+              </w:rPr>
+            </w:r>
+          </w:p>
+        </w:tc>
+        <w:tc>
+          <w:tcPr/>
+          <w:p>
+            <w:pPr>
+              <w:jc w:val="center"/>
+              <w:rPr/>
+            </w:pPr>
+            <w:r>
+              <w:rPr>
+                <w:sz w:val="19"/>
+                <w:szCs w:val="19"/>
+                <w:rtl w:val="0"/>
+              </w:rPr>
+              <w:t>{{ t.area_sqft }}</w:t>
+            </w:r>
+            <w:r>
+              <w:rPr>
+                <w:rtl w:val="0"/>
+              </w:rPr>
+            </w:r>
+          </w:p>
+        </w:tc>
+        <w:tc>
+          <w:tcPr/>
+          <w:p>
+            <w:pPr>
+              <w:jc w:val="center"/>
+              <w:rPr/>
+            </w:pPr>
+            <w:r>
+              <w:rPr>
+                <w:sz w:val="19"/>
+                <w:szCs w:val="19"/>
+                <w:rtl w:val="0"/>
+              </w:rPr>
+              <w:t>{{ t.aana }}</w:t>
+            </w:r>
+            <w:r>
+              <w:rPr>
+                <w:rtl w:val="0"/>
+              </w:rPr>
+            </w:r>
+          </w:p>
+        </w:tc>
+      </w:tr>
+      <w:tr>
+        <w:trPr>
+          <w:cantSplit w:val="0"/>
+          <w:tblHeader w:val="0"/>
+        </w:trPr>
+        <w:tc>
+          <w:tcPr/>
+          <w:p>
+            <w:pPr>
+              <w:jc w:val="center"/>
+              <w:rPr/>
+            </w:pPr>
+            <w:r>
+              <w:rPr>
+                <w:sz w:val="19"/>
+                <w:szCs w:val="19"/>
+                <w:rtl w:val="0"/>
+              </w:rPr>
+              <w:t>{%tr endfor %}</w:t>
+            </w:r>
+            <w:r>
+              <w:rPr>
+                <w:rtl w:val="0"/>
+              </w:rPr>
+            </w:r>
+          </w:p>
+        </w:tc>
+        <w:tc>
+          <w:tcPr/>
+          <w:p>
+            <w:pPr>
+              <w:jc w:val="center"/>
+              <w:rPr/>
+            </w:pPr>
+            <w:r>
+              <w:rPr>
+                <w:sz w:val="19"/>
+                <w:szCs w:val="19"/>
+                <w:rtl w:val="0"/>
+              </w:rPr>
+            </w:r>
+            <w:r>
+              <w:rPr>
+                <w:rtl w:val="0"/>
+              </w:rPr>
+            </w:r>
+          </w:p>
+        </w:tc>
+        <w:tc>
+          <w:tcPr/>
+          <w:p>
+            <w:pPr>
+              <w:jc w:val="center"/>
+              <w:rPr/>
+            </w:pPr>
+            <w:r>
+              <w:rPr>
+                <w:sz w:val="19"/>
+                <w:szCs w:val="19"/>
+                <w:rtl w:val="0"/>
+              </w:rPr>
+            </w:r>
+            <w:r>
+              <w:rPr>
+                <w:rtl w:val="0"/>
+              </w:rPr>
+            </w:r>
+          </w:p>
+        </w:tc>
+        <w:tc>
+          <w:tcPr/>
+          <w:p>
+            <w:pPr>
+              <w:jc w:val="center"/>
+              <w:rPr/>
+            </w:pPr>
+            <w:r>
+              <w:rPr>
+                <w:sz w:val="19"/>
+                <w:szCs w:val="19"/>
+                <w:rtl w:val="0"/>
+              </w:rPr>
+            </w:r>
+            <w:r>
+              <w:rPr>
+                <w:rtl w:val="0"/>
+              </w:rPr>
+            </w:r>
+          </w:p>
+        </w:tc>
+        <w:tc>
+          <w:tcPr/>
+          <w:p>
+            <w:pPr>
+              <w:jc w:val="center"/>
+              <w:rPr/>
+            </w:pPr>
+            <w:r>
+              <w:rPr>
+                <w:sz w:val="19"/>
+                <w:szCs w:val="19"/>
+                <w:rtl w:val="0"/>
+              </w:rPr>
+            </w:r>
+            <w:r>
+              <w:rPr>
+                <w:rtl w:val="0"/>
+              </w:rPr>
+            </w:r>
+          </w:p>
+        </w:tc>
+        <w:tc>
+          <w:tcPr/>
+          <w:p>
+            <w:pPr>
+              <w:jc w:val="center"/>
+              <w:rPr/>
+            </w:pPr>
+            <w:r>
+              <w:rPr>
+                <w:sz w:val="19"/>
+                <w:szCs w:val="19"/>
+                <w:rtl w:val="0"/>
+              </w:rPr>
+            </w:r>
+            <w:r>
+              <w:rPr>
+                <w:rtl w:val="0"/>
+              </w:rPr>
+            </w:r>
+          </w:p>
+        </w:tc>
+        <w:tc>
+          <w:tcPr/>
+          <w:p>
+            <w:pPr>
+              <w:jc w:val="center"/>
+              <w:rPr/>
+            </w:pPr>
+            <w:r>
+              <w:rPr>
+                <w:sz w:val="19"/>
+                <w:szCs w:val="19"/>
+                <w:rtl w:val="0"/>
+              </w:rPr>
             </w:r>
             <w:r>
               <w:rPr>
@@ -20261,139 +20409,133 @@
                 <w:szCs w:val="19"/>
                 <w:rtl w:val="0"/>
               </w:rPr>
-              <w:t xml:space="preserve">A</w:t>
-            </w:r>
-            <w:r>
-              <w:rPr>
-                <w:rtl w:val="0"/>
-              </w:rPr>
-            </w:r>
-          </w:p>
-        </w:tc>
-        <w:tc>
-          <w:tcPr/>
-          <w:p>
-            <w:pPr>
-              <w:jc w:val="center"/>
-              <w:rPr/>
-            </w:pPr>
-            <w:r>
-              <w:rPr>
-                <w:sz w:val="19"/>
-                <w:szCs w:val="19"/>
-                <w:rtl w:val="0"/>
-              </w:rPr>
-              <w:t xml:space="preserve">{{ ded_tri_a_a }}</w:t>
-            </w:r>
-            <w:r>
-              <w:rPr>
-                <w:rtl w:val="0"/>
-              </w:rPr>
-            </w:r>
-          </w:p>
-        </w:tc>
-        <w:tc>
-          <w:tcPr/>
-          <w:p>
-            <w:pPr>
-              <w:jc w:val="center"/>
-              <w:rPr/>
-            </w:pPr>
-            <w:r>
-              <w:rPr>
-                <w:sz w:val="19"/>
-                <w:szCs w:val="19"/>
-                <w:rtl w:val="0"/>
-              </w:rPr>
-              <w:t xml:space="preserve">{{ ded_tri_a_b }}</w:t>
-            </w:r>
-            <w:r>
-              <w:rPr>
-                <w:rtl w:val="0"/>
-              </w:rPr>
-            </w:r>
-          </w:p>
-        </w:tc>
-        <w:tc>
-          <w:tcPr/>
-          <w:p>
-            <w:pPr>
-              <w:jc w:val="center"/>
-              <w:rPr/>
-            </w:pPr>
-            <w:r>
-              <w:rPr>
-                <w:sz w:val="19"/>
-                <w:szCs w:val="19"/>
-                <w:rtl w:val="0"/>
-              </w:rPr>
-              <w:t xml:space="preserve">{{ ded_tri_a_c }}</w:t>
-            </w:r>
-            <w:r>
-              <w:rPr>
-                <w:rtl w:val="0"/>
-              </w:rPr>
-            </w:r>
-          </w:p>
-        </w:tc>
-        <w:tc>
-          <w:tcPr/>
-          <w:p>
-            <w:pPr>
-              <w:jc w:val="center"/>
-              <w:rPr/>
-            </w:pPr>
-            <w:r>
-              <w:rPr>
-                <w:sz w:val="19"/>
-                <w:szCs w:val="19"/>
-                <w:rtl w:val="0"/>
-              </w:rPr>
-              <w:t xml:space="preserve">{{ ded_tri_a_s }}</w:t>
-            </w:r>
-            <w:r>
-              <w:rPr>
-                <w:rtl w:val="0"/>
-              </w:rPr>
-            </w:r>
-          </w:p>
-        </w:tc>
-        <w:tc>
-          <w:tcPr/>
-          <w:p>
-            <w:pPr>
-              <w:jc w:val="center"/>
-              <w:rPr/>
-            </w:pPr>
-            <w:r>
-              <w:rPr>
-                <w:sz w:val="19"/>
-                <w:szCs w:val="19"/>
-                <w:rtl w:val="0"/>
-              </w:rPr>
-              <w:t xml:space="preserve">{{ ded_tri_a_sqft }}</w:t>
-            </w:r>
-            <w:r>
-              <w:rPr>
-                <w:rtl w:val="0"/>
-              </w:rPr>
-            </w:r>
-          </w:p>
-        </w:tc>
-        <w:tc>
-          <w:tcPr/>
-          <w:p>
-            <w:pPr>
-              <w:jc w:val="center"/>
-              <w:rPr/>
-            </w:pPr>
-            <w:r>
-              <w:rPr>
-                <w:sz w:val="19"/>
-                <w:szCs w:val="19"/>
-                <w:rtl w:val="0"/>
-              </w:rPr>
-              <w:t xml:space="preserve">{{ ded_tri_a_aana }}</w:t>
+              <w:t>{%tr for t in ded_triangles %}</w:t>
+            </w:r>
+            <w:r>
+              <w:rPr>
+                <w:rtl w:val="0"/>
+              </w:rPr>
+            </w:r>
+          </w:p>
+        </w:tc>
+        <w:tc>
+          <w:tcPr/>
+          <w:p>
+            <w:pPr>
+              <w:jc w:val="center"/>
+              <w:rPr/>
+            </w:pPr>
+            <w:r>
+              <w:rPr>
+                <w:sz w:val="19"/>
+                <w:szCs w:val="19"/>
+                <w:rtl w:val="0"/>
+              </w:rPr>
+            </w:r>
+            <w:r>
+              <w:rPr>
+                <w:rtl w:val="0"/>
+              </w:rPr>
+            </w:r>
+          </w:p>
+        </w:tc>
+        <w:tc>
+          <w:tcPr/>
+          <w:p>
+            <w:pPr>
+              <w:jc w:val="center"/>
+              <w:rPr/>
+            </w:pPr>
+            <w:r>
+              <w:rPr>
+                <w:sz w:val="19"/>
+                <w:szCs w:val="19"/>
+                <w:rtl w:val="0"/>
+              </w:rPr>
+            </w:r>
+            <w:r>
+              <w:rPr>
+                <w:rtl w:val="0"/>
+              </w:rPr>
+            </w:r>
+          </w:p>
+        </w:tc>
+        <w:tc>
+          <w:tcPr/>
+          <w:p>
+            <w:pPr>
+              <w:jc w:val="center"/>
+              <w:rPr/>
+            </w:pPr>
+            <w:r>
+              <w:rPr>
+                <w:sz w:val="19"/>
+                <w:szCs w:val="19"/>
+                <w:rtl w:val="0"/>
+              </w:rPr>
+            </w:r>
+            <w:r>
+              <w:rPr>
+                <w:rtl w:val="0"/>
+              </w:rPr>
+            </w:r>
+          </w:p>
+        </w:tc>
+        <w:tc>
+          <w:tcPr/>
+          <w:p>
+            <w:pPr>
+              <w:jc w:val="center"/>
+              <w:rPr/>
+            </w:pPr>
+            <w:r>
+              <w:rPr>
+                <w:sz w:val="19"/>
+                <w:szCs w:val="19"/>
+                <w:rtl w:val="0"/>
+              </w:rPr>
+            </w:r>
+            <w:r>
+              <w:rPr>
+                <w:rtl w:val="0"/>
+              </w:rPr>
+            </w:r>
+          </w:p>
+        </w:tc>
+        <w:tc>
+          <w:tcPr/>
+          <w:p>
+            <w:pPr>
+              <w:jc w:val="center"/>
+              <w:rPr/>
+            </w:pPr>
+            <w:r>
+              <w:rPr>
+                <w:sz w:val="19"/>
+                <w:szCs w:val="19"/>
+                <w:rtl w:val="0"/>
+              </w:rPr>
+            </w:r>
+            <w:r>
+              <w:rPr>
+                <w:rtl w:val="0"/>
+              </w:rPr>
+            </w:r>
+          </w:p>
+        </w:tc>
+        <w:tc>
+          <w:tcPr/>
+          <w:p>
+            <w:pPr>
+              <w:jc w:val="center"/>
+              <w:rPr/>
+            </w:pPr>
+            <w:r>
+              <w:rPr>
+                <w:sz w:val="19"/>
+                <w:szCs w:val="19"/>
+                <w:rtl w:val="0"/>
+              </w:rPr>
             </w:r>
             <w:r>
               <w:rPr>
@@ -20421,139 +20563,139 @@
                 <w:szCs w:val="19"/>
                 <w:rtl w:val="0"/>
               </w:rPr>
-              <w:t xml:space="preserve">B</w:t>
-            </w:r>
-            <w:r>
-              <w:rPr>
-                <w:rtl w:val="0"/>
-              </w:rPr>
-            </w:r>
-          </w:p>
-        </w:tc>
-        <w:tc>
-          <w:tcPr/>
-          <w:p>
-            <w:pPr>
-              <w:jc w:val="center"/>
-              <w:rPr/>
-            </w:pPr>
-            <w:r>
-              <w:rPr>
-                <w:sz w:val="19"/>
-                <w:szCs w:val="19"/>
-                <w:rtl w:val="0"/>
-              </w:rPr>
-              <w:t xml:space="preserve">{{ ded_tri_b_a }}</w:t>
-            </w:r>
-            <w:r>
-              <w:rPr>
-                <w:rtl w:val="0"/>
-              </w:rPr>
-            </w:r>
-          </w:p>
-        </w:tc>
-        <w:tc>
-          <w:tcPr/>
-          <w:p>
-            <w:pPr>
-              <w:jc w:val="center"/>
-              <w:rPr/>
-            </w:pPr>
-            <w:r>
-              <w:rPr>
-                <w:sz w:val="19"/>
-                <w:szCs w:val="19"/>
-                <w:rtl w:val="0"/>
-              </w:rPr>
-              <w:t xml:space="preserve">{{ ded_tri_b_b }}</w:t>
-            </w:r>
-            <w:r>
-              <w:rPr>
-                <w:rtl w:val="0"/>
-              </w:rPr>
-            </w:r>
-          </w:p>
-        </w:tc>
-        <w:tc>
-          <w:tcPr/>
-          <w:p>
-            <w:pPr>
-              <w:jc w:val="center"/>
-              <w:rPr/>
-            </w:pPr>
-            <w:r>
-              <w:rPr>
-                <w:sz w:val="19"/>
-                <w:szCs w:val="19"/>
-                <w:rtl w:val="0"/>
-              </w:rPr>
-              <w:t xml:space="preserve">{{ ded_tri_b_c }}</w:t>
-            </w:r>
-            <w:r>
-              <w:rPr>
-                <w:rtl w:val="0"/>
-              </w:rPr>
-            </w:r>
-          </w:p>
-        </w:tc>
-        <w:tc>
-          <w:tcPr/>
-          <w:p>
-            <w:pPr>
-              <w:jc w:val="center"/>
-              <w:rPr/>
-            </w:pPr>
-            <w:r>
-              <w:rPr>
-                <w:sz w:val="19"/>
-                <w:szCs w:val="19"/>
-                <w:rtl w:val="0"/>
-              </w:rPr>
-              <w:t xml:space="preserve">{{ ded_tri_b_s }}</w:t>
-            </w:r>
-            <w:r>
-              <w:rPr>
-                <w:rtl w:val="0"/>
-              </w:rPr>
-            </w:r>
-          </w:p>
-        </w:tc>
-        <w:tc>
-          <w:tcPr/>
-          <w:p>
-            <w:pPr>
-              <w:jc w:val="center"/>
-              <w:rPr/>
-            </w:pPr>
-            <w:r>
-              <w:rPr>
-                <w:sz w:val="19"/>
-                <w:szCs w:val="19"/>
-                <w:rtl w:val="0"/>
-              </w:rPr>
-              <w:t xml:space="preserve">{{ ded_tri_b_sqft }}</w:t>
-            </w:r>
-            <w:r>
-              <w:rPr>
-                <w:rtl w:val="0"/>
-              </w:rPr>
-            </w:r>
-          </w:p>
-        </w:tc>
-        <w:tc>
-          <w:tcPr/>
-          <w:p>
-            <w:pPr>
-              <w:jc w:val="center"/>
-              <w:rPr/>
-            </w:pPr>
-            <w:r>
-              <w:rPr>
-                <w:sz w:val="19"/>
-                <w:szCs w:val="19"/>
-                <w:rtl w:val="0"/>
-              </w:rPr>
-              <w:t xml:space="preserve">{{ ded_tri_b_aana }}</w:t>
+              <w:t>{{ t.label }}</w:t>
+            </w:r>
+            <w:r>
+              <w:rPr>
+                <w:rtl w:val="0"/>
+              </w:rPr>
+            </w:r>
+          </w:p>
+        </w:tc>
+        <w:tc>
+          <w:tcPr/>
+          <w:p>
+            <w:pPr>
+              <w:jc w:val="center"/>
+              <w:rPr/>
+            </w:pPr>
+            <w:r>
+              <w:rPr>
+                <w:sz w:val="19"/>
+                <w:szCs w:val="19"/>
+                <w:rtl w:val="0"/>
+              </w:rPr>
+              <w:t>{{ t.side_a }}</w:t>
+            </w:r>
+            <w:r>
+              <w:rPr>
+                <w:rtl w:val="0"/>
+              </w:rPr>
+            </w:r>
+          </w:p>
+        </w:tc>
+        <w:tc>
+          <w:tcPr/>
+          <w:p>
+            <w:pPr>
+              <w:jc w:val="center"/>
+              <w:rPr/>
+            </w:pPr>
+            <w:r>
+              <w:rPr>
+                <w:sz w:val="19"/>
+                <w:szCs w:val="19"/>
+                <w:rtl w:val="0"/>
+              </w:rPr>
+              <w:t>{{ t.side_b }}</w:t>
+            </w:r>
+            <w:r>
+              <w:rPr>
+                <w:rtl w:val="0"/>
+              </w:rPr>
+            </w:r>
+          </w:p>
+        </w:tc>
+        <w:tc>
+          <w:tcPr/>
+          <w:p>
+            <w:pPr>
+              <w:jc w:val="center"/>
+              <w:rPr/>
+            </w:pPr>
+            <w:r>
+              <w:rPr>
+                <w:sz w:val="19"/>
+                <w:szCs w:val="19"/>
+                <w:rtl w:val="0"/>
+              </w:rPr>
+              <w:t>{{ t.side_c }}</w:t>
+            </w:r>
+            <w:r>
+              <w:rPr>
+                <w:rtl w:val="0"/>
+              </w:rPr>
+            </w:r>
+          </w:p>
+        </w:tc>
+        <w:tc>
+          <w:tcPr/>
+          <w:p>
+            <w:pPr>
+              <w:jc w:val="center"/>
+              <w:rPr/>
+            </w:pPr>
+            <w:r>
+              <w:rPr>
+                <w:sz w:val="19"/>
+                <w:szCs w:val="19"/>
+                <w:rtl w:val="0"/>
+              </w:rPr>
+              <w:t>{{ t.semi_perimeter }}</w:t>
+            </w:r>
+            <w:r>
+              <w:rPr>
+                <w:rtl w:val="0"/>
+              </w:rPr>
+            </w:r>
+          </w:p>
+        </w:tc>
+        <w:tc>
+          <w:tcPr/>
+          <w:p>
+            <w:pPr>
+              <w:jc w:val="center"/>
+              <w:rPr/>
+            </w:pPr>
+            <w:r>
+              <w:rPr>
+                <w:sz w:val="19"/>
+                <w:szCs w:val="19"/>
+                <w:rtl w:val="0"/>
+              </w:rPr>
+              <w:t>{{ t.area_sqft }}</w:t>
+            </w:r>
+            <w:r>
+              <w:rPr>
+                <w:rtl w:val="0"/>
+              </w:rPr>
+            </w:r>
+          </w:p>
+        </w:tc>
+        <w:tc>
+          <w:tcPr/>
+          <w:p>
+            <w:pPr>
+              <w:jc w:val="center"/>
+              <w:rPr/>
+            </w:pPr>
+            <w:r>
+              <w:rPr>
+                <w:sz w:val="19"/>
+                <w:szCs w:val="19"/>
+                <w:rtl w:val="0"/>
+              </w:rPr>
+              <w:t>{{ t.aana }}</w:t>
             </w:r>
             <w:r>
               <w:rPr>
@@ -20577,99 +20719,138 @@
             </w:pPr>
             <w:r>
               <w:rPr>
-                <w:rtl w:val="0"/>
-              </w:rPr>
-            </w:r>
-          </w:p>
-        </w:tc>
-        <w:tc>
-          <w:tcPr/>
-          <w:p>
-            <w:pPr>
-              <w:jc w:val="center"/>
-              <w:rPr/>
-            </w:pPr>
-            <w:r>
-              <w:rPr>
-                <w:rtl w:val="0"/>
-              </w:rPr>
-            </w:r>
-          </w:p>
-        </w:tc>
-        <w:tc>
-          <w:tcPr/>
-          <w:p>
-            <w:pPr>
-              <w:jc w:val="center"/>
-              <w:rPr/>
-            </w:pPr>
-            <w:r>
-              <w:rPr>
-                <w:rtl w:val="0"/>
-              </w:rPr>
-            </w:r>
-          </w:p>
-        </w:tc>
-        <w:tc>
-          <w:tcPr/>
-          <w:p>
-            <w:pPr>
-              <w:jc w:val="center"/>
-              <w:rPr/>
-            </w:pPr>
-            <w:r>
-              <w:rPr>
-                <w:rtl w:val="0"/>
-              </w:rPr>
-            </w:r>
-          </w:p>
-        </w:tc>
-        <w:tc>
-          <w:tcPr/>
-          <w:p>
-            <w:pPr>
-              <w:jc w:val="center"/>
-              <w:rPr/>
-            </w:pPr>
-            <w:r>
-              <w:rPr>
-                <w:rtl w:val="0"/>
-              </w:rPr>
-              <w:t xml:space="preserve">Total =</w:t>
-            </w:r>
-          </w:p>
-        </w:tc>
-        <w:tc>
-          <w:tcPr/>
-          <w:p>
-            <w:pPr>
-              <w:jc w:val="center"/>
-              <w:rPr/>
-            </w:pPr>
-            <w:r>
-              <w:rPr>
-                <w:b w:val="1"/>
-                <w:bCs w:val="1"/>
-                <w:sz w:val="19"/>
-                <w:szCs w:val="19"/>
-                <w:rtl w:val="0"/>
-              </w:rPr>
-              <w:t xml:space="preserve">{{ ded_total_sqft }}</w:t>
-            </w:r>
-            <w:r>
-              <w:rPr>
-                <w:rtl w:val="0"/>
-              </w:rPr>
-            </w:r>
-          </w:p>
-        </w:tc>
-        <w:tc>
-          <w:tcPr/>
-          <w:p>
-            <w:pPr>
-              <w:jc w:val="center"/>
-              <w:rPr/>
-            </w:pPr>
+                <w:sz w:val="19"/>
+                <w:szCs w:val="19"/>
+                <w:rtl w:val="0"/>
+              </w:rPr>
+              <w:t>{%tr endfor %}</w:t>
+            </w:r>
+            <w:r>
+              <w:rPr>
+                <w:rtl w:val="0"/>
+              </w:rPr>
+            </w:r>
+          </w:p>
+        </w:tc>
+        <w:tc>
+          <w:tcPr/>
+          <w:p>
+            <w:pPr>
+              <w:jc w:val="center"/>
+              <w:rPr/>
+            </w:pPr>
+            <w:r>
+              <w:rPr>
+                <w:sz w:val="19"/>
+                <w:szCs w:val="19"/>
+                <w:rtl w:val="0"/>
+              </w:rPr>
+            </w:r>
+            <w:r>
+              <w:rPr>
+                <w:rtl w:val="0"/>
+              </w:rPr>
+            </w:r>
+          </w:p>
+        </w:tc>
+        <w:tc>
+          <w:tcPr/>
+          <w:p>
+            <w:pPr>
+              <w:jc w:val="center"/>
+              <w:rPr/>
+            </w:pPr>
+            <w:r>
+              <w:rPr>
+                <w:sz w:val="19"/>
+                <w:szCs w:val="19"/>
+                <w:rtl w:val="0"/>
+              </w:rPr>
+            </w:r>
+            <w:r>
+              <w:rPr>
+                <w:rtl w:val="0"/>
+              </w:rPr>
+            </w:r>
+          </w:p>
+        </w:tc>
+        <w:tc>
+          <w:tcPr/>
+          <w:p>
+            <w:pPr>
+              <w:jc w:val="center"/>
+              <w:rPr/>
+            </w:pPr>
+            <w:r>
+              <w:rPr>
+                <w:sz w:val="19"/>
+                <w:szCs w:val="19"/>
+                <w:rtl w:val="0"/>
+              </w:rPr>
+            </w:r>
+            <w:r>
+              <w:rPr>
+                <w:rtl w:val="0"/>
+              </w:rPr>
+            </w:r>
+          </w:p>
+        </w:tc>
+        <w:tc>
+          <w:tcPr/>
+          <w:p>
+            <w:pPr>
+              <w:jc w:val="center"/>
+              <w:rPr/>
+            </w:pPr>
+            <w:r>
+              <w:rPr>
+                <w:sz w:val="19"/>
+                <w:szCs w:val="19"/>
+                <w:rtl w:val="0"/>
+              </w:rPr>
+            </w:r>
+            <w:r>
+              <w:rPr>
+                <w:rtl w:val="0"/>
+              </w:rPr>
+            </w:r>
+          </w:p>
+        </w:tc>
+        <w:tc>
+          <w:tcPr/>
+          <w:p>
+            <w:pPr>
+              <w:jc w:val="center"/>
+              <w:rPr/>
+            </w:pPr>
+            <w:r>
+              <w:rPr>
+                <w:sz w:val="19"/>
+                <w:szCs w:val="19"/>
+                <w:rtl w:val="0"/>
+              </w:rPr>
+            </w:r>
+            <w:r>
+              <w:rPr>
+                <w:rtl w:val="0"/>
+              </w:rPr>
+            </w:r>
+          </w:p>
+        </w:tc>
+        <w:tc>
+          <w:tcPr/>
+          <w:p>
+            <w:pPr>
+              <w:jc w:val="center"/>
+              <w:rPr/>
+            </w:pPr>
+            <w:r>
+              <w:rPr>
+                <w:sz w:val="19"/>
+                <w:szCs w:val="19"/>
+                <w:rtl w:val="0"/>
+              </w:rPr>
+            </w:r>
             <w:r>
               <w:rPr>
                 <w:rtl w:val="0"/>
@@ -20750,7 +20931,7 @@
               <w:rPr>
                 <w:rtl w:val="0"/>
               </w:rPr>
-              <w:t xml:space="preserve">TOTAL =</w:t>
+              <w:t xml:space="preserve">Total =</w:t>
             </w:r>
           </w:p>
         </w:tc>
@@ -20809,63 +20990,63 @@
               <w:rPr>
                 <w:rtl w:val="0"/>
               </w:rPr>
-            </w:r>
-          </w:p>
-        </w:tc>
-        <w:tc>
-          <w:tcPr/>
-          <w:p>
-            <w:pPr>
-              <w:jc w:val="center"/>
-              <w:rPr/>
-            </w:pPr>
-            <w:r>
-              <w:rPr>
-                <w:rtl w:val="0"/>
-              </w:rPr>
-            </w:r>
-          </w:p>
-        </w:tc>
-        <w:tc>
-          <w:tcPr/>
-          <w:p>
-            <w:pPr>
-              <w:jc w:val="center"/>
-              <w:rPr/>
-            </w:pPr>
-            <w:r>
-              <w:rPr>
-                <w:rtl w:val="0"/>
-              </w:rPr>
-            </w:r>
-          </w:p>
-        </w:tc>
-        <w:tc>
-          <w:tcPr/>
-          <w:p>
-            <w:pPr>
-              <w:jc w:val="center"/>
-              <w:rPr/>
-            </w:pPr>
-            <w:r>
-              <w:rPr>
-                <w:rtl w:val="0"/>
-              </w:rPr>
-            </w:r>
-          </w:p>
-        </w:tc>
-        <w:tc>
-          <w:tcPr/>
-          <w:p>
-            <w:pPr>
-              <w:jc w:val="center"/>
-              <w:rPr/>
-            </w:pPr>
-            <w:r>
-              <w:rPr>
-                <w:rtl w:val="0"/>
-              </w:rPr>
-              <w:t xml:space="preserve">Area in Sqm.</w:t>
+              <w:t>{{ ded_deduct_pct }}% Area Deducted For Land Development</w:t>
+            </w:r>
+          </w:p>
+        </w:tc>
+        <w:tc>
+          <w:tcPr/>
+          <w:p>
+            <w:pPr>
+              <w:jc w:val="center"/>
+              <w:rPr/>
+            </w:pPr>
+            <w:r>
+              <w:rPr>
+                <w:rtl w:val="0"/>
+              </w:rPr>
+            </w:r>
+          </w:p>
+        </w:tc>
+        <w:tc>
+          <w:tcPr/>
+          <w:p>
+            <w:pPr>
+              <w:jc w:val="center"/>
+              <w:rPr/>
+            </w:pPr>
+            <w:r>
+              <w:rPr>
+                <w:rtl w:val="0"/>
+              </w:rPr>
+            </w:r>
+          </w:p>
+        </w:tc>
+        <w:tc>
+          <w:tcPr/>
+          <w:p>
+            <w:pPr>
+              <w:jc w:val="center"/>
+              <w:rPr/>
+            </w:pPr>
+            <w:r>
+              <w:rPr>
+                <w:rtl w:val="0"/>
+              </w:rPr>
+            </w:r>
+          </w:p>
+        </w:tc>
+        <w:tc>
+          <w:tcPr/>
+          <w:p>
+            <w:pPr>
+              <w:jc w:val="center"/>
+              <w:rPr/>
+            </w:pPr>
+            <w:r>
+              <w:rPr>
+                <w:rtl w:val="0"/>
+              </w:rPr>
             </w:r>
           </w:p>
         </w:tc>
@@ -20884,7 +21065,237 @@
                 <w:szCs w:val="19"/>
                 <w:rtl w:val="0"/>
               </w:rPr>
-              <w:t xml:space="preserve">{{ ded_total_sqm }}</w:t>
+              <w:t>{{ ded_deduct_sqft }}</w:t>
+            </w:r>
+            <w:r>
+              <w:rPr>
+                <w:rtl w:val="0"/>
+              </w:rPr>
+            </w:r>
+          </w:p>
+        </w:tc>
+        <w:tc>
+          <w:tcPr/>
+          <w:p>
+            <w:pPr>
+              <w:jc w:val="center"/>
+              <w:rPr/>
+            </w:pPr>
+            <w:r>
+              <w:rPr>
+                <w:rtl w:val="0"/>
+              </w:rPr>
+            </w:r>
+          </w:p>
+        </w:tc>
+      </w:tr>
+      <w:tr>
+        <w:trPr>
+          <w:cantSplit w:val="0"/>
+          <w:tblHeader w:val="0"/>
+        </w:trPr>
+        <w:tc>
+          <w:tcPr/>
+          <w:p>
+            <w:pPr>
+              <w:jc w:val="center"/>
+              <w:rPr/>
+            </w:pPr>
+            <w:r>
+              <w:rPr>
+                <w:rtl w:val="0"/>
+              </w:rPr>
+            </w:r>
+          </w:p>
+        </w:tc>
+        <w:tc>
+          <w:tcPr/>
+          <w:p>
+            <w:pPr>
+              <w:jc w:val="center"/>
+              <w:rPr/>
+            </w:pPr>
+            <w:r>
+              <w:rPr>
+                <w:rtl w:val="0"/>
+              </w:rPr>
+            </w:r>
+          </w:p>
+        </w:tc>
+        <w:tc>
+          <w:tcPr/>
+          <w:p>
+            <w:pPr>
+              <w:jc w:val="center"/>
+              <w:rPr/>
+            </w:pPr>
+            <w:r>
+              <w:rPr>
+                <w:rtl w:val="0"/>
+              </w:rPr>
+            </w:r>
+          </w:p>
+        </w:tc>
+        <w:tc>
+          <w:tcPr/>
+          <w:p>
+            <w:pPr>
+              <w:jc w:val="center"/>
+              <w:rPr/>
+            </w:pPr>
+            <w:r>
+              <w:rPr>
+                <w:rtl w:val="0"/>
+              </w:rPr>
+            </w:r>
+          </w:p>
+        </w:tc>
+        <w:tc>
+          <w:tcPr/>
+          <w:p>
+            <w:pPr>
+              <w:jc w:val="center"/>
+              <w:rPr/>
+            </w:pPr>
+            <w:r>
+              <w:rPr>
+                <w:rtl w:val="0"/>
+              </w:rPr>
+              <w:t>TOTAL =</w:t>
+            </w:r>
+          </w:p>
+        </w:tc>
+        <w:tc>
+          <w:tcPr/>
+          <w:p>
+            <w:pPr>
+              <w:jc w:val="center"/>
+              <w:rPr/>
+            </w:pPr>
+            <w:r>
+              <w:rPr>
+                <w:b w:val="1"/>
+                <w:bCs w:val="1"/>
+                <w:sz w:val="19"/>
+                <w:szCs w:val="19"/>
+                <w:rtl w:val="0"/>
+              </w:rPr>
+              <w:t>{{ ded_after_sqft }}</w:t>
+            </w:r>
+            <w:r>
+              <w:rPr>
+                <w:rtl w:val="0"/>
+              </w:rPr>
+            </w:r>
+          </w:p>
+        </w:tc>
+        <w:tc>
+          <w:tcPr/>
+          <w:p>
+            <w:pPr>
+              <w:jc w:val="center"/>
+              <w:rPr/>
+            </w:pPr>
+            <w:r>
+              <w:rPr>
+                <w:rtl w:val="0"/>
+              </w:rPr>
+            </w:r>
+          </w:p>
+        </w:tc>
+      </w:tr>
+      <w:tr>
+        <w:trPr>
+          <w:cantSplit w:val="0"/>
+          <w:tblHeader w:val="0"/>
+        </w:trPr>
+        <w:tc>
+          <w:tcPr/>
+          <w:p>
+            <w:pPr>
+              <w:jc w:val="center"/>
+              <w:rPr/>
+            </w:pPr>
+            <w:r>
+              <w:rPr>
+                <w:rtl w:val="0"/>
+              </w:rPr>
+            </w:r>
+          </w:p>
+        </w:tc>
+        <w:tc>
+          <w:tcPr/>
+          <w:p>
+            <w:pPr>
+              <w:jc w:val="center"/>
+              <w:rPr/>
+            </w:pPr>
+            <w:r>
+              <w:rPr>
+                <w:rtl w:val="0"/>
+              </w:rPr>
+            </w:r>
+          </w:p>
+        </w:tc>
+        <w:tc>
+          <w:tcPr/>
+          <w:p>
+            <w:pPr>
+              <w:jc w:val="center"/>
+              <w:rPr/>
+            </w:pPr>
+            <w:r>
+              <w:rPr>
+                <w:rtl w:val="0"/>
+              </w:rPr>
+            </w:r>
+          </w:p>
+        </w:tc>
+        <w:tc>
+          <w:tcPr/>
+          <w:p>
+            <w:pPr>
+              <w:jc w:val="center"/>
+              <w:rPr/>
+            </w:pPr>
+            <w:r>
+              <w:rPr>
+                <w:rtl w:val="0"/>
+              </w:rPr>
+            </w:r>
+          </w:p>
+        </w:tc>
+        <w:tc>
+          <w:tcPr/>
+          <w:p>
+            <w:pPr>
+              <w:jc w:val="center"/>
+              <w:rPr/>
+            </w:pPr>
+            <w:r>
+              <w:rPr>
+                <w:rtl w:val="0"/>
+              </w:rPr>
+              <w:t>Area in Sqm.</w:t>
+            </w:r>
+          </w:p>
+        </w:tc>
+        <w:tc>
+          <w:tcPr/>
+          <w:p>
+            <w:pPr>
+              <w:jc w:val="center"/>
+              <w:rPr/>
+            </w:pPr>
+            <w:r>
+              <w:rPr>
+                <w:b w:val="1"/>
+                <w:bCs w:val="1"/>
+                <w:sz w:val="19"/>
+                <w:szCs w:val="19"/>
+                <w:rtl w:val="0"/>
+              </w:rPr>
+              <w:t>{{ ded_after_sqm }}</w:t>
             </w:r>
             <w:r>
               <w:rPr>
@@ -21005,7 +21416,7 @@
                 <w:szCs w:val="19"/>
                 <w:rtl w:val="0"/>
               </w:rPr>
-              <w:t xml:space="preserve">Location</w:t>
+              <w:t>Triangle</w:t>
             </w:r>
             <w:r>
               <w:rPr>
@@ -21032,7 +21443,7 @@
                 <w:szCs w:val="19"/>
                 <w:rtl w:val="0"/>
               </w:rPr>
-              <w:t xml:space="preserve">Plot No.</w:t>
+              <w:t>Side a</w:t>
             </w:r>
             <w:r>
               <w:rPr>
@@ -21059,7 +21470,7 @@
                 <w:szCs w:val="19"/>
                 <w:rtl w:val="0"/>
               </w:rPr>
-              <w:t xml:space="preserve">Ropani</w:t>
+              <w:t>Side b</w:t>
             </w:r>
             <w:r>
               <w:rPr>
@@ -21086,7 +21497,7 @@
                 <w:szCs w:val="19"/>
                 <w:rtl w:val="0"/>
               </w:rPr>
-              <w:t xml:space="preserve">Anna</w:t>
+              <w:t>Side c</w:t>
             </w:r>
             <w:r>
               <w:rPr>
@@ -21113,7 +21524,7 @@
                 <w:szCs w:val="19"/>
                 <w:rtl w:val="0"/>
               </w:rPr>
-              <w:t xml:space="preserve">Paisa</w:t>
+              <w:t>S=(a+b+c)/2</w:t>
             </w:r>
             <w:r>
               <w:rPr>
@@ -21140,7 +21551,7 @@
                 <w:szCs w:val="19"/>
                 <w:rtl w:val="0"/>
               </w:rPr>
-              <w:t xml:space="preserve">Dam</w:t>
+              <w:t>Total area in Sqft.</w:t>
             </w:r>
             <w:r>
               <w:rPr>
@@ -21167,7 +21578,7 @@
                 <w:szCs w:val="19"/>
                 <w:rtl w:val="0"/>
               </w:rPr>
-              <w:t xml:space="preserve">Area in Sq.ft.</w:t>
+              <w:t>Land in Aana</w:t>
             </w:r>
             <w:r>
               <w:rPr>
@@ -21183,151 +21594,649 @@
           <w:tblHeader w:val="0"/>
         </w:trPr>
         <w:tc>
-          <w:tcPr/>
-          <w:p>
-            <w:pPr>
-              <w:jc w:val="center"/>
-              <w:rPr/>
-            </w:pPr>
-            <w:r>
-              <w:rPr>
-                <w:sz w:val="19"/>
-                <w:szCs w:val="19"/>
-                <w:rtl w:val="0"/>
-              </w:rPr>
-              <w:t xml:space="preserve">{{ property_location_full }}</w:t>
-            </w:r>
-            <w:r>
-              <w:rPr>
-                <w:rtl w:val="0"/>
-              </w:rPr>
-            </w:r>
-          </w:p>
-        </w:tc>
-        <w:tc>
-          <w:tcPr/>
-          <w:p>
-            <w:pPr>
-              <w:jc w:val="center"/>
-              <w:rPr/>
-            </w:pPr>
-            <w:r>
-              <w:rPr>
-                <w:sz w:val="19"/>
-                <w:szCs w:val="19"/>
-                <w:rtl w:val="0"/>
-              </w:rPr>
-              <w:t xml:space="preserve">{{ plot_no }}</w:t>
-            </w:r>
-            <w:r>
-              <w:rPr>
-                <w:rtl w:val="0"/>
-              </w:rPr>
-            </w:r>
-          </w:p>
-        </w:tc>
-        <w:tc>
-          <w:tcPr/>
-          <w:p>
-            <w:pPr>
-              <w:jc w:val="center"/>
-              <w:rPr/>
-            </w:pPr>
-            <w:r>
-              <w:rPr>
-                <w:sz w:val="19"/>
-                <w:szCs w:val="19"/>
-                <w:rtl w:val="0"/>
-              </w:rPr>
-              <w:t xml:space="preserve">{{ lorc_r }}</w:t>
-            </w:r>
-            <w:r>
-              <w:rPr>
-                <w:rtl w:val="0"/>
-              </w:rPr>
-            </w:r>
-          </w:p>
-        </w:tc>
-        <w:tc>
-          <w:tcPr/>
-          <w:p>
-            <w:pPr>
-              <w:jc w:val="center"/>
-              <w:rPr/>
-            </w:pPr>
-            <w:r>
-              <w:rPr>
-                <w:sz w:val="19"/>
-                <w:szCs w:val="19"/>
-                <w:rtl w:val="0"/>
-              </w:rPr>
-              <w:t xml:space="preserve">{{ lorc_a }}</w:t>
-            </w:r>
-            <w:r>
-              <w:rPr>
-                <w:rtl w:val="0"/>
-              </w:rPr>
-            </w:r>
-          </w:p>
-        </w:tc>
-        <w:tc>
-          <w:tcPr/>
-          <w:p>
-            <w:pPr>
-              <w:jc w:val="center"/>
-              <w:rPr/>
-            </w:pPr>
-            <w:r>
-              <w:rPr>
-                <w:sz w:val="19"/>
-                <w:szCs w:val="19"/>
-                <w:rtl w:val="0"/>
-              </w:rPr>
-              <w:t xml:space="preserve">{{ lorc_p }}</w:t>
-            </w:r>
-            <w:r>
-              <w:rPr>
-                <w:rtl w:val="0"/>
-              </w:rPr>
-            </w:r>
-          </w:p>
-        </w:tc>
-        <w:tc>
-          <w:tcPr/>
-          <w:p>
-            <w:pPr>
-              <w:jc w:val="center"/>
-              <w:rPr/>
-            </w:pPr>
-            <w:r>
-              <w:rPr>
-                <w:sz w:val="19"/>
-                <w:szCs w:val="19"/>
-                <w:rtl w:val="0"/>
-              </w:rPr>
-              <w:t xml:space="preserve">{{ lorc_d }}</w:t>
-            </w:r>
-            <w:r>
-              <w:rPr>
-                <w:rtl w:val="0"/>
-              </w:rPr>
-            </w:r>
-          </w:p>
-        </w:tc>
-        <w:tc>
-          <w:tcPr/>
-          <w:p>
-            <w:pPr>
-              <w:jc w:val="center"/>
-              <w:rPr/>
-            </w:pPr>
-            <w:r>
-              <w:rPr>
-                <w:sz w:val="19"/>
-                <w:szCs w:val="19"/>
-                <w:rtl w:val="0"/>
-              </w:rPr>
-              <w:t xml:space="preserve">{{ land_area_lorc_sqft }}</w:t>
+          <w:tcPr>
+            <w:shd w:fill="1f3a2e" w:val="clear"/>
+          </w:tcPr>
+          <w:p>
+            <w:pPr>
+              <w:jc w:val="center"/>
+              <w:rPr/>
+            </w:pPr>
+            <w:r>
+              <w:rPr>
+                <w:b w:val="1"/>
+                <w:bCs w:val="1"/>
+                <w:color w:val="ffffff"/>
+                <w:sz w:val="19"/>
+                <w:szCs w:val="19"/>
+                <w:rtl w:val="0"/>
+              </w:rPr>
+              <w:t>Plot No.</w:t>
+            </w:r>
+            <w:r>
+              <w:rPr>
+                <w:rtl w:val="0"/>
+              </w:rPr>
+            </w:r>
+          </w:p>
+        </w:tc>
+        <w:tc>
+          <w:tcPr>
+            <w:shd w:fill="1f3a2e" w:val="clear"/>
+          </w:tcPr>
+          <w:p>
+            <w:pPr>
+              <w:jc w:val="center"/>
+              <w:rPr/>
+            </w:pPr>
+            <w:r>
+              <w:rPr>
+                <w:b w:val="1"/>
+                <w:bCs w:val="1"/>
+                <w:color w:val="ffffff"/>
+                <w:sz w:val="19"/>
+                <w:szCs w:val="19"/>
+                <w:rtl w:val="0"/>
+              </w:rPr>
+              <w:t>{{ plot_no }}</w:t>
+            </w:r>
+            <w:r>
+              <w:rPr>
+                <w:rtl w:val="0"/>
+              </w:rPr>
+            </w:r>
+          </w:p>
+        </w:tc>
+        <w:tc>
+          <w:tcPr>
+            <w:shd w:fill="1f3a2e" w:val="clear"/>
+          </w:tcPr>
+          <w:p>
+            <w:pPr>
+              <w:jc w:val="center"/>
+              <w:rPr/>
+            </w:pPr>
+            <w:r>
+              <w:rPr>
+                <w:b w:val="1"/>
+                <w:bCs w:val="1"/>
+                <w:color w:val="ffffff"/>
+                <w:sz w:val="19"/>
+                <w:szCs w:val="19"/>
+                <w:rtl w:val="0"/>
+              </w:rPr>
+            </w:r>
+            <w:r>
+              <w:rPr>
+                <w:rtl w:val="0"/>
+              </w:rPr>
+            </w:r>
+          </w:p>
+        </w:tc>
+        <w:tc>
+          <w:tcPr>
+            <w:shd w:fill="1f3a2e" w:val="clear"/>
+          </w:tcPr>
+          <w:p>
+            <w:pPr>
+              <w:jc w:val="center"/>
+              <w:rPr/>
+            </w:pPr>
+            <w:r>
+              <w:rPr>
+                <w:b w:val="1"/>
+                <w:bCs w:val="1"/>
+                <w:color w:val="ffffff"/>
+                <w:sz w:val="19"/>
+                <w:szCs w:val="19"/>
+                <w:rtl w:val="0"/>
+              </w:rPr>
+            </w:r>
+            <w:r>
+              <w:rPr>
+                <w:rtl w:val="0"/>
+              </w:rPr>
+            </w:r>
+          </w:p>
+        </w:tc>
+        <w:tc>
+          <w:tcPr>
+            <w:shd w:fill="1f3a2e" w:val="clear"/>
+          </w:tcPr>
+          <w:p>
+            <w:pPr>
+              <w:jc w:val="center"/>
+              <w:rPr/>
+            </w:pPr>
+            <w:r>
+              <w:rPr>
+                <w:b w:val="1"/>
+                <w:bCs w:val="1"/>
+                <w:color w:val="ffffff"/>
+                <w:sz w:val="19"/>
+                <w:szCs w:val="19"/>
+                <w:rtl w:val="0"/>
+              </w:rPr>
+            </w:r>
+            <w:r>
+              <w:rPr>
+                <w:rtl w:val="0"/>
+              </w:rPr>
+            </w:r>
+          </w:p>
+        </w:tc>
+        <w:tc>
+          <w:tcPr>
+            <w:shd w:fill="1f3a2e" w:val="clear"/>
+          </w:tcPr>
+          <w:p>
+            <w:pPr>
+              <w:jc w:val="center"/>
+              <w:rPr/>
+            </w:pPr>
+            <w:r>
+              <w:rPr>
+                <w:b w:val="1"/>
+                <w:bCs w:val="1"/>
+                <w:color w:val="ffffff"/>
+                <w:sz w:val="19"/>
+                <w:szCs w:val="19"/>
+                <w:rtl w:val="0"/>
+              </w:rPr>
+            </w:r>
+            <w:r>
+              <w:rPr>
+                <w:rtl w:val="0"/>
+              </w:rPr>
+            </w:r>
+          </w:p>
+        </w:tc>
+        <w:tc>
+          <w:tcPr>
+            <w:shd w:fill="1f3a2e" w:val="clear"/>
+          </w:tcPr>
+          <w:p>
+            <w:pPr>
+              <w:jc w:val="center"/>
+              <w:rPr/>
+            </w:pPr>
+            <w:r>
+              <w:rPr>
+                <w:b w:val="1"/>
+                <w:bCs w:val="1"/>
+                <w:color w:val="ffffff"/>
+                <w:sz w:val="19"/>
+                <w:szCs w:val="19"/>
+                <w:rtl w:val="0"/>
+              </w:rPr>
+            </w:r>
+            <w:r>
+              <w:rPr>
+                <w:rtl w:val="0"/>
+              </w:rPr>
+            </w:r>
+          </w:p>
+        </w:tc>
+      </w:tr>
+      <w:tr>
+        <w:trPr>
+          <w:cantSplit w:val="0"/>
+          <w:tblHeader w:val="0"/>
+        </w:trPr>
+        <w:tc>
+          <w:tcPr/>
+          <w:p>
+            <w:pPr>
+              <w:jc w:val="center"/>
+              <w:rPr/>
+            </w:pPr>
+            <w:r>
+              <w:rPr>
+                <w:sz w:val="19"/>
+                <w:szCs w:val="19"/>
+                <w:rtl w:val="0"/>
+              </w:rPr>
+              <w:t>{%tr for t in lorc_triangles %}</w:t>
+            </w:r>
+            <w:r>
+              <w:rPr>
+                <w:rtl w:val="0"/>
+              </w:rPr>
+            </w:r>
+          </w:p>
+        </w:tc>
+        <w:tc>
+          <w:tcPr/>
+          <w:p>
+            <w:pPr>
+              <w:jc w:val="center"/>
+              <w:rPr/>
+            </w:pPr>
+            <w:r>
+              <w:rPr>
+                <w:sz w:val="19"/>
+                <w:szCs w:val="19"/>
+                <w:rtl w:val="0"/>
+              </w:rPr>
+            </w:r>
+            <w:r>
+              <w:rPr>
+                <w:rtl w:val="0"/>
+              </w:rPr>
+            </w:r>
+          </w:p>
+        </w:tc>
+        <w:tc>
+          <w:tcPr/>
+          <w:p>
+            <w:pPr>
+              <w:jc w:val="center"/>
+              <w:rPr/>
+            </w:pPr>
+            <w:r>
+              <w:rPr>
+                <w:sz w:val="19"/>
+                <w:szCs w:val="19"/>
+                <w:rtl w:val="0"/>
+              </w:rPr>
+            </w:r>
+            <w:r>
+              <w:rPr>
+                <w:rtl w:val="0"/>
+              </w:rPr>
+            </w:r>
+          </w:p>
+        </w:tc>
+        <w:tc>
+          <w:tcPr/>
+          <w:p>
+            <w:pPr>
+              <w:jc w:val="center"/>
+              <w:rPr/>
+            </w:pPr>
+            <w:r>
+              <w:rPr>
+                <w:sz w:val="19"/>
+                <w:szCs w:val="19"/>
+                <w:rtl w:val="0"/>
+              </w:rPr>
+            </w:r>
+            <w:r>
+              <w:rPr>
+                <w:rtl w:val="0"/>
+              </w:rPr>
+            </w:r>
+          </w:p>
+        </w:tc>
+        <w:tc>
+          <w:tcPr/>
+          <w:p>
+            <w:pPr>
+              <w:jc w:val="center"/>
+              <w:rPr/>
+            </w:pPr>
+            <w:r>
+              <w:rPr>
+                <w:sz w:val="19"/>
+                <w:szCs w:val="19"/>
+                <w:rtl w:val="0"/>
+              </w:rPr>
+            </w:r>
+            <w:r>
+              <w:rPr>
+                <w:rtl w:val="0"/>
+              </w:rPr>
+            </w:r>
+          </w:p>
+        </w:tc>
+        <w:tc>
+          <w:tcPr/>
+          <w:p>
+            <w:pPr>
+              <w:jc w:val="center"/>
+              <w:rPr/>
+            </w:pPr>
+            <w:r>
+              <w:rPr>
+                <w:sz w:val="19"/>
+                <w:szCs w:val="19"/>
+                <w:rtl w:val="0"/>
+              </w:rPr>
+            </w:r>
+            <w:r>
+              <w:rPr>
+                <w:rtl w:val="0"/>
+              </w:rPr>
+            </w:r>
+          </w:p>
+        </w:tc>
+        <w:tc>
+          <w:tcPr/>
+          <w:p>
+            <w:pPr>
+              <w:jc w:val="center"/>
+              <w:rPr/>
+            </w:pPr>
+            <w:r>
+              <w:rPr>
+                <w:sz w:val="19"/>
+                <w:szCs w:val="19"/>
+                <w:rtl w:val="0"/>
+              </w:rPr>
+            </w:r>
+            <w:r>
+              <w:rPr>
+                <w:rtl w:val="0"/>
+              </w:rPr>
+            </w:r>
+          </w:p>
+        </w:tc>
+      </w:tr>
+      <w:tr>
+        <w:trPr>
+          <w:cantSplit w:val="0"/>
+          <w:tblHeader w:val="0"/>
+        </w:trPr>
+        <w:tc>
+          <w:tcPr/>
+          <w:p>
+            <w:pPr>
+              <w:jc w:val="center"/>
+              <w:rPr/>
+            </w:pPr>
+            <w:r>
+              <w:rPr>
+                <w:sz w:val="19"/>
+                <w:szCs w:val="19"/>
+                <w:rtl w:val="0"/>
+              </w:rPr>
+              <w:t>{{ t.label }}</w:t>
+            </w:r>
+            <w:r>
+              <w:rPr>
+                <w:rtl w:val="0"/>
+              </w:rPr>
+            </w:r>
+          </w:p>
+        </w:tc>
+        <w:tc>
+          <w:tcPr/>
+          <w:p>
+            <w:pPr>
+              <w:jc w:val="center"/>
+              <w:rPr/>
+            </w:pPr>
+            <w:r>
+              <w:rPr>
+                <w:sz w:val="19"/>
+                <w:szCs w:val="19"/>
+                <w:rtl w:val="0"/>
+              </w:rPr>
+              <w:t>{{ t.side_a }}</w:t>
+            </w:r>
+            <w:r>
+              <w:rPr>
+                <w:rtl w:val="0"/>
+              </w:rPr>
+            </w:r>
+          </w:p>
+        </w:tc>
+        <w:tc>
+          <w:tcPr/>
+          <w:p>
+            <w:pPr>
+              <w:jc w:val="center"/>
+              <w:rPr/>
+            </w:pPr>
+            <w:r>
+              <w:rPr>
+                <w:sz w:val="19"/>
+                <w:szCs w:val="19"/>
+                <w:rtl w:val="0"/>
+              </w:rPr>
+              <w:t>{{ t.side_b }}</w:t>
+            </w:r>
+            <w:r>
+              <w:rPr>
+                <w:rtl w:val="0"/>
+              </w:rPr>
+            </w:r>
+          </w:p>
+        </w:tc>
+        <w:tc>
+          <w:tcPr/>
+          <w:p>
+            <w:pPr>
+              <w:jc w:val="center"/>
+              <w:rPr/>
+            </w:pPr>
+            <w:r>
+              <w:rPr>
+                <w:sz w:val="19"/>
+                <w:szCs w:val="19"/>
+                <w:rtl w:val="0"/>
+              </w:rPr>
+              <w:t>{{ t.side_c }}</w:t>
+            </w:r>
+            <w:r>
+              <w:rPr>
+                <w:rtl w:val="0"/>
+              </w:rPr>
+            </w:r>
+          </w:p>
+        </w:tc>
+        <w:tc>
+          <w:tcPr/>
+          <w:p>
+            <w:pPr>
+              <w:jc w:val="center"/>
+              <w:rPr/>
+            </w:pPr>
+            <w:r>
+              <w:rPr>
+                <w:sz w:val="19"/>
+                <w:szCs w:val="19"/>
+                <w:rtl w:val="0"/>
+              </w:rPr>
+              <w:t>{{ t.semi_perimeter }}</w:t>
+            </w:r>
+            <w:r>
+              <w:rPr>
+                <w:rtl w:val="0"/>
+              </w:rPr>
+            </w:r>
+          </w:p>
+        </w:tc>
+        <w:tc>
+          <w:tcPr/>
+          <w:p>
+            <w:pPr>
+              <w:jc w:val="center"/>
+              <w:rPr/>
+            </w:pPr>
+            <w:r>
+              <w:rPr>
+                <w:sz w:val="19"/>
+                <w:szCs w:val="19"/>
+                <w:rtl w:val="0"/>
+              </w:rPr>
+              <w:t>{{ t.area_sqft }}</w:t>
+            </w:r>
+            <w:r>
+              <w:rPr>
+                <w:rtl w:val="0"/>
+              </w:rPr>
+            </w:r>
+          </w:p>
+        </w:tc>
+        <w:tc>
+          <w:tcPr/>
+          <w:p>
+            <w:pPr>
+              <w:jc w:val="center"/>
+              <w:rPr/>
+            </w:pPr>
+            <w:r>
+              <w:rPr>
+                <w:sz w:val="19"/>
+                <w:szCs w:val="19"/>
+                <w:rtl w:val="0"/>
+              </w:rPr>
+              <w:t>{{ t.aana }}</w:t>
+            </w:r>
+            <w:r>
+              <w:rPr>
+                <w:rtl w:val="0"/>
+              </w:rPr>
+            </w:r>
+          </w:p>
+        </w:tc>
+      </w:tr>
+      <w:tr>
+        <w:trPr>
+          <w:cantSplit w:val="0"/>
+          <w:tblHeader w:val="0"/>
+        </w:trPr>
+        <w:tc>
+          <w:tcPr/>
+          <w:p>
+            <w:pPr>
+              <w:jc w:val="center"/>
+              <w:rPr/>
+            </w:pPr>
+            <w:r>
+              <w:rPr>
+                <w:sz w:val="19"/>
+                <w:szCs w:val="19"/>
+                <w:rtl w:val="0"/>
+              </w:rPr>
+              <w:t>{%tr endfor %}</w:t>
+            </w:r>
+            <w:r>
+              <w:rPr>
+                <w:rtl w:val="0"/>
+              </w:rPr>
+            </w:r>
+          </w:p>
+        </w:tc>
+        <w:tc>
+          <w:tcPr/>
+          <w:p>
+            <w:pPr>
+              <w:jc w:val="center"/>
+              <w:rPr/>
+            </w:pPr>
+            <w:r>
+              <w:rPr>
+                <w:sz w:val="19"/>
+                <w:szCs w:val="19"/>
+                <w:rtl w:val="0"/>
+              </w:rPr>
+            </w:r>
+            <w:r>
+              <w:rPr>
+                <w:rtl w:val="0"/>
+              </w:rPr>
+            </w:r>
+          </w:p>
+        </w:tc>
+        <w:tc>
+          <w:tcPr/>
+          <w:p>
+            <w:pPr>
+              <w:jc w:val="center"/>
+              <w:rPr/>
+            </w:pPr>
+            <w:r>
+              <w:rPr>
+                <w:sz w:val="19"/>
+                <w:szCs w:val="19"/>
+                <w:rtl w:val="0"/>
+              </w:rPr>
+            </w:r>
+            <w:r>
+              <w:rPr>
+                <w:rtl w:val="0"/>
+              </w:rPr>
+            </w:r>
+          </w:p>
+        </w:tc>
+        <w:tc>
+          <w:tcPr/>
+          <w:p>
+            <w:pPr>
+              <w:jc w:val="center"/>
+              <w:rPr/>
+            </w:pPr>
+            <w:r>
+              <w:rPr>
+                <w:sz w:val="19"/>
+                <w:szCs w:val="19"/>
+                <w:rtl w:val="0"/>
+              </w:rPr>
+            </w:r>
+            <w:r>
+              <w:rPr>
+                <w:rtl w:val="0"/>
+              </w:rPr>
+            </w:r>
+          </w:p>
+        </w:tc>
+        <w:tc>
+          <w:tcPr/>
+          <w:p>
+            <w:pPr>
+              <w:jc w:val="center"/>
+              <w:rPr/>
+            </w:pPr>
+            <w:r>
+              <w:rPr>
+                <w:sz w:val="19"/>
+                <w:szCs w:val="19"/>
+                <w:rtl w:val="0"/>
+              </w:rPr>
+            </w:r>
+            <w:r>
+              <w:rPr>
+                <w:rtl w:val="0"/>
+              </w:rPr>
+            </w:r>
+          </w:p>
+        </w:tc>
+        <w:tc>
+          <w:tcPr/>
+          <w:p>
+            <w:pPr>
+              <w:jc w:val="center"/>
+              <w:rPr/>
+            </w:pPr>
+            <w:r>
+              <w:rPr>
+                <w:sz w:val="19"/>
+                <w:szCs w:val="19"/>
+                <w:rtl w:val="0"/>
+              </w:rPr>
+            </w:r>
+            <w:r>
+              <w:rPr>
+                <w:rtl w:val="0"/>
+              </w:rPr>
+            </w:r>
+          </w:p>
+        </w:tc>
+        <w:tc>
+          <w:tcPr/>
+          <w:p>
+            <w:pPr>
+              <w:jc w:val="center"/>
+              <w:rPr/>
+            </w:pPr>
+            <w:r>
+              <w:rPr>
+                <w:sz w:val="19"/>
+                <w:szCs w:val="19"/>
+                <w:rtl w:val="0"/>
+              </w:rPr>
             </w:r>
             <w:r>
               <w:rPr>

</xml_diff>

<commit_message>
feat: update proposal template and remove unnecessary .DS_Store file
</commit_message>
<xml_diff>
--- a/backend/templates/proposal_template.docx
+++ b/backend/templates/proposal_template.docx
@@ -955,10 +955,7 @@
       <w:pPr>
         <w:spacing w:after="0" w:line="240" w:lineRule="auto"/>
         <w:jc w:val="center"/>
-        <w:rPr>
-          <w:sz w:val="20"/>
-          <w:szCs w:val="20"/>
-        </w:rPr>
+        <w:rPr/>
       </w:pPr>
       <w:r>
         <w:rPr>
@@ -976,15 +973,8 @@
           <w:szCs w:val="20"/>
           <w:rtl w:val="0"/>
         </w:rPr>
-        <w:t xml:space="preserve">{{ client_full_name }}</w:t>
-      </w:r>
-    </w:p>
-    <w:p>
-      <w:pPr>
-        <w:spacing w:after="0" w:line="240" w:lineRule="auto"/>
-        <w:jc w:val="center"/>
-        <w:rPr/>
-      </w:pPr>
+        <w:t xml:space="preserve">{{ client_full_name }} | </w:t>
+      </w:r>
       <w:r>
         <w:rPr>
           <w:b w:val="1"/>
@@ -1168,7 +1158,7 @@
     <w:tbl>
       <w:tblPr>
         <w:tblStyle w:val="Table1"/>
-        <w:tblW w:w="10210.000000000002" w:type="dxa"/>
+        <w:tblW w:w="10200.0" w:type="dxa"/>
         <w:jc w:val="left"/>
         <w:tblInd w:w="-108.0" w:type="dxa"/>
         <w:tblBorders>
@@ -1183,28 +1173,28 @@
         <w:tblLook w:val="0400"/>
       </w:tblPr>
       <w:tblGrid>
-        <w:gridCol w:w="1021"/>
-        <w:gridCol w:w="1021"/>
-        <w:gridCol w:w="1021"/>
-        <w:gridCol w:w="1021"/>
-        <w:gridCol w:w="1021"/>
-        <w:gridCol w:w="1021"/>
-        <w:gridCol w:w="1021"/>
-        <w:gridCol w:w="1021"/>
-        <w:gridCol w:w="1021"/>
-        <w:gridCol w:w="1021"/>
+        <w:gridCol w:w="600"/>
+        <w:gridCol w:w="1440"/>
+        <w:gridCol w:w="1020"/>
+        <w:gridCol w:w="1020"/>
+        <w:gridCol w:w="1020"/>
+        <w:gridCol w:w="1020"/>
+        <w:gridCol w:w="1020"/>
+        <w:gridCol w:w="1020"/>
+        <w:gridCol w:w="1020"/>
+        <w:gridCol w:w="1020"/>
         <w:tblGridChange w:id="0">
           <w:tblGrid>
-            <w:gridCol w:w="1021"/>
-            <w:gridCol w:w="1021"/>
-            <w:gridCol w:w="1021"/>
-            <w:gridCol w:w="1021"/>
-            <w:gridCol w:w="1021"/>
-            <w:gridCol w:w="1021"/>
-            <w:gridCol w:w="1021"/>
-            <w:gridCol w:w="1021"/>
-            <w:gridCol w:w="1021"/>
-            <w:gridCol w:w="1021"/>
+            <w:gridCol w:w="600"/>
+            <w:gridCol w:w="1440"/>
+            <w:gridCol w:w="1020"/>
+            <w:gridCol w:w="1020"/>
+            <w:gridCol w:w="1020"/>
+            <w:gridCol w:w="1020"/>
+            <w:gridCol w:w="1020"/>
+            <w:gridCol w:w="1020"/>
+            <w:gridCol w:w="1020"/>
+            <w:gridCol w:w="1020"/>
           </w:tblGrid>
         </w:tblGridChange>
       </w:tblGrid>
@@ -3332,7 +3322,7 @@
     </w:p>
     <w:p>
       <w:pPr>
-        <w:spacing w:after="0" w:before="200" w:lineRule="auto"/>
+        <w:spacing w:after="0" w:before="80" w:lineRule="auto"/>
         <w:jc w:val="left"/>
         <w:rPr/>
       </w:pPr>
@@ -3346,9 +3336,6 @@
       <w:pPr>
         <w:spacing w:after="320" w:before="0" w:lineRule="auto"/>
         <w:jc w:val="left"/>
-        <w:rPr/>
-      </w:pPr>
-      <w:r>
         <w:rPr>
           <w:b w:val="0"/>
           <w:bCs w:val="0"/>
@@ -3356,14 +3343,36 @@
           <w:iCs w:val="0"/>
           <w:sz w:val="20"/>
           <w:szCs w:val="20"/>
+        </w:rPr>
+      </w:pPr>
+      <w:r>
+        <w:rPr>
+          <w:b w:val="0"/>
+          <w:bCs w:val="0"/>
+          <w:i w:val="0"/>
+          <w:iCs w:val="0"/>
+          <w:sz w:val="20"/>
+          <w:szCs w:val="20"/>
           <w:rtl w:val="0"/>
         </w:rPr>
         <w:t xml:space="preserve">Yours faithfully,</w:t>
       </w:r>
-      <w:r>
-        <w:rPr>
-          <w:rtl w:val="0"/>
-        </w:rPr>
+    </w:p>
+    <w:p>
+      <w:pPr>
+        <w:spacing w:after="0" w:before="240" w:lineRule="auto"/>
+        <w:rPr>
+          <w:sz w:val="20"/>
+          <w:szCs w:val="20"/>
+        </w:rPr>
+      </w:pPr>
+      <w:r>
+        <w:rPr>
+          <w:sz w:val="20"/>
+          <w:szCs w:val="20"/>
+          <w:rtl w:val="0"/>
+        </w:rPr>
+        <w:t xml:space="preserve">—---------------------------------------</w:t>
       </w:r>
     </w:p>
     <w:p>
@@ -3418,9 +3427,6 @@
       <w:pPr>
         <w:spacing w:after="0" w:before="0" w:lineRule="auto"/>
         <w:jc w:val="left"/>
-        <w:rPr/>
-      </w:pPr>
-      <w:r>
         <w:rPr>
           <w:b w:val="0"/>
           <w:bCs w:val="0"/>
@@ -3428,10 +3434,38 @@
           <w:iCs w:val="0"/>
           <w:sz w:val="20"/>
           <w:szCs w:val="20"/>
+        </w:rPr>
+      </w:pPr>
+      <w:r>
+        <w:rPr>
+          <w:b w:val="0"/>
+          <w:bCs w:val="0"/>
+          <w:i w:val="0"/>
+          <w:iCs w:val="0"/>
+          <w:sz w:val="20"/>
+          <w:szCs w:val="20"/>
           <w:rtl w:val="0"/>
         </w:rPr>
         <w:t xml:space="preserve">For {{ firm_name }}</w:t>
       </w:r>
+      <w:r>
+        <w:br w:type="page"/>
+      </w:r>
+      <w:r>
+        <w:rPr>
+          <w:rtl w:val="0"/>
+        </w:rPr>
+      </w:r>
+    </w:p>
+    <w:p>
+      <w:pPr>
+        <w:spacing w:after="0" w:before="0" w:lineRule="auto"/>
+        <w:jc w:val="left"/>
+        <w:rPr>
+          <w:sz w:val="20"/>
+          <w:szCs w:val="20"/>
+        </w:rPr>
+      </w:pPr>
       <w:r>
         <w:rPr>
           <w:rtl w:val="0"/>
@@ -15032,6 +15066,40 @@
       <w:pPr>
         <w:spacing w:after="60" w:before="0" w:lineRule="auto"/>
         <w:jc w:val="left"/>
+        <w:rPr>
+          <w:b w:val="1"/>
+          <w:bCs w:val="1"/>
+          <w:sz w:val="20"/>
+          <w:szCs w:val="20"/>
+        </w:rPr>
+      </w:pPr>
+      <w:r>
+        <w:rPr>
+          <w:rtl w:val="0"/>
+        </w:rPr>
+      </w:r>
+    </w:p>
+    <w:p>
+      <w:pPr>
+        <w:spacing w:after="60" w:before="0" w:lineRule="auto"/>
+        <w:jc w:val="left"/>
+        <w:rPr>
+          <w:b w:val="1"/>
+          <w:bCs w:val="1"/>
+          <w:sz w:val="20"/>
+          <w:szCs w:val="20"/>
+        </w:rPr>
+      </w:pPr>
+      <w:r>
+        <w:rPr>
+          <w:rtl w:val="0"/>
+        </w:rPr>
+      </w:r>
+    </w:p>
+    <w:p>
+      <w:pPr>
+        <w:spacing w:after="60" w:before="0" w:lineRule="auto"/>
+        <w:jc w:val="left"/>
         <w:rPr/>
       </w:pPr>
       <w:r>
@@ -15432,7 +15500,7 @@
     </w:p>
     <w:p>
       <w:pPr>
-        <w:spacing w:after="0" w:before="120" w:lineRule="auto"/>
+        <w:spacing w:after="40" w:before="0" w:lineRule="auto"/>
         <w:jc w:val="left"/>
         <w:rPr/>
       </w:pPr>
@@ -18716,57 +18784,31 @@
         <w:tab/>
         <w:tab/>
         <w:tab/>
-        <w:tab/>
-        <w:tab/>
       </w:r>
     </w:p>
     <w:p>
       <w:pPr>
         <w:spacing w:after="120" w:lineRule="auto"/>
         <w:rPr>
+          <w:sz w:val="24"/>
+          <w:szCs w:val="24"/>
+        </w:rPr>
+      </w:pPr>
+      <w:r>
+        <w:rPr>
           <w:sz w:val="18"/>
           <w:szCs w:val="18"/>
-        </w:rPr>
-      </w:pPr>
-      <w:r>
-        <w:rPr>
-          <w:sz w:val="18"/>
-          <w:szCs w:val="18"/>
-          <w:rtl w:val="0"/>
-        </w:rPr>
-        <w:t xml:space="preserve">Mathematically, the area A of a triangle is given by,</w:t>
+          <w:rtl w:val="0"/>
+        </w:rPr>
+        <w:t xml:space="preserve">Mathematically, the area A of a triangle is given by: A= ` √s(s-a)(s-b)(s-c)</w:t>
         <w:tab/>
-        <w:tab/>
-        <w:tab/>
-        <w:tab/>
-        <w:tab/>
-        <w:tab/>
-      </w:r>
-    </w:p>
-    <w:p>
-      <w:pPr>
-        <w:spacing w:after="120" w:lineRule="auto"/>
+      </w:r>
+      <w:r>
         <w:rPr>
           <w:sz w:val="24"/>
           <w:szCs w:val="24"/>
-        </w:rPr>
-      </w:pPr>
-      <w:r>
-        <w:rPr>
-          <w:sz w:val="18"/>
-          <w:szCs w:val="18"/>
-          <w:rtl w:val="0"/>
-        </w:rPr>
-        <w:t xml:space="preserve">A= ` √s(s-a)(s-b)(s-c)</w:t>
-        <w:tab/>
-      </w:r>
-      <w:r>
-        <w:rPr>
-          <w:sz w:val="24"/>
-          <w:szCs w:val="24"/>
-          <w:rtl w:val="0"/>
-        </w:rPr>
-        <w:tab/>
+          <w:rtl w:val="0"/>
+        </w:rPr>
         <w:tab/>
         <w:tab/>
         <w:tab/>
@@ -19187,133 +19229,139 @@
                 <w:szCs w:val="19"/>
                 <w:rtl w:val="0"/>
               </w:rPr>
-              <w:t>{%tr for t in lm_triangles %}</w:t>
-            </w:r>
-            <w:r>
-              <w:rPr>
-                <w:rtl w:val="0"/>
-              </w:rPr>
-            </w:r>
-          </w:p>
-        </w:tc>
-        <w:tc>
-          <w:tcPr/>
-          <w:p>
-            <w:pPr>
-              <w:jc w:val="center"/>
-              <w:rPr/>
-            </w:pPr>
-            <w:r>
-              <w:rPr>
-                <w:sz w:val="19"/>
-                <w:szCs w:val="19"/>
-                <w:rtl w:val="0"/>
-              </w:rPr>
-            </w:r>
-            <w:r>
-              <w:rPr>
-                <w:rtl w:val="0"/>
-              </w:rPr>
-            </w:r>
-          </w:p>
-        </w:tc>
-        <w:tc>
-          <w:tcPr/>
-          <w:p>
-            <w:pPr>
-              <w:jc w:val="center"/>
-              <w:rPr/>
-            </w:pPr>
-            <w:r>
-              <w:rPr>
-                <w:sz w:val="19"/>
-                <w:szCs w:val="19"/>
-                <w:rtl w:val="0"/>
-              </w:rPr>
-            </w:r>
-            <w:r>
-              <w:rPr>
-                <w:rtl w:val="0"/>
-              </w:rPr>
-            </w:r>
-          </w:p>
-        </w:tc>
-        <w:tc>
-          <w:tcPr/>
-          <w:p>
-            <w:pPr>
-              <w:jc w:val="center"/>
-              <w:rPr/>
-            </w:pPr>
-            <w:r>
-              <w:rPr>
-                <w:sz w:val="19"/>
-                <w:szCs w:val="19"/>
-                <w:rtl w:val="0"/>
-              </w:rPr>
-            </w:r>
-            <w:r>
-              <w:rPr>
-                <w:rtl w:val="0"/>
-              </w:rPr>
-            </w:r>
-          </w:p>
-        </w:tc>
-        <w:tc>
-          <w:tcPr/>
-          <w:p>
-            <w:pPr>
-              <w:jc w:val="center"/>
-              <w:rPr/>
-            </w:pPr>
-            <w:r>
-              <w:rPr>
-                <w:sz w:val="19"/>
-                <w:szCs w:val="19"/>
-                <w:rtl w:val="0"/>
-              </w:rPr>
-            </w:r>
-            <w:r>
-              <w:rPr>
-                <w:rtl w:val="0"/>
-              </w:rPr>
-            </w:r>
-          </w:p>
-        </w:tc>
-        <w:tc>
-          <w:tcPr/>
-          <w:p>
-            <w:pPr>
-              <w:jc w:val="center"/>
-              <w:rPr/>
-            </w:pPr>
-            <w:r>
-              <w:rPr>
-                <w:sz w:val="19"/>
-                <w:szCs w:val="19"/>
-                <w:rtl w:val="0"/>
-              </w:rPr>
-            </w:r>
-            <w:r>
-              <w:rPr>
-                <w:rtl w:val="0"/>
-              </w:rPr>
-            </w:r>
-          </w:p>
-        </w:tc>
-        <w:tc>
-          <w:tcPr/>
-          <w:p>
-            <w:pPr>
-              <w:jc w:val="center"/>
-              <w:rPr/>
-            </w:pPr>
-            <w:r>
-              <w:rPr>
-                <w:sz w:val="19"/>
-                <w:szCs w:val="19"/>
-                <w:rtl w:val="0"/>
-              </w:rPr>
+              <w:t xml:space="preserve">A</w:t>
+            </w:r>
+            <w:r>
+              <w:rPr>
+                <w:rtl w:val="0"/>
+              </w:rPr>
+            </w:r>
+          </w:p>
+        </w:tc>
+        <w:tc>
+          <w:tcPr/>
+          <w:p>
+            <w:pPr>
+              <w:jc w:val="center"/>
+              <w:rPr/>
+            </w:pPr>
+            <w:r>
+              <w:rPr>
+                <w:sz w:val="19"/>
+                <w:szCs w:val="19"/>
+                <w:rtl w:val="0"/>
+              </w:rPr>
+              <w:t xml:space="preserve">{{ lm_tri_a_a }}</w:t>
+            </w:r>
+            <w:r>
+              <w:rPr>
+                <w:rtl w:val="0"/>
+              </w:rPr>
+            </w:r>
+          </w:p>
+        </w:tc>
+        <w:tc>
+          <w:tcPr/>
+          <w:p>
+            <w:pPr>
+              <w:jc w:val="center"/>
+              <w:rPr/>
+            </w:pPr>
+            <w:r>
+              <w:rPr>
+                <w:sz w:val="19"/>
+                <w:szCs w:val="19"/>
+                <w:rtl w:val="0"/>
+              </w:rPr>
+              <w:t xml:space="preserve">{{ lm_tri_a_b }}</w:t>
+            </w:r>
+            <w:r>
+              <w:rPr>
+                <w:rtl w:val="0"/>
+              </w:rPr>
+            </w:r>
+          </w:p>
+        </w:tc>
+        <w:tc>
+          <w:tcPr/>
+          <w:p>
+            <w:pPr>
+              <w:jc w:val="center"/>
+              <w:rPr/>
+            </w:pPr>
+            <w:r>
+              <w:rPr>
+                <w:sz w:val="19"/>
+                <w:szCs w:val="19"/>
+                <w:rtl w:val="0"/>
+              </w:rPr>
+              <w:t xml:space="preserve">{{ lm_tri_a_c }}</w:t>
+            </w:r>
+            <w:r>
+              <w:rPr>
+                <w:rtl w:val="0"/>
+              </w:rPr>
+            </w:r>
+          </w:p>
+        </w:tc>
+        <w:tc>
+          <w:tcPr/>
+          <w:p>
+            <w:pPr>
+              <w:jc w:val="center"/>
+              <w:rPr/>
+            </w:pPr>
+            <w:r>
+              <w:rPr>
+                <w:sz w:val="19"/>
+                <w:szCs w:val="19"/>
+                <w:rtl w:val="0"/>
+              </w:rPr>
+              <w:t xml:space="preserve">{{ lm_tri_a_s }}</w:t>
+            </w:r>
+            <w:r>
+              <w:rPr>
+                <w:rtl w:val="0"/>
+              </w:rPr>
+            </w:r>
+          </w:p>
+        </w:tc>
+        <w:tc>
+          <w:tcPr/>
+          <w:p>
+            <w:pPr>
+              <w:jc w:val="center"/>
+              <w:rPr/>
+            </w:pPr>
+            <w:r>
+              <w:rPr>
+                <w:sz w:val="19"/>
+                <w:szCs w:val="19"/>
+                <w:rtl w:val="0"/>
+              </w:rPr>
+              <w:t xml:space="preserve">{{ lm_tri_a_sqft }}</w:t>
+            </w:r>
+            <w:r>
+              <w:rPr>
+                <w:rtl w:val="0"/>
+              </w:rPr>
+            </w:r>
+          </w:p>
+        </w:tc>
+        <w:tc>
+          <w:tcPr/>
+          <w:p>
+            <w:pPr>
+              <w:jc w:val="center"/>
+              <w:rPr/>
+            </w:pPr>
+            <w:r>
+              <w:rPr>
+                <w:sz w:val="19"/>
+                <w:szCs w:val="19"/>
+                <w:rtl w:val="0"/>
+              </w:rPr>
+              <w:t xml:space="preserve">{{ lm_tri_a_aana }}</w:t>
             </w:r>
             <w:r>
               <w:rPr>
@@ -19341,293 +19389,139 @@
                 <w:szCs w:val="19"/>
                 <w:rtl w:val="0"/>
               </w:rPr>
-              <w:t>{{ t.label }}</w:t>
-            </w:r>
-            <w:r>
-              <w:rPr>
-                <w:rtl w:val="0"/>
-              </w:rPr>
-            </w:r>
-          </w:p>
-        </w:tc>
-        <w:tc>
-          <w:tcPr/>
-          <w:p>
-            <w:pPr>
-              <w:jc w:val="center"/>
-              <w:rPr/>
-            </w:pPr>
-            <w:r>
-              <w:rPr>
-                <w:sz w:val="19"/>
-                <w:szCs w:val="19"/>
-                <w:rtl w:val="0"/>
-              </w:rPr>
-              <w:t>{{ t.side_a }}</w:t>
-            </w:r>
-            <w:r>
-              <w:rPr>
-                <w:rtl w:val="0"/>
-              </w:rPr>
-            </w:r>
-          </w:p>
-        </w:tc>
-        <w:tc>
-          <w:tcPr/>
-          <w:p>
-            <w:pPr>
-              <w:jc w:val="center"/>
-              <w:rPr/>
-            </w:pPr>
-            <w:r>
-              <w:rPr>
-                <w:sz w:val="19"/>
-                <w:szCs w:val="19"/>
-                <w:rtl w:val="0"/>
-              </w:rPr>
-              <w:t>{{ t.side_b }}</w:t>
-            </w:r>
-            <w:r>
-              <w:rPr>
-                <w:rtl w:val="0"/>
-              </w:rPr>
-            </w:r>
-          </w:p>
-        </w:tc>
-        <w:tc>
-          <w:tcPr/>
-          <w:p>
-            <w:pPr>
-              <w:jc w:val="center"/>
-              <w:rPr/>
-            </w:pPr>
-            <w:r>
-              <w:rPr>
-                <w:sz w:val="19"/>
-                <w:szCs w:val="19"/>
-                <w:rtl w:val="0"/>
-              </w:rPr>
-              <w:t>{{ t.side_c }}</w:t>
-            </w:r>
-            <w:r>
-              <w:rPr>
-                <w:rtl w:val="0"/>
-              </w:rPr>
-            </w:r>
-          </w:p>
-        </w:tc>
-        <w:tc>
-          <w:tcPr/>
-          <w:p>
-            <w:pPr>
-              <w:jc w:val="center"/>
-              <w:rPr/>
-            </w:pPr>
-            <w:r>
-              <w:rPr>
-                <w:sz w:val="19"/>
-                <w:szCs w:val="19"/>
-                <w:rtl w:val="0"/>
-              </w:rPr>
-              <w:t>{{ t.semi_perimeter }}</w:t>
-            </w:r>
-            <w:r>
-              <w:rPr>
-                <w:rtl w:val="0"/>
-              </w:rPr>
-            </w:r>
-          </w:p>
-        </w:tc>
-        <w:tc>
-          <w:tcPr/>
-          <w:p>
-            <w:pPr>
-              <w:jc w:val="center"/>
-              <w:rPr/>
-            </w:pPr>
-            <w:r>
-              <w:rPr>
-                <w:sz w:val="19"/>
-                <w:szCs w:val="19"/>
-                <w:rtl w:val="0"/>
-              </w:rPr>
-              <w:t>{{ t.area_sqft }}</w:t>
-            </w:r>
-            <w:r>
-              <w:rPr>
-                <w:rtl w:val="0"/>
-              </w:rPr>
-            </w:r>
-          </w:p>
-        </w:tc>
-        <w:tc>
-          <w:tcPr/>
-          <w:p>
-            <w:pPr>
-              <w:jc w:val="center"/>
-              <w:rPr/>
-            </w:pPr>
-            <w:r>
-              <w:rPr>
-                <w:sz w:val="19"/>
-                <w:szCs w:val="19"/>
-                <w:rtl w:val="0"/>
-              </w:rPr>
-              <w:t>{{ t.aana }}</w:t>
-            </w:r>
-            <w:r>
-              <w:rPr>
-                <w:rtl w:val="0"/>
-              </w:rPr>
-            </w:r>
-          </w:p>
-        </w:tc>
-      </w:tr>
-      <w:tr>
-        <w:trPr>
-          <w:cantSplit w:val="0"/>
-          <w:tblHeader w:val="0"/>
-        </w:trPr>
-        <w:tc>
-          <w:tcPr/>
-          <w:p>
-            <w:pPr>
-              <w:jc w:val="center"/>
-              <w:rPr/>
-            </w:pPr>
-            <w:r>
-              <w:rPr>
-                <w:sz w:val="19"/>
-                <w:szCs w:val="19"/>
-                <w:rtl w:val="0"/>
-              </w:rPr>
-              <w:t>{%tr endfor %}</w:t>
-            </w:r>
-            <w:r>
-              <w:rPr>
-                <w:rtl w:val="0"/>
-              </w:rPr>
-            </w:r>
-          </w:p>
-        </w:tc>
-        <w:tc>
-          <w:tcPr/>
-          <w:p>
-            <w:pPr>
-              <w:jc w:val="center"/>
-              <w:rPr/>
-            </w:pPr>
-            <w:r>
-              <w:rPr>
-                <w:sz w:val="19"/>
-                <w:szCs w:val="19"/>
-                <w:rtl w:val="0"/>
-              </w:rPr>
-            </w:r>
-            <w:r>
-              <w:rPr>
-                <w:rtl w:val="0"/>
-              </w:rPr>
-            </w:r>
-          </w:p>
-        </w:tc>
-        <w:tc>
-          <w:tcPr/>
-          <w:p>
-            <w:pPr>
-              <w:jc w:val="center"/>
-              <w:rPr/>
-            </w:pPr>
-            <w:r>
-              <w:rPr>
-                <w:sz w:val="19"/>
-                <w:szCs w:val="19"/>
-                <w:rtl w:val="0"/>
-              </w:rPr>
-            </w:r>
-            <w:r>
-              <w:rPr>
-                <w:rtl w:val="0"/>
-              </w:rPr>
-            </w:r>
-          </w:p>
-        </w:tc>
-        <w:tc>
-          <w:tcPr/>
-          <w:p>
-            <w:pPr>
-              <w:jc w:val="center"/>
-              <w:rPr/>
-            </w:pPr>
-            <w:r>
-              <w:rPr>
-                <w:sz w:val="19"/>
-                <w:szCs w:val="19"/>
-                <w:rtl w:val="0"/>
-              </w:rPr>
-            </w:r>
-            <w:r>
-              <w:rPr>
-                <w:rtl w:val="0"/>
-              </w:rPr>
-            </w:r>
-          </w:p>
-        </w:tc>
-        <w:tc>
-          <w:tcPr/>
-          <w:p>
-            <w:pPr>
-              <w:jc w:val="center"/>
-              <w:rPr/>
-            </w:pPr>
-            <w:r>
-              <w:rPr>
-                <w:sz w:val="19"/>
-                <w:szCs w:val="19"/>
-                <w:rtl w:val="0"/>
-              </w:rPr>
-            </w:r>
-            <w:r>
-              <w:rPr>
-                <w:rtl w:val="0"/>
-              </w:rPr>
-            </w:r>
-          </w:p>
-        </w:tc>
-        <w:tc>
-          <w:tcPr/>
-          <w:p>
-            <w:pPr>
-              <w:jc w:val="center"/>
-              <w:rPr/>
-            </w:pPr>
-            <w:r>
-              <w:rPr>
-                <w:sz w:val="19"/>
-                <w:szCs w:val="19"/>
-                <w:rtl w:val="0"/>
-              </w:rPr>
-            </w:r>
-            <w:r>
-              <w:rPr>
-                <w:rtl w:val="0"/>
-              </w:rPr>
-            </w:r>
-          </w:p>
-        </w:tc>
-        <w:tc>
-          <w:tcPr/>
-          <w:p>
-            <w:pPr>
-              <w:jc w:val="center"/>
-              <w:rPr/>
-            </w:pPr>
-            <w:r>
-              <w:rPr>
-                <w:sz w:val="19"/>
-                <w:szCs w:val="19"/>
-                <w:rtl w:val="0"/>
-              </w:rPr>
+              <w:t xml:space="preserve">B</w:t>
+            </w:r>
+            <w:r>
+              <w:rPr>
+                <w:rtl w:val="0"/>
+              </w:rPr>
+            </w:r>
+          </w:p>
+        </w:tc>
+        <w:tc>
+          <w:tcPr/>
+          <w:p>
+            <w:pPr>
+              <w:jc w:val="center"/>
+              <w:rPr/>
+            </w:pPr>
+            <w:r>
+              <w:rPr>
+                <w:sz w:val="19"/>
+                <w:szCs w:val="19"/>
+                <w:rtl w:val="0"/>
+              </w:rPr>
+              <w:t xml:space="preserve">{{ lm_tri_b_a }}</w:t>
+            </w:r>
+            <w:r>
+              <w:rPr>
+                <w:rtl w:val="0"/>
+              </w:rPr>
+            </w:r>
+          </w:p>
+        </w:tc>
+        <w:tc>
+          <w:tcPr/>
+          <w:p>
+            <w:pPr>
+              <w:jc w:val="center"/>
+              <w:rPr/>
+            </w:pPr>
+            <w:r>
+              <w:rPr>
+                <w:sz w:val="19"/>
+                <w:szCs w:val="19"/>
+                <w:rtl w:val="0"/>
+              </w:rPr>
+              <w:t xml:space="preserve">{{ lm_tri_b_b }}</w:t>
+            </w:r>
+            <w:r>
+              <w:rPr>
+                <w:rtl w:val="0"/>
+              </w:rPr>
+            </w:r>
+          </w:p>
+        </w:tc>
+        <w:tc>
+          <w:tcPr/>
+          <w:p>
+            <w:pPr>
+              <w:jc w:val="center"/>
+              <w:rPr/>
+            </w:pPr>
+            <w:r>
+              <w:rPr>
+                <w:sz w:val="19"/>
+                <w:szCs w:val="19"/>
+                <w:rtl w:val="0"/>
+              </w:rPr>
+              <w:t xml:space="preserve">{{ lm_tri_b_c }}</w:t>
+            </w:r>
+            <w:r>
+              <w:rPr>
+                <w:rtl w:val="0"/>
+              </w:rPr>
+            </w:r>
+          </w:p>
+        </w:tc>
+        <w:tc>
+          <w:tcPr/>
+          <w:p>
+            <w:pPr>
+              <w:jc w:val="center"/>
+              <w:rPr/>
+            </w:pPr>
+            <w:r>
+              <w:rPr>
+                <w:sz w:val="19"/>
+                <w:szCs w:val="19"/>
+                <w:rtl w:val="0"/>
+              </w:rPr>
+              <w:t xml:space="preserve">{{ lm_tri_b_s }}</w:t>
+            </w:r>
+            <w:r>
+              <w:rPr>
+                <w:rtl w:val="0"/>
+              </w:rPr>
+            </w:r>
+          </w:p>
+        </w:tc>
+        <w:tc>
+          <w:tcPr/>
+          <w:p>
+            <w:pPr>
+              <w:jc w:val="center"/>
+              <w:rPr/>
+            </w:pPr>
+            <w:r>
+              <w:rPr>
+                <w:sz w:val="19"/>
+                <w:szCs w:val="19"/>
+                <w:rtl w:val="0"/>
+              </w:rPr>
+              <w:t xml:space="preserve">{{ lm_tri_b_sqft }}</w:t>
+            </w:r>
+            <w:r>
+              <w:rPr>
+                <w:rtl w:val="0"/>
+              </w:rPr>
+            </w:r>
+          </w:p>
+        </w:tc>
+        <w:tc>
+          <w:tcPr/>
+          <w:p>
+            <w:pPr>
+              <w:jc w:val="center"/>
+              <w:rPr/>
+            </w:pPr>
+            <w:r>
+              <w:rPr>
+                <w:sz w:val="19"/>
+                <w:szCs w:val="19"/>
+                <w:rtl w:val="0"/>
+              </w:rPr>
+              <w:t xml:space="preserve">{{ lm_tri_b_aana }}</w:t>
             </w:r>
             <w:r>
               <w:rPr>
@@ -20409,133 +20303,139 @@
                 <w:szCs w:val="19"/>
                 <w:rtl w:val="0"/>
               </w:rPr>
-              <w:t>{%tr for t in ded_triangles %}</w:t>
-            </w:r>
-            <w:r>
-              <w:rPr>
-                <w:rtl w:val="0"/>
-              </w:rPr>
-            </w:r>
-          </w:p>
-        </w:tc>
-        <w:tc>
-          <w:tcPr/>
-          <w:p>
-            <w:pPr>
-              <w:jc w:val="center"/>
-              <w:rPr/>
-            </w:pPr>
-            <w:r>
-              <w:rPr>
-                <w:sz w:val="19"/>
-                <w:szCs w:val="19"/>
-                <w:rtl w:val="0"/>
-              </w:rPr>
-            </w:r>
-            <w:r>
-              <w:rPr>
-                <w:rtl w:val="0"/>
-              </w:rPr>
-            </w:r>
-          </w:p>
-        </w:tc>
-        <w:tc>
-          <w:tcPr/>
-          <w:p>
-            <w:pPr>
-              <w:jc w:val="center"/>
-              <w:rPr/>
-            </w:pPr>
-            <w:r>
-              <w:rPr>
-                <w:sz w:val="19"/>
-                <w:szCs w:val="19"/>
-                <w:rtl w:val="0"/>
-              </w:rPr>
-            </w:r>
-            <w:r>
-              <w:rPr>
-                <w:rtl w:val="0"/>
-              </w:rPr>
-            </w:r>
-          </w:p>
-        </w:tc>
-        <w:tc>
-          <w:tcPr/>
-          <w:p>
-            <w:pPr>
-              <w:jc w:val="center"/>
-              <w:rPr/>
-            </w:pPr>
-            <w:r>
-              <w:rPr>
-                <w:sz w:val="19"/>
-                <w:szCs w:val="19"/>
-                <w:rtl w:val="0"/>
-              </w:rPr>
-            </w:r>
-            <w:r>
-              <w:rPr>
-                <w:rtl w:val="0"/>
-              </w:rPr>
-            </w:r>
-          </w:p>
-        </w:tc>
-        <w:tc>
-          <w:tcPr/>
-          <w:p>
-            <w:pPr>
-              <w:jc w:val="center"/>
-              <w:rPr/>
-            </w:pPr>
-            <w:r>
-              <w:rPr>
-                <w:sz w:val="19"/>
-                <w:szCs w:val="19"/>
-                <w:rtl w:val="0"/>
-              </w:rPr>
-            </w:r>
-            <w:r>
-              <w:rPr>
-                <w:rtl w:val="0"/>
-              </w:rPr>
-            </w:r>
-          </w:p>
-        </w:tc>
-        <w:tc>
-          <w:tcPr/>
-          <w:p>
-            <w:pPr>
-              <w:jc w:val="center"/>
-              <w:rPr/>
-            </w:pPr>
-            <w:r>
-              <w:rPr>
-                <w:sz w:val="19"/>
-                <w:szCs w:val="19"/>
-                <w:rtl w:val="0"/>
-              </w:rPr>
-            </w:r>
-            <w:r>
-              <w:rPr>
-                <w:rtl w:val="0"/>
-              </w:rPr>
-            </w:r>
-          </w:p>
-        </w:tc>
-        <w:tc>
-          <w:tcPr/>
-          <w:p>
-            <w:pPr>
-              <w:jc w:val="center"/>
-              <w:rPr/>
-            </w:pPr>
-            <w:r>
-              <w:rPr>
-                <w:sz w:val="19"/>
-                <w:szCs w:val="19"/>
-                <w:rtl w:val="0"/>
-              </w:rPr>
+              <w:t xml:space="preserve">A</w:t>
+            </w:r>
+            <w:r>
+              <w:rPr>
+                <w:rtl w:val="0"/>
+              </w:rPr>
+            </w:r>
+          </w:p>
+        </w:tc>
+        <w:tc>
+          <w:tcPr/>
+          <w:p>
+            <w:pPr>
+              <w:jc w:val="center"/>
+              <w:rPr/>
+            </w:pPr>
+            <w:r>
+              <w:rPr>
+                <w:sz w:val="19"/>
+                <w:szCs w:val="19"/>
+                <w:rtl w:val="0"/>
+              </w:rPr>
+              <w:t xml:space="preserve">{{ ded_tri_a_a }}</w:t>
+            </w:r>
+            <w:r>
+              <w:rPr>
+                <w:rtl w:val="0"/>
+              </w:rPr>
+            </w:r>
+          </w:p>
+        </w:tc>
+        <w:tc>
+          <w:tcPr/>
+          <w:p>
+            <w:pPr>
+              <w:jc w:val="center"/>
+              <w:rPr/>
+            </w:pPr>
+            <w:r>
+              <w:rPr>
+                <w:sz w:val="19"/>
+                <w:szCs w:val="19"/>
+                <w:rtl w:val="0"/>
+              </w:rPr>
+              <w:t xml:space="preserve">{{ ded_tri_a_b }}</w:t>
+            </w:r>
+            <w:r>
+              <w:rPr>
+                <w:rtl w:val="0"/>
+              </w:rPr>
+            </w:r>
+          </w:p>
+        </w:tc>
+        <w:tc>
+          <w:tcPr/>
+          <w:p>
+            <w:pPr>
+              <w:jc w:val="center"/>
+              <w:rPr/>
+            </w:pPr>
+            <w:r>
+              <w:rPr>
+                <w:sz w:val="19"/>
+                <w:szCs w:val="19"/>
+                <w:rtl w:val="0"/>
+              </w:rPr>
+              <w:t xml:space="preserve">{{ ded_tri_a_c }}</w:t>
+            </w:r>
+            <w:r>
+              <w:rPr>
+                <w:rtl w:val="0"/>
+              </w:rPr>
+            </w:r>
+          </w:p>
+        </w:tc>
+        <w:tc>
+          <w:tcPr/>
+          <w:p>
+            <w:pPr>
+              <w:jc w:val="center"/>
+              <w:rPr/>
+            </w:pPr>
+            <w:r>
+              <w:rPr>
+                <w:sz w:val="19"/>
+                <w:szCs w:val="19"/>
+                <w:rtl w:val="0"/>
+              </w:rPr>
+              <w:t xml:space="preserve">{{ ded_tri_a_s }}</w:t>
+            </w:r>
+            <w:r>
+              <w:rPr>
+                <w:rtl w:val="0"/>
+              </w:rPr>
+            </w:r>
+          </w:p>
+        </w:tc>
+        <w:tc>
+          <w:tcPr/>
+          <w:p>
+            <w:pPr>
+              <w:jc w:val="center"/>
+              <w:rPr/>
+            </w:pPr>
+            <w:r>
+              <w:rPr>
+                <w:sz w:val="19"/>
+                <w:szCs w:val="19"/>
+                <w:rtl w:val="0"/>
+              </w:rPr>
+              <w:t xml:space="preserve">{{ ded_tri_a_sqft }}</w:t>
+            </w:r>
+            <w:r>
+              <w:rPr>
+                <w:rtl w:val="0"/>
+              </w:rPr>
+            </w:r>
+          </w:p>
+        </w:tc>
+        <w:tc>
+          <w:tcPr/>
+          <w:p>
+            <w:pPr>
+              <w:jc w:val="center"/>
+              <w:rPr/>
+            </w:pPr>
+            <w:r>
+              <w:rPr>
+                <w:sz w:val="19"/>
+                <w:szCs w:val="19"/>
+                <w:rtl w:val="0"/>
+              </w:rPr>
+              <w:t xml:space="preserve">{{ ded_tri_a_aana }}</w:t>
             </w:r>
             <w:r>
               <w:rPr>
@@ -20563,139 +20463,139 @@
                 <w:szCs w:val="19"/>
                 <w:rtl w:val="0"/>
               </w:rPr>
-              <w:t>{{ t.label }}</w:t>
-            </w:r>
-            <w:r>
-              <w:rPr>
-                <w:rtl w:val="0"/>
-              </w:rPr>
-            </w:r>
-          </w:p>
-        </w:tc>
-        <w:tc>
-          <w:tcPr/>
-          <w:p>
-            <w:pPr>
-              <w:jc w:val="center"/>
-              <w:rPr/>
-            </w:pPr>
-            <w:r>
-              <w:rPr>
-                <w:sz w:val="19"/>
-                <w:szCs w:val="19"/>
-                <w:rtl w:val="0"/>
-              </w:rPr>
-              <w:t>{{ t.side_a }}</w:t>
-            </w:r>
-            <w:r>
-              <w:rPr>
-                <w:rtl w:val="0"/>
-              </w:rPr>
-            </w:r>
-          </w:p>
-        </w:tc>
-        <w:tc>
-          <w:tcPr/>
-          <w:p>
-            <w:pPr>
-              <w:jc w:val="center"/>
-              <w:rPr/>
-            </w:pPr>
-            <w:r>
-              <w:rPr>
-                <w:sz w:val="19"/>
-                <w:szCs w:val="19"/>
-                <w:rtl w:val="0"/>
-              </w:rPr>
-              <w:t>{{ t.side_b }}</w:t>
-            </w:r>
-            <w:r>
-              <w:rPr>
-                <w:rtl w:val="0"/>
-              </w:rPr>
-            </w:r>
-          </w:p>
-        </w:tc>
-        <w:tc>
-          <w:tcPr/>
-          <w:p>
-            <w:pPr>
-              <w:jc w:val="center"/>
-              <w:rPr/>
-            </w:pPr>
-            <w:r>
-              <w:rPr>
-                <w:sz w:val="19"/>
-                <w:szCs w:val="19"/>
-                <w:rtl w:val="0"/>
-              </w:rPr>
-              <w:t>{{ t.side_c }}</w:t>
-            </w:r>
-            <w:r>
-              <w:rPr>
-                <w:rtl w:val="0"/>
-              </w:rPr>
-            </w:r>
-          </w:p>
-        </w:tc>
-        <w:tc>
-          <w:tcPr/>
-          <w:p>
-            <w:pPr>
-              <w:jc w:val="center"/>
-              <w:rPr/>
-            </w:pPr>
-            <w:r>
-              <w:rPr>
-                <w:sz w:val="19"/>
-                <w:szCs w:val="19"/>
-                <w:rtl w:val="0"/>
-              </w:rPr>
-              <w:t>{{ t.semi_perimeter }}</w:t>
-            </w:r>
-            <w:r>
-              <w:rPr>
-                <w:rtl w:val="0"/>
-              </w:rPr>
-            </w:r>
-          </w:p>
-        </w:tc>
-        <w:tc>
-          <w:tcPr/>
-          <w:p>
-            <w:pPr>
-              <w:jc w:val="center"/>
-              <w:rPr/>
-            </w:pPr>
-            <w:r>
-              <w:rPr>
-                <w:sz w:val="19"/>
-                <w:szCs w:val="19"/>
-                <w:rtl w:val="0"/>
-              </w:rPr>
-              <w:t>{{ t.area_sqft }}</w:t>
-            </w:r>
-            <w:r>
-              <w:rPr>
-                <w:rtl w:val="0"/>
-              </w:rPr>
-            </w:r>
-          </w:p>
-        </w:tc>
-        <w:tc>
-          <w:tcPr/>
-          <w:p>
-            <w:pPr>
-              <w:jc w:val="center"/>
-              <w:rPr/>
-            </w:pPr>
-            <w:r>
-              <w:rPr>
-                <w:sz w:val="19"/>
-                <w:szCs w:val="19"/>
-                <w:rtl w:val="0"/>
-              </w:rPr>
-              <w:t>{{ t.aana }}</w:t>
+              <w:t xml:space="preserve">B</w:t>
+            </w:r>
+            <w:r>
+              <w:rPr>
+                <w:rtl w:val="0"/>
+              </w:rPr>
+            </w:r>
+          </w:p>
+        </w:tc>
+        <w:tc>
+          <w:tcPr/>
+          <w:p>
+            <w:pPr>
+              <w:jc w:val="center"/>
+              <w:rPr/>
+            </w:pPr>
+            <w:r>
+              <w:rPr>
+                <w:sz w:val="19"/>
+                <w:szCs w:val="19"/>
+                <w:rtl w:val="0"/>
+              </w:rPr>
+              <w:t xml:space="preserve">{{ ded_tri_b_a }}</w:t>
+            </w:r>
+            <w:r>
+              <w:rPr>
+                <w:rtl w:val="0"/>
+              </w:rPr>
+            </w:r>
+          </w:p>
+        </w:tc>
+        <w:tc>
+          <w:tcPr/>
+          <w:p>
+            <w:pPr>
+              <w:jc w:val="center"/>
+              <w:rPr/>
+            </w:pPr>
+            <w:r>
+              <w:rPr>
+                <w:sz w:val="19"/>
+                <w:szCs w:val="19"/>
+                <w:rtl w:val="0"/>
+              </w:rPr>
+              <w:t xml:space="preserve">{{ ded_tri_b_b }}</w:t>
+            </w:r>
+            <w:r>
+              <w:rPr>
+                <w:rtl w:val="0"/>
+              </w:rPr>
+            </w:r>
+          </w:p>
+        </w:tc>
+        <w:tc>
+          <w:tcPr/>
+          <w:p>
+            <w:pPr>
+              <w:jc w:val="center"/>
+              <w:rPr/>
+            </w:pPr>
+            <w:r>
+              <w:rPr>
+                <w:sz w:val="19"/>
+                <w:szCs w:val="19"/>
+                <w:rtl w:val="0"/>
+              </w:rPr>
+              <w:t xml:space="preserve">{{ ded_tri_b_c }}</w:t>
+            </w:r>
+            <w:r>
+              <w:rPr>
+                <w:rtl w:val="0"/>
+              </w:rPr>
+            </w:r>
+          </w:p>
+        </w:tc>
+        <w:tc>
+          <w:tcPr/>
+          <w:p>
+            <w:pPr>
+              <w:jc w:val="center"/>
+              <w:rPr/>
+            </w:pPr>
+            <w:r>
+              <w:rPr>
+                <w:sz w:val="19"/>
+                <w:szCs w:val="19"/>
+                <w:rtl w:val="0"/>
+              </w:rPr>
+              <w:t xml:space="preserve">{{ ded_tri_b_s }}</w:t>
+            </w:r>
+            <w:r>
+              <w:rPr>
+                <w:rtl w:val="0"/>
+              </w:rPr>
+            </w:r>
+          </w:p>
+        </w:tc>
+        <w:tc>
+          <w:tcPr/>
+          <w:p>
+            <w:pPr>
+              <w:jc w:val="center"/>
+              <w:rPr/>
+            </w:pPr>
+            <w:r>
+              <w:rPr>
+                <w:sz w:val="19"/>
+                <w:szCs w:val="19"/>
+                <w:rtl w:val="0"/>
+              </w:rPr>
+              <w:t xml:space="preserve">{{ ded_tri_b_sqft }}</w:t>
+            </w:r>
+            <w:r>
+              <w:rPr>
+                <w:rtl w:val="0"/>
+              </w:rPr>
+            </w:r>
+          </w:p>
+        </w:tc>
+        <w:tc>
+          <w:tcPr/>
+          <w:p>
+            <w:pPr>
+              <w:jc w:val="center"/>
+              <w:rPr/>
+            </w:pPr>
+            <w:r>
+              <w:rPr>
+                <w:sz w:val="19"/>
+                <w:szCs w:val="19"/>
+                <w:rtl w:val="0"/>
+              </w:rPr>
+              <w:t xml:space="preserve">{{ ded_tri_b_aana }}</w:t>
             </w:r>
             <w:r>
               <w:rPr>
@@ -20719,138 +20619,99 @@
             </w:pPr>
             <w:r>
               <w:rPr>
-                <w:sz w:val="19"/>
-                <w:szCs w:val="19"/>
-                <w:rtl w:val="0"/>
-              </w:rPr>
-              <w:t>{%tr endfor %}</w:t>
-            </w:r>
-            <w:r>
-              <w:rPr>
-                <w:rtl w:val="0"/>
-              </w:rPr>
-            </w:r>
-          </w:p>
-        </w:tc>
-        <w:tc>
-          <w:tcPr/>
-          <w:p>
-            <w:pPr>
-              <w:jc w:val="center"/>
-              <w:rPr/>
-            </w:pPr>
-            <w:r>
-              <w:rPr>
-                <w:sz w:val="19"/>
-                <w:szCs w:val="19"/>
-                <w:rtl w:val="0"/>
-              </w:rPr>
-            </w:r>
-            <w:r>
-              <w:rPr>
-                <w:rtl w:val="0"/>
-              </w:rPr>
-            </w:r>
-          </w:p>
-        </w:tc>
-        <w:tc>
-          <w:tcPr/>
-          <w:p>
-            <w:pPr>
-              <w:jc w:val="center"/>
-              <w:rPr/>
-            </w:pPr>
-            <w:r>
-              <w:rPr>
-                <w:sz w:val="19"/>
-                <w:szCs w:val="19"/>
-                <w:rtl w:val="0"/>
-              </w:rPr>
-            </w:r>
-            <w:r>
-              <w:rPr>
-                <w:rtl w:val="0"/>
-              </w:rPr>
-            </w:r>
-          </w:p>
-        </w:tc>
-        <w:tc>
-          <w:tcPr/>
-          <w:p>
-            <w:pPr>
-              <w:jc w:val="center"/>
-              <w:rPr/>
-            </w:pPr>
-            <w:r>
-              <w:rPr>
-                <w:sz w:val="19"/>
-                <w:szCs w:val="19"/>
-                <w:rtl w:val="0"/>
-              </w:rPr>
-            </w:r>
-            <w:r>
-              <w:rPr>
-                <w:rtl w:val="0"/>
-              </w:rPr>
-            </w:r>
-          </w:p>
-        </w:tc>
-        <w:tc>
-          <w:tcPr/>
-          <w:p>
-            <w:pPr>
-              <w:jc w:val="center"/>
-              <w:rPr/>
-            </w:pPr>
-            <w:r>
-              <w:rPr>
-                <w:sz w:val="19"/>
-                <w:szCs w:val="19"/>
-                <w:rtl w:val="0"/>
-              </w:rPr>
-            </w:r>
-            <w:r>
-              <w:rPr>
-                <w:rtl w:val="0"/>
-              </w:rPr>
-            </w:r>
-          </w:p>
-        </w:tc>
-        <w:tc>
-          <w:tcPr/>
-          <w:p>
-            <w:pPr>
-              <w:jc w:val="center"/>
-              <w:rPr/>
-            </w:pPr>
-            <w:r>
-              <w:rPr>
-                <w:sz w:val="19"/>
-                <w:szCs w:val="19"/>
-                <w:rtl w:val="0"/>
-              </w:rPr>
-            </w:r>
-            <w:r>
-              <w:rPr>
-                <w:rtl w:val="0"/>
-              </w:rPr>
-            </w:r>
-          </w:p>
-        </w:tc>
-        <w:tc>
-          <w:tcPr/>
-          <w:p>
-            <w:pPr>
-              <w:jc w:val="center"/>
-              <w:rPr/>
-            </w:pPr>
-            <w:r>
-              <w:rPr>
-                <w:sz w:val="19"/>
-                <w:szCs w:val="19"/>
-                <w:rtl w:val="0"/>
-              </w:rPr>
-            </w:r>
+                <w:rtl w:val="0"/>
+              </w:rPr>
+            </w:r>
+          </w:p>
+        </w:tc>
+        <w:tc>
+          <w:tcPr/>
+          <w:p>
+            <w:pPr>
+              <w:jc w:val="center"/>
+              <w:rPr/>
+            </w:pPr>
+            <w:r>
+              <w:rPr>
+                <w:rtl w:val="0"/>
+              </w:rPr>
+            </w:r>
+          </w:p>
+        </w:tc>
+        <w:tc>
+          <w:tcPr/>
+          <w:p>
+            <w:pPr>
+              <w:jc w:val="center"/>
+              <w:rPr/>
+            </w:pPr>
+            <w:r>
+              <w:rPr>
+                <w:rtl w:val="0"/>
+              </w:rPr>
+            </w:r>
+          </w:p>
+        </w:tc>
+        <w:tc>
+          <w:tcPr/>
+          <w:p>
+            <w:pPr>
+              <w:jc w:val="center"/>
+              <w:rPr/>
+            </w:pPr>
+            <w:r>
+              <w:rPr>
+                <w:rtl w:val="0"/>
+              </w:rPr>
+            </w:r>
+          </w:p>
+        </w:tc>
+        <w:tc>
+          <w:tcPr/>
+          <w:p>
+            <w:pPr>
+              <w:jc w:val="center"/>
+              <w:rPr/>
+            </w:pPr>
+            <w:r>
+              <w:rPr>
+                <w:rtl w:val="0"/>
+              </w:rPr>
+              <w:t xml:space="preserve">Total =</w:t>
+            </w:r>
+          </w:p>
+        </w:tc>
+        <w:tc>
+          <w:tcPr/>
+          <w:p>
+            <w:pPr>
+              <w:jc w:val="center"/>
+              <w:rPr/>
+            </w:pPr>
+            <w:r>
+              <w:rPr>
+                <w:b w:val="1"/>
+                <w:bCs w:val="1"/>
+                <w:sz w:val="19"/>
+                <w:szCs w:val="19"/>
+                <w:rtl w:val="0"/>
+              </w:rPr>
+              <w:t xml:space="preserve">{{ ded_total_sqft }}</w:t>
+            </w:r>
+            <w:r>
+              <w:rPr>
+                <w:rtl w:val="0"/>
+              </w:rPr>
+            </w:r>
+          </w:p>
+        </w:tc>
+        <w:tc>
+          <w:tcPr/>
+          <w:p>
+            <w:pPr>
+              <w:jc w:val="center"/>
+              <w:rPr/>
+            </w:pPr>
             <w:r>
               <w:rPr>
                 <w:rtl w:val="0"/>
@@ -20931,7 +20792,7 @@
               <w:rPr>
                 <w:rtl w:val="0"/>
               </w:rPr>
-              <w:t xml:space="preserve">Total =</w:t>
+              <w:t xml:space="preserve">TOTAL =</w:t>
             </w:r>
           </w:p>
         </w:tc>
@@ -20990,63 +20851,63 @@
               <w:rPr>
                 <w:rtl w:val="0"/>
               </w:rPr>
-              <w:t>{{ ded_deduct_pct }}% Area Deducted For Land Development</w:t>
-            </w:r>
-          </w:p>
-        </w:tc>
-        <w:tc>
-          <w:tcPr/>
-          <w:p>
-            <w:pPr>
-              <w:jc w:val="center"/>
-              <w:rPr/>
-            </w:pPr>
-            <w:r>
-              <w:rPr>
-                <w:rtl w:val="0"/>
-              </w:rPr>
-            </w:r>
-          </w:p>
-        </w:tc>
-        <w:tc>
-          <w:tcPr/>
-          <w:p>
-            <w:pPr>
-              <w:jc w:val="center"/>
-              <w:rPr/>
-            </w:pPr>
-            <w:r>
-              <w:rPr>
-                <w:rtl w:val="0"/>
-              </w:rPr>
-            </w:r>
-          </w:p>
-        </w:tc>
-        <w:tc>
-          <w:tcPr/>
-          <w:p>
-            <w:pPr>
-              <w:jc w:val="center"/>
-              <w:rPr/>
-            </w:pPr>
-            <w:r>
-              <w:rPr>
-                <w:rtl w:val="0"/>
-              </w:rPr>
-            </w:r>
-          </w:p>
-        </w:tc>
-        <w:tc>
-          <w:tcPr/>
-          <w:p>
-            <w:pPr>
-              <w:jc w:val="center"/>
-              <w:rPr/>
-            </w:pPr>
-            <w:r>
-              <w:rPr>
-                <w:rtl w:val="0"/>
-              </w:rPr>
+            </w:r>
+          </w:p>
+        </w:tc>
+        <w:tc>
+          <w:tcPr/>
+          <w:p>
+            <w:pPr>
+              <w:jc w:val="center"/>
+              <w:rPr/>
+            </w:pPr>
+            <w:r>
+              <w:rPr>
+                <w:rtl w:val="0"/>
+              </w:rPr>
+            </w:r>
+          </w:p>
+        </w:tc>
+        <w:tc>
+          <w:tcPr/>
+          <w:p>
+            <w:pPr>
+              <w:jc w:val="center"/>
+              <w:rPr/>
+            </w:pPr>
+            <w:r>
+              <w:rPr>
+                <w:rtl w:val="0"/>
+              </w:rPr>
+            </w:r>
+          </w:p>
+        </w:tc>
+        <w:tc>
+          <w:tcPr/>
+          <w:p>
+            <w:pPr>
+              <w:jc w:val="center"/>
+              <w:rPr/>
+            </w:pPr>
+            <w:r>
+              <w:rPr>
+                <w:rtl w:val="0"/>
+              </w:rPr>
+            </w:r>
+          </w:p>
+        </w:tc>
+        <w:tc>
+          <w:tcPr/>
+          <w:p>
+            <w:pPr>
+              <w:jc w:val="center"/>
+              <w:rPr/>
+            </w:pPr>
+            <w:r>
+              <w:rPr>
+                <w:rtl w:val="0"/>
+              </w:rPr>
+              <w:t xml:space="preserve">Area in Sqm.</w:t>
             </w:r>
           </w:p>
         </w:tc>
@@ -21065,237 +20926,7 @@
                 <w:szCs w:val="19"/>
                 <w:rtl w:val="0"/>
               </w:rPr>
-              <w:t>{{ ded_deduct_sqft }}</w:t>
-            </w:r>
-            <w:r>
-              <w:rPr>
-                <w:rtl w:val="0"/>
-              </w:rPr>
-            </w:r>
-          </w:p>
-        </w:tc>
-        <w:tc>
-          <w:tcPr/>
-          <w:p>
-            <w:pPr>
-              <w:jc w:val="center"/>
-              <w:rPr/>
-            </w:pPr>
-            <w:r>
-              <w:rPr>
-                <w:rtl w:val="0"/>
-              </w:rPr>
-            </w:r>
-          </w:p>
-        </w:tc>
-      </w:tr>
-      <w:tr>
-        <w:trPr>
-          <w:cantSplit w:val="0"/>
-          <w:tblHeader w:val="0"/>
-        </w:trPr>
-        <w:tc>
-          <w:tcPr/>
-          <w:p>
-            <w:pPr>
-              <w:jc w:val="center"/>
-              <w:rPr/>
-            </w:pPr>
-            <w:r>
-              <w:rPr>
-                <w:rtl w:val="0"/>
-              </w:rPr>
-            </w:r>
-          </w:p>
-        </w:tc>
-        <w:tc>
-          <w:tcPr/>
-          <w:p>
-            <w:pPr>
-              <w:jc w:val="center"/>
-              <w:rPr/>
-            </w:pPr>
-            <w:r>
-              <w:rPr>
-                <w:rtl w:val="0"/>
-              </w:rPr>
-            </w:r>
-          </w:p>
-        </w:tc>
-        <w:tc>
-          <w:tcPr/>
-          <w:p>
-            <w:pPr>
-              <w:jc w:val="center"/>
-              <w:rPr/>
-            </w:pPr>
-            <w:r>
-              <w:rPr>
-                <w:rtl w:val="0"/>
-              </w:rPr>
-            </w:r>
-          </w:p>
-        </w:tc>
-        <w:tc>
-          <w:tcPr/>
-          <w:p>
-            <w:pPr>
-              <w:jc w:val="center"/>
-              <w:rPr/>
-            </w:pPr>
-            <w:r>
-              <w:rPr>
-                <w:rtl w:val="0"/>
-              </w:rPr>
-            </w:r>
-          </w:p>
-        </w:tc>
-        <w:tc>
-          <w:tcPr/>
-          <w:p>
-            <w:pPr>
-              <w:jc w:val="center"/>
-              <w:rPr/>
-            </w:pPr>
-            <w:r>
-              <w:rPr>
-                <w:rtl w:val="0"/>
-              </w:rPr>
-              <w:t>TOTAL =</w:t>
-            </w:r>
-          </w:p>
-        </w:tc>
-        <w:tc>
-          <w:tcPr/>
-          <w:p>
-            <w:pPr>
-              <w:jc w:val="center"/>
-              <w:rPr/>
-            </w:pPr>
-            <w:r>
-              <w:rPr>
-                <w:b w:val="1"/>
-                <w:bCs w:val="1"/>
-                <w:sz w:val="19"/>
-                <w:szCs w:val="19"/>
-                <w:rtl w:val="0"/>
-              </w:rPr>
-              <w:t>{{ ded_after_sqft }}</w:t>
-            </w:r>
-            <w:r>
-              <w:rPr>
-                <w:rtl w:val="0"/>
-              </w:rPr>
-            </w:r>
-          </w:p>
-        </w:tc>
-        <w:tc>
-          <w:tcPr/>
-          <w:p>
-            <w:pPr>
-              <w:jc w:val="center"/>
-              <w:rPr/>
-            </w:pPr>
-            <w:r>
-              <w:rPr>
-                <w:rtl w:val="0"/>
-              </w:rPr>
-            </w:r>
-          </w:p>
-        </w:tc>
-      </w:tr>
-      <w:tr>
-        <w:trPr>
-          <w:cantSplit w:val="0"/>
-          <w:tblHeader w:val="0"/>
-        </w:trPr>
-        <w:tc>
-          <w:tcPr/>
-          <w:p>
-            <w:pPr>
-              <w:jc w:val="center"/>
-              <w:rPr/>
-            </w:pPr>
-            <w:r>
-              <w:rPr>
-                <w:rtl w:val="0"/>
-              </w:rPr>
-            </w:r>
-          </w:p>
-        </w:tc>
-        <w:tc>
-          <w:tcPr/>
-          <w:p>
-            <w:pPr>
-              <w:jc w:val="center"/>
-              <w:rPr/>
-            </w:pPr>
-            <w:r>
-              <w:rPr>
-                <w:rtl w:val="0"/>
-              </w:rPr>
-            </w:r>
-          </w:p>
-        </w:tc>
-        <w:tc>
-          <w:tcPr/>
-          <w:p>
-            <w:pPr>
-              <w:jc w:val="center"/>
-              <w:rPr/>
-            </w:pPr>
-            <w:r>
-              <w:rPr>
-                <w:rtl w:val="0"/>
-              </w:rPr>
-            </w:r>
-          </w:p>
-        </w:tc>
-        <w:tc>
-          <w:tcPr/>
-          <w:p>
-            <w:pPr>
-              <w:jc w:val="center"/>
-              <w:rPr/>
-            </w:pPr>
-            <w:r>
-              <w:rPr>
-                <w:rtl w:val="0"/>
-              </w:rPr>
-            </w:r>
-          </w:p>
-        </w:tc>
-        <w:tc>
-          <w:tcPr/>
-          <w:p>
-            <w:pPr>
-              <w:jc w:val="center"/>
-              <w:rPr/>
-            </w:pPr>
-            <w:r>
-              <w:rPr>
-                <w:rtl w:val="0"/>
-              </w:rPr>
-              <w:t>Area in Sqm.</w:t>
-            </w:r>
-          </w:p>
-        </w:tc>
-        <w:tc>
-          <w:tcPr/>
-          <w:p>
-            <w:pPr>
-              <w:jc w:val="center"/>
-              <w:rPr/>
-            </w:pPr>
-            <w:r>
-              <w:rPr>
-                <w:b w:val="1"/>
-                <w:bCs w:val="1"/>
-                <w:sz w:val="19"/>
-                <w:szCs w:val="19"/>
-                <w:rtl w:val="0"/>
-              </w:rPr>
-              <w:t>{{ ded_after_sqm }}</w:t>
+              <w:t xml:space="preserve">{{ ded_total_sqm }}</w:t>
             </w:r>
             <w:r>
               <w:rPr>
@@ -21325,6 +20956,40 @@
         <w:spacing w:after="0" w:before="160" w:lineRule="auto"/>
         <w:jc w:val="left"/>
         <w:rPr/>
+      </w:pPr>
+      <w:r>
+        <w:rPr>
+          <w:rtl w:val="0"/>
+        </w:rPr>
+      </w:r>
+    </w:p>
+    <w:p>
+      <w:pPr>
+        <w:spacing w:after="80" w:before="0" w:lineRule="auto"/>
+        <w:jc w:val="left"/>
+        <w:rPr>
+          <w:b w:val="1"/>
+          <w:bCs w:val="1"/>
+          <w:sz w:val="20"/>
+          <w:szCs w:val="20"/>
+        </w:rPr>
+      </w:pPr>
+      <w:r>
+        <w:rPr>
+          <w:rtl w:val="0"/>
+        </w:rPr>
+      </w:r>
+    </w:p>
+    <w:p>
+      <w:pPr>
+        <w:spacing w:after="80" w:before="0" w:lineRule="auto"/>
+        <w:jc w:val="left"/>
+        <w:rPr>
+          <w:b w:val="1"/>
+          <w:bCs w:val="1"/>
+          <w:sz w:val="20"/>
+          <w:szCs w:val="20"/>
+        </w:rPr>
       </w:pPr>
       <w:r>
         <w:rPr>
@@ -21416,7 +21081,7 @@
                 <w:szCs w:val="19"/>
                 <w:rtl w:val="0"/>
               </w:rPr>
-              <w:t>Triangle</w:t>
+              <w:t xml:space="preserve">Location</w:t>
             </w:r>
             <w:r>
               <w:rPr>
@@ -21443,7 +21108,7 @@
                 <w:szCs w:val="19"/>
                 <w:rtl w:val="0"/>
               </w:rPr>
-              <w:t>Side a</w:t>
+              <w:t xml:space="preserve">Plot No.</w:t>
             </w:r>
             <w:r>
               <w:rPr>
@@ -21470,7 +21135,7 @@
                 <w:szCs w:val="19"/>
                 <w:rtl w:val="0"/>
               </w:rPr>
-              <w:t>Side b</w:t>
+              <w:t xml:space="preserve">Ropani</w:t>
             </w:r>
             <w:r>
               <w:rPr>
@@ -21497,7 +21162,7 @@
                 <w:szCs w:val="19"/>
                 <w:rtl w:val="0"/>
               </w:rPr>
-              <w:t>Side c</w:t>
+              <w:t xml:space="preserve">Anna</w:t>
             </w:r>
             <w:r>
               <w:rPr>
@@ -21524,7 +21189,7 @@
                 <w:szCs w:val="19"/>
                 <w:rtl w:val="0"/>
               </w:rPr>
-              <w:t>S=(a+b+c)/2</w:t>
+              <w:t xml:space="preserve">Paisa</w:t>
             </w:r>
             <w:r>
               <w:rPr>
@@ -21551,7 +21216,7 @@
                 <w:szCs w:val="19"/>
                 <w:rtl w:val="0"/>
               </w:rPr>
-              <w:t>Total area in Sqft.</w:t>
+              <w:t xml:space="preserve">Dam</w:t>
             </w:r>
             <w:r>
               <w:rPr>
@@ -21578,7 +21243,7 @@
                 <w:szCs w:val="19"/>
                 <w:rtl w:val="0"/>
               </w:rPr>
-              <w:t>Land in Aana</w:t>
+              <w:t xml:space="preserve">Area in Sq.ft.</w:t>
             </w:r>
             <w:r>
               <w:rPr>
@@ -21594,649 +21259,151 @@
           <w:tblHeader w:val="0"/>
         </w:trPr>
         <w:tc>
-          <w:tcPr>
-            <w:shd w:fill="1f3a2e" w:val="clear"/>
-          </w:tcPr>
-          <w:p>
-            <w:pPr>
-              <w:jc w:val="center"/>
-              <w:rPr/>
-            </w:pPr>
-            <w:r>
-              <w:rPr>
-                <w:b w:val="1"/>
-                <w:bCs w:val="1"/>
-                <w:color w:val="ffffff"/>
-                <w:sz w:val="19"/>
-                <w:szCs w:val="19"/>
-                <w:rtl w:val="0"/>
-              </w:rPr>
-              <w:t>Plot No.</w:t>
-            </w:r>
-            <w:r>
-              <w:rPr>
-                <w:rtl w:val="0"/>
-              </w:rPr>
-            </w:r>
-          </w:p>
-        </w:tc>
-        <w:tc>
-          <w:tcPr>
-            <w:shd w:fill="1f3a2e" w:val="clear"/>
-          </w:tcPr>
-          <w:p>
-            <w:pPr>
-              <w:jc w:val="center"/>
-              <w:rPr/>
-            </w:pPr>
-            <w:r>
-              <w:rPr>
-                <w:b w:val="1"/>
-                <w:bCs w:val="1"/>
-                <w:color w:val="ffffff"/>
-                <w:sz w:val="19"/>
-                <w:szCs w:val="19"/>
-                <w:rtl w:val="0"/>
-              </w:rPr>
-              <w:t>{{ plot_no }}</w:t>
-            </w:r>
-            <w:r>
-              <w:rPr>
-                <w:rtl w:val="0"/>
-              </w:rPr>
-            </w:r>
-          </w:p>
-        </w:tc>
-        <w:tc>
-          <w:tcPr>
-            <w:shd w:fill="1f3a2e" w:val="clear"/>
-          </w:tcPr>
-          <w:p>
-            <w:pPr>
-              <w:jc w:val="center"/>
-              <w:rPr/>
-            </w:pPr>
-            <w:r>
-              <w:rPr>
-                <w:b w:val="1"/>
-                <w:bCs w:val="1"/>
-                <w:color w:val="ffffff"/>
-                <w:sz w:val="19"/>
-                <w:szCs w:val="19"/>
-                <w:rtl w:val="0"/>
-              </w:rPr>
-            </w:r>
-            <w:r>
-              <w:rPr>
-                <w:rtl w:val="0"/>
-              </w:rPr>
-            </w:r>
-          </w:p>
-        </w:tc>
-        <w:tc>
-          <w:tcPr>
-            <w:shd w:fill="1f3a2e" w:val="clear"/>
-          </w:tcPr>
-          <w:p>
-            <w:pPr>
-              <w:jc w:val="center"/>
-              <w:rPr/>
-            </w:pPr>
-            <w:r>
-              <w:rPr>
-                <w:b w:val="1"/>
-                <w:bCs w:val="1"/>
-                <w:color w:val="ffffff"/>
-                <w:sz w:val="19"/>
-                <w:szCs w:val="19"/>
-                <w:rtl w:val="0"/>
-              </w:rPr>
-            </w:r>
-            <w:r>
-              <w:rPr>
-                <w:rtl w:val="0"/>
-              </w:rPr>
-            </w:r>
-          </w:p>
-        </w:tc>
-        <w:tc>
-          <w:tcPr>
-            <w:shd w:fill="1f3a2e" w:val="clear"/>
-          </w:tcPr>
-          <w:p>
-            <w:pPr>
-              <w:jc w:val="center"/>
-              <w:rPr/>
-            </w:pPr>
-            <w:r>
-              <w:rPr>
-                <w:b w:val="1"/>
-                <w:bCs w:val="1"/>
-                <w:color w:val="ffffff"/>
-                <w:sz w:val="19"/>
-                <w:szCs w:val="19"/>
-                <w:rtl w:val="0"/>
-              </w:rPr>
-            </w:r>
-            <w:r>
-              <w:rPr>
-                <w:rtl w:val="0"/>
-              </w:rPr>
-            </w:r>
-          </w:p>
-        </w:tc>
-        <w:tc>
-          <w:tcPr>
-            <w:shd w:fill="1f3a2e" w:val="clear"/>
-          </w:tcPr>
-          <w:p>
-            <w:pPr>
-              <w:jc w:val="center"/>
-              <w:rPr/>
-            </w:pPr>
-            <w:r>
-              <w:rPr>
-                <w:b w:val="1"/>
-                <w:bCs w:val="1"/>
-                <w:color w:val="ffffff"/>
-                <w:sz w:val="19"/>
-                <w:szCs w:val="19"/>
-                <w:rtl w:val="0"/>
-              </w:rPr>
-            </w:r>
-            <w:r>
-              <w:rPr>
-                <w:rtl w:val="0"/>
-              </w:rPr>
-            </w:r>
-          </w:p>
-        </w:tc>
-        <w:tc>
-          <w:tcPr>
-            <w:shd w:fill="1f3a2e" w:val="clear"/>
-          </w:tcPr>
-          <w:p>
-            <w:pPr>
-              <w:jc w:val="center"/>
-              <w:rPr/>
-            </w:pPr>
-            <w:r>
-              <w:rPr>
-                <w:b w:val="1"/>
-                <w:bCs w:val="1"/>
-                <w:color w:val="ffffff"/>
-                <w:sz w:val="19"/>
-                <w:szCs w:val="19"/>
-                <w:rtl w:val="0"/>
-              </w:rPr>
-            </w:r>
-            <w:r>
-              <w:rPr>
-                <w:rtl w:val="0"/>
-              </w:rPr>
-            </w:r>
-          </w:p>
-        </w:tc>
-      </w:tr>
-      <w:tr>
-        <w:trPr>
-          <w:cantSplit w:val="0"/>
-          <w:tblHeader w:val="0"/>
-        </w:trPr>
-        <w:tc>
-          <w:tcPr/>
-          <w:p>
-            <w:pPr>
-              <w:jc w:val="center"/>
-              <w:rPr/>
-            </w:pPr>
-            <w:r>
-              <w:rPr>
-                <w:sz w:val="19"/>
-                <w:szCs w:val="19"/>
-                <w:rtl w:val="0"/>
-              </w:rPr>
-              <w:t>{%tr for t in lorc_triangles %}</w:t>
-            </w:r>
-            <w:r>
-              <w:rPr>
-                <w:rtl w:val="0"/>
-              </w:rPr>
-            </w:r>
-          </w:p>
-        </w:tc>
-        <w:tc>
-          <w:tcPr/>
-          <w:p>
-            <w:pPr>
-              <w:jc w:val="center"/>
-              <w:rPr/>
-            </w:pPr>
-            <w:r>
-              <w:rPr>
-                <w:sz w:val="19"/>
-                <w:szCs w:val="19"/>
-                <w:rtl w:val="0"/>
-              </w:rPr>
-            </w:r>
-            <w:r>
-              <w:rPr>
-                <w:rtl w:val="0"/>
-              </w:rPr>
-            </w:r>
-          </w:p>
-        </w:tc>
-        <w:tc>
-          <w:tcPr/>
-          <w:p>
-            <w:pPr>
-              <w:jc w:val="center"/>
-              <w:rPr/>
-            </w:pPr>
-            <w:r>
-              <w:rPr>
-                <w:sz w:val="19"/>
-                <w:szCs w:val="19"/>
-                <w:rtl w:val="0"/>
-              </w:rPr>
-            </w:r>
-            <w:r>
-              <w:rPr>
-                <w:rtl w:val="0"/>
-              </w:rPr>
-            </w:r>
-          </w:p>
-        </w:tc>
-        <w:tc>
-          <w:tcPr/>
-          <w:p>
-            <w:pPr>
-              <w:jc w:val="center"/>
-              <w:rPr/>
-            </w:pPr>
-            <w:r>
-              <w:rPr>
-                <w:sz w:val="19"/>
-                <w:szCs w:val="19"/>
-                <w:rtl w:val="0"/>
-              </w:rPr>
-            </w:r>
-            <w:r>
-              <w:rPr>
-                <w:rtl w:val="0"/>
-              </w:rPr>
-            </w:r>
-          </w:p>
-        </w:tc>
-        <w:tc>
-          <w:tcPr/>
-          <w:p>
-            <w:pPr>
-              <w:jc w:val="center"/>
-              <w:rPr/>
-            </w:pPr>
-            <w:r>
-              <w:rPr>
-                <w:sz w:val="19"/>
-                <w:szCs w:val="19"/>
-                <w:rtl w:val="0"/>
-              </w:rPr>
-            </w:r>
-            <w:r>
-              <w:rPr>
-                <w:rtl w:val="0"/>
-              </w:rPr>
-            </w:r>
-          </w:p>
-        </w:tc>
-        <w:tc>
-          <w:tcPr/>
-          <w:p>
-            <w:pPr>
-              <w:jc w:val="center"/>
-              <w:rPr/>
-            </w:pPr>
-            <w:r>
-              <w:rPr>
-                <w:sz w:val="19"/>
-                <w:szCs w:val="19"/>
-                <w:rtl w:val="0"/>
-              </w:rPr>
-            </w:r>
-            <w:r>
-              <w:rPr>
-                <w:rtl w:val="0"/>
-              </w:rPr>
-            </w:r>
-          </w:p>
-        </w:tc>
-        <w:tc>
-          <w:tcPr/>
-          <w:p>
-            <w:pPr>
-              <w:jc w:val="center"/>
-              <w:rPr/>
-            </w:pPr>
-            <w:r>
-              <w:rPr>
-                <w:sz w:val="19"/>
-                <w:szCs w:val="19"/>
-                <w:rtl w:val="0"/>
-              </w:rPr>
-            </w:r>
-            <w:r>
-              <w:rPr>
-                <w:rtl w:val="0"/>
-              </w:rPr>
-            </w:r>
-          </w:p>
-        </w:tc>
-      </w:tr>
-      <w:tr>
-        <w:trPr>
-          <w:cantSplit w:val="0"/>
-          <w:tblHeader w:val="0"/>
-        </w:trPr>
-        <w:tc>
-          <w:tcPr/>
-          <w:p>
-            <w:pPr>
-              <w:jc w:val="center"/>
-              <w:rPr/>
-            </w:pPr>
-            <w:r>
-              <w:rPr>
-                <w:sz w:val="19"/>
-                <w:szCs w:val="19"/>
-                <w:rtl w:val="0"/>
-              </w:rPr>
-              <w:t>{{ t.label }}</w:t>
-            </w:r>
-            <w:r>
-              <w:rPr>
-                <w:rtl w:val="0"/>
-              </w:rPr>
-            </w:r>
-          </w:p>
-        </w:tc>
-        <w:tc>
-          <w:tcPr/>
-          <w:p>
-            <w:pPr>
-              <w:jc w:val="center"/>
-              <w:rPr/>
-            </w:pPr>
-            <w:r>
-              <w:rPr>
-                <w:sz w:val="19"/>
-                <w:szCs w:val="19"/>
-                <w:rtl w:val="0"/>
-              </w:rPr>
-              <w:t>{{ t.side_a }}</w:t>
-            </w:r>
-            <w:r>
-              <w:rPr>
-                <w:rtl w:val="0"/>
-              </w:rPr>
-            </w:r>
-          </w:p>
-        </w:tc>
-        <w:tc>
-          <w:tcPr/>
-          <w:p>
-            <w:pPr>
-              <w:jc w:val="center"/>
-              <w:rPr/>
-            </w:pPr>
-            <w:r>
-              <w:rPr>
-                <w:sz w:val="19"/>
-                <w:szCs w:val="19"/>
-                <w:rtl w:val="0"/>
-              </w:rPr>
-              <w:t>{{ t.side_b }}</w:t>
-            </w:r>
-            <w:r>
-              <w:rPr>
-                <w:rtl w:val="0"/>
-              </w:rPr>
-            </w:r>
-          </w:p>
-        </w:tc>
-        <w:tc>
-          <w:tcPr/>
-          <w:p>
-            <w:pPr>
-              <w:jc w:val="center"/>
-              <w:rPr/>
-            </w:pPr>
-            <w:r>
-              <w:rPr>
-                <w:sz w:val="19"/>
-                <w:szCs w:val="19"/>
-                <w:rtl w:val="0"/>
-              </w:rPr>
-              <w:t>{{ t.side_c }}</w:t>
-            </w:r>
-            <w:r>
-              <w:rPr>
-                <w:rtl w:val="0"/>
-              </w:rPr>
-            </w:r>
-          </w:p>
-        </w:tc>
-        <w:tc>
-          <w:tcPr/>
-          <w:p>
-            <w:pPr>
-              <w:jc w:val="center"/>
-              <w:rPr/>
-            </w:pPr>
-            <w:r>
-              <w:rPr>
-                <w:sz w:val="19"/>
-                <w:szCs w:val="19"/>
-                <w:rtl w:val="0"/>
-              </w:rPr>
-              <w:t>{{ t.semi_perimeter }}</w:t>
-            </w:r>
-            <w:r>
-              <w:rPr>
-                <w:rtl w:val="0"/>
-              </w:rPr>
-            </w:r>
-          </w:p>
-        </w:tc>
-        <w:tc>
-          <w:tcPr/>
-          <w:p>
-            <w:pPr>
-              <w:jc w:val="center"/>
-              <w:rPr/>
-            </w:pPr>
-            <w:r>
-              <w:rPr>
-                <w:sz w:val="19"/>
-                <w:szCs w:val="19"/>
-                <w:rtl w:val="0"/>
-              </w:rPr>
-              <w:t>{{ t.area_sqft }}</w:t>
-            </w:r>
-            <w:r>
-              <w:rPr>
-                <w:rtl w:val="0"/>
-              </w:rPr>
-            </w:r>
-          </w:p>
-        </w:tc>
-        <w:tc>
-          <w:tcPr/>
-          <w:p>
-            <w:pPr>
-              <w:jc w:val="center"/>
-              <w:rPr/>
-            </w:pPr>
-            <w:r>
-              <w:rPr>
-                <w:sz w:val="19"/>
-                <w:szCs w:val="19"/>
-                <w:rtl w:val="0"/>
-              </w:rPr>
-              <w:t>{{ t.aana }}</w:t>
-            </w:r>
-            <w:r>
-              <w:rPr>
-                <w:rtl w:val="0"/>
-              </w:rPr>
-            </w:r>
-          </w:p>
-        </w:tc>
-      </w:tr>
-      <w:tr>
-        <w:trPr>
-          <w:cantSplit w:val="0"/>
-          <w:tblHeader w:val="0"/>
-        </w:trPr>
-        <w:tc>
-          <w:tcPr/>
-          <w:p>
-            <w:pPr>
-              <w:jc w:val="center"/>
-              <w:rPr/>
-            </w:pPr>
-            <w:r>
-              <w:rPr>
-                <w:sz w:val="19"/>
-                <w:szCs w:val="19"/>
-                <w:rtl w:val="0"/>
-              </w:rPr>
-              <w:t>{%tr endfor %}</w:t>
-            </w:r>
-            <w:r>
-              <w:rPr>
-                <w:rtl w:val="0"/>
-              </w:rPr>
-            </w:r>
-          </w:p>
-        </w:tc>
-        <w:tc>
-          <w:tcPr/>
-          <w:p>
-            <w:pPr>
-              <w:jc w:val="center"/>
-              <w:rPr/>
-            </w:pPr>
-            <w:r>
-              <w:rPr>
-                <w:sz w:val="19"/>
-                <w:szCs w:val="19"/>
-                <w:rtl w:val="0"/>
-              </w:rPr>
-            </w:r>
-            <w:r>
-              <w:rPr>
-                <w:rtl w:val="0"/>
-              </w:rPr>
-            </w:r>
-          </w:p>
-        </w:tc>
-        <w:tc>
-          <w:tcPr/>
-          <w:p>
-            <w:pPr>
-              <w:jc w:val="center"/>
-              <w:rPr/>
-            </w:pPr>
-            <w:r>
-              <w:rPr>
-                <w:sz w:val="19"/>
-                <w:szCs w:val="19"/>
-                <w:rtl w:val="0"/>
-              </w:rPr>
-            </w:r>
-            <w:r>
-              <w:rPr>
-                <w:rtl w:val="0"/>
-              </w:rPr>
-            </w:r>
-          </w:p>
-        </w:tc>
-        <w:tc>
-          <w:tcPr/>
-          <w:p>
-            <w:pPr>
-              <w:jc w:val="center"/>
-              <w:rPr/>
-            </w:pPr>
-            <w:r>
-              <w:rPr>
-                <w:sz w:val="19"/>
-                <w:szCs w:val="19"/>
-                <w:rtl w:val="0"/>
-              </w:rPr>
-            </w:r>
-            <w:r>
-              <w:rPr>
-                <w:rtl w:val="0"/>
-              </w:rPr>
-            </w:r>
-          </w:p>
-        </w:tc>
-        <w:tc>
-          <w:tcPr/>
-          <w:p>
-            <w:pPr>
-              <w:jc w:val="center"/>
-              <w:rPr/>
-            </w:pPr>
-            <w:r>
-              <w:rPr>
-                <w:sz w:val="19"/>
-                <w:szCs w:val="19"/>
-                <w:rtl w:val="0"/>
-              </w:rPr>
-            </w:r>
-            <w:r>
-              <w:rPr>
-                <w:rtl w:val="0"/>
-              </w:rPr>
-            </w:r>
-          </w:p>
-        </w:tc>
-        <w:tc>
-          <w:tcPr/>
-          <w:p>
-            <w:pPr>
-              <w:jc w:val="center"/>
-              <w:rPr/>
-            </w:pPr>
-            <w:r>
-              <w:rPr>
-                <w:sz w:val="19"/>
-                <w:szCs w:val="19"/>
-                <w:rtl w:val="0"/>
-              </w:rPr>
-            </w:r>
-            <w:r>
-              <w:rPr>
-                <w:rtl w:val="0"/>
-              </w:rPr>
-            </w:r>
-          </w:p>
-        </w:tc>
-        <w:tc>
-          <w:tcPr/>
-          <w:p>
-            <w:pPr>
-              <w:jc w:val="center"/>
-              <w:rPr/>
-            </w:pPr>
-            <w:r>
-              <w:rPr>
-                <w:sz w:val="19"/>
-                <w:szCs w:val="19"/>
-                <w:rtl w:val="0"/>
-              </w:rPr>
+          <w:tcPr/>
+          <w:p>
+            <w:pPr>
+              <w:jc w:val="center"/>
+              <w:rPr/>
+            </w:pPr>
+            <w:r>
+              <w:rPr>
+                <w:sz w:val="19"/>
+                <w:szCs w:val="19"/>
+                <w:rtl w:val="0"/>
+              </w:rPr>
+              <w:t xml:space="preserve">{{ property_location_full }}</w:t>
+            </w:r>
+            <w:r>
+              <w:rPr>
+                <w:rtl w:val="0"/>
+              </w:rPr>
+            </w:r>
+          </w:p>
+        </w:tc>
+        <w:tc>
+          <w:tcPr/>
+          <w:p>
+            <w:pPr>
+              <w:jc w:val="center"/>
+              <w:rPr/>
+            </w:pPr>
+            <w:r>
+              <w:rPr>
+                <w:sz w:val="19"/>
+                <w:szCs w:val="19"/>
+                <w:rtl w:val="0"/>
+              </w:rPr>
+              <w:t xml:space="preserve">{{ plot_no }}</w:t>
+            </w:r>
+            <w:r>
+              <w:rPr>
+                <w:rtl w:val="0"/>
+              </w:rPr>
+            </w:r>
+          </w:p>
+        </w:tc>
+        <w:tc>
+          <w:tcPr/>
+          <w:p>
+            <w:pPr>
+              <w:jc w:val="center"/>
+              <w:rPr/>
+            </w:pPr>
+            <w:r>
+              <w:rPr>
+                <w:sz w:val="19"/>
+                <w:szCs w:val="19"/>
+                <w:rtl w:val="0"/>
+              </w:rPr>
+              <w:t xml:space="preserve">{{ lorc_r }}</w:t>
+            </w:r>
+            <w:r>
+              <w:rPr>
+                <w:rtl w:val="0"/>
+              </w:rPr>
+            </w:r>
+          </w:p>
+        </w:tc>
+        <w:tc>
+          <w:tcPr/>
+          <w:p>
+            <w:pPr>
+              <w:jc w:val="center"/>
+              <w:rPr/>
+            </w:pPr>
+            <w:r>
+              <w:rPr>
+                <w:sz w:val="19"/>
+                <w:szCs w:val="19"/>
+                <w:rtl w:val="0"/>
+              </w:rPr>
+              <w:t xml:space="preserve">{{ lorc_a }}</w:t>
+            </w:r>
+            <w:r>
+              <w:rPr>
+                <w:rtl w:val="0"/>
+              </w:rPr>
+            </w:r>
+          </w:p>
+        </w:tc>
+        <w:tc>
+          <w:tcPr/>
+          <w:p>
+            <w:pPr>
+              <w:jc w:val="center"/>
+              <w:rPr/>
+            </w:pPr>
+            <w:r>
+              <w:rPr>
+                <w:sz w:val="19"/>
+                <w:szCs w:val="19"/>
+                <w:rtl w:val="0"/>
+              </w:rPr>
+              <w:t xml:space="preserve">{{ lorc_p }}</w:t>
+            </w:r>
+            <w:r>
+              <w:rPr>
+                <w:rtl w:val="0"/>
+              </w:rPr>
+            </w:r>
+          </w:p>
+        </w:tc>
+        <w:tc>
+          <w:tcPr/>
+          <w:p>
+            <w:pPr>
+              <w:jc w:val="center"/>
+              <w:rPr/>
+            </w:pPr>
+            <w:r>
+              <w:rPr>
+                <w:sz w:val="19"/>
+                <w:szCs w:val="19"/>
+                <w:rtl w:val="0"/>
+              </w:rPr>
+              <w:t xml:space="preserve">{{ lorc_d }}</w:t>
+            </w:r>
+            <w:r>
+              <w:rPr>
+                <w:rtl w:val="0"/>
+              </w:rPr>
+            </w:r>
+          </w:p>
+        </w:tc>
+        <w:tc>
+          <w:tcPr/>
+          <w:p>
+            <w:pPr>
+              <w:jc w:val="center"/>
+              <w:rPr/>
+            </w:pPr>
+            <w:r>
+              <w:rPr>
+                <w:sz w:val="19"/>
+                <w:szCs w:val="19"/>
+                <w:rtl w:val="0"/>
+              </w:rPr>
+              <w:t xml:space="preserve">{{ land_area_lorc_sqft }}</w:t>
             </w:r>
             <w:r>
               <w:rPr>
@@ -22942,12 +22109,76 @@
       </w:r>
     </w:p>
     <w:sectPr>
+      <w:headerReference r:id="rId7" w:type="first"/>
+      <w:footerReference r:id="rId8" w:type="default"/>
+      <w:footerReference r:id="rId9" w:type="first"/>
       <w:pgSz w:h="15840" w:w="12240" w:orient="portrait"/>
       <w:pgMar w:bottom="1440" w:top="1440" w:left="1728" w:right="1440" w:header="720" w:footer="720"/>
-      <w:pgNumType w:start="1"/>
+      <w:pgNumType w:start="0"/>
+      <w:titlePg w:val="1"/>
     </w:sectPr>
   </w:body>
 </w:document>
+</file>
+
+<file path=word/footer1.xml><?xml version="1.0" encoding="utf-8"?>
+<w:ftr xmlns:mc="http://schemas.openxmlformats.org/markup-compatibility/2006" xmlns:o="urn:schemas-microsoft-com:office:office" xmlns:r="http://schemas.openxmlformats.org/officeDocument/2006/relationships" xmlns:m="http://schemas.openxmlformats.org/officeDocument/2006/math" xmlns:v="urn:schemas-microsoft-com:vml" xmlns:wp="http://schemas.openxmlformats.org/drawingml/2006/wordprocessingDrawing" xmlns:w10="urn:schemas-microsoft-com:office:word" xmlns:w="http://schemas.openxmlformats.org/wordprocessingml/2006/main" xmlns:wne="http://schemas.microsoft.com/office/word/2006/wordml" xmlns:sl="http://schemas.openxmlformats.org/schemaLibrary/2006/main" xmlns:a="http://schemas.openxmlformats.org/drawingml/2006/main" xmlns:pic="http://schemas.openxmlformats.org/drawingml/2006/picture" xmlns:c="http://schemas.openxmlformats.org/drawingml/2006/chart" xmlns:lc="http://schemas.openxmlformats.org/drawingml/2006/lockedCanvas" xmlns:dgm="http://schemas.openxmlformats.org/drawingml/2006/diagram" xmlns:wps="http://schemas.microsoft.com/office/word/2010/wordprocessingShape" xmlns:wpg="http://schemas.microsoft.com/office/word/2010/wordprocessingGroup" xmlns:w14="http://schemas.microsoft.com/office/word/2010/wordml" xmlns:w15="http://schemas.microsoft.com/office/word/2012/wordml" xmlns:w16="http://schemas.microsoft.com/office/word/2018/wordml" xmlns:w16cex="http://schemas.microsoft.com/office/word/2018/wordml/cex" xmlns:w16cid="http://schemas.microsoft.com/office/word/2016/wordml/cid" xmlns="http://schemas.microsoft.com/office/tasks/2019/documenttasks" xmlns:cr="http://schemas.microsoft.com/office/comments/2020/reactions">
+  <w:p>
+    <w:pPr>
+      <w:rPr/>
+    </w:pPr>
+    <w:r>
+      <w:rPr/>
+      <w:fldChar w:fldCharType="begin"/>
+      <w:instrText xml:space="preserve">PAGE</w:instrText>
+      <w:fldChar w:fldCharType="separate"/>
+      <w:fldChar w:fldCharType="end"/>
+    </w:r>
+    <w:r>
+      <w:rPr>
+        <w:rtl w:val="0"/>
+      </w:rPr>
+    </w:r>
+  </w:p>
+</w:ftr>
+</file>
+
+<file path=word/footer2.xml><?xml version="1.0" encoding="utf-8"?>
+<w:ftr xmlns:mc="http://schemas.openxmlformats.org/markup-compatibility/2006" xmlns:o="urn:schemas-microsoft-com:office:office" xmlns:r="http://schemas.openxmlformats.org/officeDocument/2006/relationships" xmlns:m="http://schemas.openxmlformats.org/officeDocument/2006/math" xmlns:v="urn:schemas-microsoft-com:vml" xmlns:wp="http://schemas.openxmlformats.org/drawingml/2006/wordprocessingDrawing" xmlns:w10="urn:schemas-microsoft-com:office:word" xmlns:w="http://schemas.openxmlformats.org/wordprocessingml/2006/main" xmlns:wne="http://schemas.microsoft.com/office/word/2006/wordml" xmlns:sl="http://schemas.openxmlformats.org/schemaLibrary/2006/main" xmlns:a="http://schemas.openxmlformats.org/drawingml/2006/main" xmlns:pic="http://schemas.openxmlformats.org/drawingml/2006/picture" xmlns:c="http://schemas.openxmlformats.org/drawingml/2006/chart" xmlns:lc="http://schemas.openxmlformats.org/drawingml/2006/lockedCanvas" xmlns:dgm="http://schemas.openxmlformats.org/drawingml/2006/diagram" xmlns:wps="http://schemas.microsoft.com/office/word/2010/wordprocessingShape" xmlns:wpg="http://schemas.microsoft.com/office/word/2010/wordprocessingGroup" xmlns:w14="http://schemas.microsoft.com/office/word/2010/wordml" xmlns:w15="http://schemas.microsoft.com/office/word/2012/wordml" xmlns:w16="http://schemas.microsoft.com/office/word/2018/wordml" xmlns:w16cex="http://schemas.microsoft.com/office/word/2018/wordml/cex" xmlns:w16cid="http://schemas.microsoft.com/office/word/2016/wordml/cid" xmlns="http://schemas.microsoft.com/office/tasks/2019/documenttasks" xmlns:cr="http://schemas.microsoft.com/office/comments/2020/reactions">
+  <w:p>
+    <w:pPr>
+      <w:jc w:val="right"/>
+      <w:rPr/>
+    </w:pPr>
+    <w:r>
+      <w:rPr/>
+      <w:fldChar w:fldCharType="begin"/>
+      <w:instrText xml:space="preserve">PAGE</w:instrText>
+      <w:fldChar w:fldCharType="separate"/>
+      <w:fldChar w:fldCharType="end"/>
+    </w:r>
+    <w:r>
+      <w:rPr>
+        <w:rtl w:val="0"/>
+      </w:rPr>
+    </w:r>
+  </w:p>
+</w:ftr>
+</file>
+
+<file path=word/header1.xml><?xml version="1.0" encoding="utf-8"?>
+<w:hdr xmlns:mc="http://schemas.openxmlformats.org/markup-compatibility/2006" xmlns:o="urn:schemas-microsoft-com:office:office" xmlns:r="http://schemas.openxmlformats.org/officeDocument/2006/relationships" xmlns:m="http://schemas.openxmlformats.org/officeDocument/2006/math" xmlns:v="urn:schemas-microsoft-com:vml" xmlns:wp="http://schemas.openxmlformats.org/drawingml/2006/wordprocessingDrawing" xmlns:w10="urn:schemas-microsoft-com:office:word" xmlns:w="http://schemas.openxmlformats.org/wordprocessingml/2006/main" xmlns:wne="http://schemas.microsoft.com/office/word/2006/wordml" xmlns:sl="http://schemas.openxmlformats.org/schemaLibrary/2006/main" xmlns:a="http://schemas.openxmlformats.org/drawingml/2006/main" xmlns:pic="http://schemas.openxmlformats.org/drawingml/2006/picture" xmlns:c="http://schemas.openxmlformats.org/drawingml/2006/chart" xmlns:lc="http://schemas.openxmlformats.org/drawingml/2006/lockedCanvas" xmlns:dgm="http://schemas.openxmlformats.org/drawingml/2006/diagram" xmlns:wps="http://schemas.microsoft.com/office/word/2010/wordprocessingShape" xmlns:wpg="http://schemas.microsoft.com/office/word/2010/wordprocessingGroup" xmlns:w14="http://schemas.microsoft.com/office/word/2010/wordml" xmlns:w15="http://schemas.microsoft.com/office/word/2012/wordml" xmlns:w16="http://schemas.microsoft.com/office/word/2018/wordml" xmlns:w16cex="http://schemas.microsoft.com/office/word/2018/wordml/cex" xmlns:w16cid="http://schemas.microsoft.com/office/word/2016/wordml/cid" xmlns="http://schemas.microsoft.com/office/tasks/2019/documenttasks" xmlns:cr="http://schemas.microsoft.com/office/comments/2020/reactions">
+  <w:p>
+    <w:pPr>
+      <w:rPr/>
+    </w:pPr>
+    <w:r>
+      <w:rPr>
+        <w:rtl w:val="0"/>
+      </w:rPr>
+    </w:r>
+  </w:p>
+</w:hdr>
 </file>
 
 <file path=word/numbering.xml><?xml version="1.0" encoding="utf-8"?>

</xml_diff>